<commit_message>
added business questions to SQL Scripts and Updated project documentation.
</commit_message>
<xml_diff>
--- a/documentation/nicosys-portfolio-ecom-project-documentation.docx
+++ b/documentation/nicosys-portfolio-ecom-project-documentation.docx
@@ -27,45 +27,92 @@
         <w:rPr>
           <w:u w:val="single"/>
         </w:rPr>
-        <w:t>7/24/2026</w:t>
+        <w:t>7/2</w:t>
+      </w:r>
+      <w:r>
+        <w:rPr>
+          <w:u w:val="single"/>
+        </w:rPr>
+        <w:t>5</w:t>
+      </w:r>
+      <w:r>
+        <w:rPr>
+          <w:u w:val="single"/>
+        </w:rPr>
+        <w:t>/2026</w:t>
       </w:r>
     </w:p>
     <w:p>
-      <w:r>
-        <w:t>After r</w:t>
-      </w:r>
-      <w:r>
-        <w:t>eviewing</w:t>
-      </w:r>
-      <w:r>
-        <w:t xml:space="preserve"> the</w:t>
-      </w:r>
-      <w:r>
-        <w:t xml:space="preserve"> files</w:t>
-      </w:r>
-      <w:r>
-        <w:t xml:space="preserve"> on my local and remote repos, I have found the SQL code for this project missing. </w:t>
+      <w:pPr>
+        <w:pStyle w:val="ListParagraph"/>
+        <w:numPr>
+          <w:ilvl w:val="0"/>
+          <w:numId w:val="2"/>
+        </w:numPr>
+      </w:pPr>
+      <w:r>
+        <w:t>Updated and verified SQL scripts function properly within PGadmin</w:t>
       </w:r>
     </w:p>
     <w:p>
-      <w:r>
-        <w:t xml:space="preserve">I’ll need the SQL code stored on my home </w:t>
-      </w:r>
-      <w:proofErr w:type="gramStart"/>
-      <w:r>
-        <w:t>computer, and</w:t>
-      </w:r>
-      <w:proofErr w:type="gramEnd"/>
-      <w:r>
-        <w:t xml:space="preserve"> then </w:t>
-      </w:r>
-      <w:proofErr w:type="gramStart"/>
-      <w:r>
-        <w:t>transfer</w:t>
-      </w:r>
-      <w:proofErr w:type="gramEnd"/>
-      <w:r>
-        <w:t xml:space="preserve"> to local/remote repos. </w:t>
+      <w:pPr>
+        <w:pStyle w:val="ListParagraph"/>
+        <w:numPr>
+          <w:ilvl w:val="0"/>
+          <w:numId w:val="2"/>
+        </w:numPr>
+      </w:pPr>
+      <w:r>
+        <w:t>Added questions/documentation within SQL scripts</w:t>
+      </w:r>
+      <w:r>
+        <w:t xml:space="preserve"> (pending- keep defining all business questions).</w:t>
+      </w:r>
+    </w:p>
+    <w:p/>
+    <w:p>
+      <w:pPr>
+        <w:rPr>
+          <w:u w:val="single"/>
+        </w:rPr>
+      </w:pPr>
+    </w:p>
+    <w:p>
+      <w:pPr>
+        <w:rPr>
+          <w:u w:val="single"/>
+        </w:rPr>
+      </w:pPr>
+      <w:r>
+        <w:rPr>
+          <w:u w:val="single"/>
+        </w:rPr>
+        <w:t>7/24/2026</w:t>
+      </w:r>
+    </w:p>
+    <w:p>
+      <w:r>
+        <w:t>After r</w:t>
+      </w:r>
+      <w:r>
+        <w:t>eviewing</w:t>
+      </w:r>
+      <w:r>
+        <w:t xml:space="preserve"> the</w:t>
+      </w:r>
+      <w:r>
+        <w:t xml:space="preserve"> files</w:t>
+      </w:r>
+      <w:r>
+        <w:t xml:space="preserve"> on my local and remote repos, I have found the SQL code for this project missing. </w:t>
+      </w:r>
+    </w:p>
+    <w:p>
+      <w:r>
+        <w:t>I’ll need the SQL code stored on my home computer, and then transfer to local/remote repos</w:t>
+      </w:r>
+      <w:r>
+        <w:t xml:space="preserve">. </w:t>
       </w:r>
     </w:p>
     <w:p/>
@@ -103,15 +150,7 @@
         </w:numPr>
       </w:pPr>
       <w:r>
-        <w:t xml:space="preserve">Project Files imported </w:t>
-      </w:r>
-      <w:proofErr w:type="gramStart"/>
-      <w:r>
-        <w:t>onto</w:t>
-      </w:r>
-      <w:proofErr w:type="gramEnd"/>
-      <w:r>
-        <w:t xml:space="preserve"> local and remote repos </w:t>
+        <w:t xml:space="preserve">Project Files imported onto local and remote repos </w:t>
       </w:r>
     </w:p>
     <w:p/>
@@ -240,8 +279,124 @@
       </w:rPr>
     </w:lvl>
   </w:abstractNum>
+  <w:abstractNum w:abstractNumId="1" w15:restartNumberingAfterBreak="0">
+    <w:nsid w:val="7BD9063B"/>
+    <w:multiLevelType w:val="hybridMultilevel"/>
+    <w:tmpl w:val="8AC4E370"/>
+    <w:lvl w:ilvl="0" w:tplc="0409000D">
+      <w:start w:val="1"/>
+      <w:numFmt w:val="bullet"/>
+      <w:lvlText w:val=""/>
+      <w:lvlJc w:val="left"/>
+      <w:pPr>
+        <w:ind w:left="720" w:hanging="360"/>
+      </w:pPr>
+      <w:rPr>
+        <w:rFonts w:ascii="Wingdings" w:hAnsi="Wingdings" w:hint="default"/>
+      </w:rPr>
+    </w:lvl>
+    <w:lvl w:ilvl="1" w:tplc="04090003" w:tentative="1">
+      <w:start w:val="1"/>
+      <w:numFmt w:val="bullet"/>
+      <w:lvlText w:val="o"/>
+      <w:lvlJc w:val="left"/>
+      <w:pPr>
+        <w:ind w:left="1440" w:hanging="360"/>
+      </w:pPr>
+      <w:rPr>
+        <w:rFonts w:ascii="Courier New" w:hAnsi="Courier New" w:cs="Courier New" w:hint="default"/>
+      </w:rPr>
+    </w:lvl>
+    <w:lvl w:ilvl="2" w:tplc="04090005" w:tentative="1">
+      <w:start w:val="1"/>
+      <w:numFmt w:val="bullet"/>
+      <w:lvlText w:val=""/>
+      <w:lvlJc w:val="left"/>
+      <w:pPr>
+        <w:ind w:left="2160" w:hanging="360"/>
+      </w:pPr>
+      <w:rPr>
+        <w:rFonts w:ascii="Wingdings" w:hAnsi="Wingdings" w:hint="default"/>
+      </w:rPr>
+    </w:lvl>
+    <w:lvl w:ilvl="3" w:tplc="04090001" w:tentative="1">
+      <w:start w:val="1"/>
+      <w:numFmt w:val="bullet"/>
+      <w:lvlText w:val=""/>
+      <w:lvlJc w:val="left"/>
+      <w:pPr>
+        <w:ind w:left="2880" w:hanging="360"/>
+      </w:pPr>
+      <w:rPr>
+        <w:rFonts w:ascii="Symbol" w:hAnsi="Symbol" w:hint="default"/>
+      </w:rPr>
+    </w:lvl>
+    <w:lvl w:ilvl="4" w:tplc="04090003" w:tentative="1">
+      <w:start w:val="1"/>
+      <w:numFmt w:val="bullet"/>
+      <w:lvlText w:val="o"/>
+      <w:lvlJc w:val="left"/>
+      <w:pPr>
+        <w:ind w:left="3600" w:hanging="360"/>
+      </w:pPr>
+      <w:rPr>
+        <w:rFonts w:ascii="Courier New" w:hAnsi="Courier New" w:cs="Courier New" w:hint="default"/>
+      </w:rPr>
+    </w:lvl>
+    <w:lvl w:ilvl="5" w:tplc="04090005" w:tentative="1">
+      <w:start w:val="1"/>
+      <w:numFmt w:val="bullet"/>
+      <w:lvlText w:val=""/>
+      <w:lvlJc w:val="left"/>
+      <w:pPr>
+        <w:ind w:left="4320" w:hanging="360"/>
+      </w:pPr>
+      <w:rPr>
+        <w:rFonts w:ascii="Wingdings" w:hAnsi="Wingdings" w:hint="default"/>
+      </w:rPr>
+    </w:lvl>
+    <w:lvl w:ilvl="6" w:tplc="04090001" w:tentative="1">
+      <w:start w:val="1"/>
+      <w:numFmt w:val="bullet"/>
+      <w:lvlText w:val=""/>
+      <w:lvlJc w:val="left"/>
+      <w:pPr>
+        <w:ind w:left="5040" w:hanging="360"/>
+      </w:pPr>
+      <w:rPr>
+        <w:rFonts w:ascii="Symbol" w:hAnsi="Symbol" w:hint="default"/>
+      </w:rPr>
+    </w:lvl>
+    <w:lvl w:ilvl="7" w:tplc="04090003" w:tentative="1">
+      <w:start w:val="1"/>
+      <w:numFmt w:val="bullet"/>
+      <w:lvlText w:val="o"/>
+      <w:lvlJc w:val="left"/>
+      <w:pPr>
+        <w:ind w:left="5760" w:hanging="360"/>
+      </w:pPr>
+      <w:rPr>
+        <w:rFonts w:ascii="Courier New" w:hAnsi="Courier New" w:cs="Courier New" w:hint="default"/>
+      </w:rPr>
+    </w:lvl>
+    <w:lvl w:ilvl="8" w:tplc="04090005" w:tentative="1">
+      <w:start w:val="1"/>
+      <w:numFmt w:val="bullet"/>
+      <w:lvlText w:val=""/>
+      <w:lvlJc w:val="left"/>
+      <w:pPr>
+        <w:ind w:left="6480" w:hanging="360"/>
+      </w:pPr>
+      <w:rPr>
+        <w:rFonts w:ascii="Wingdings" w:hAnsi="Wingdings" w:hint="default"/>
+      </w:rPr>
+    </w:lvl>
+  </w:abstractNum>
   <w:num w:numId="1" w16cid:durableId="149906089">
     <w:abstractNumId w:val="0"/>
+  </w:num>
+  <w:num w:numId="2" w16cid:durableId="1065299797">
+    <w:abstractNumId w:val="1"/>
   </w:num>
 </w:numbering>
 </file>

</xml_diff>

<commit_message>
completed SQL questions within script and updated project documentation
</commit_message>
<xml_diff>
--- a/documentation/nicosys-portfolio-ecom-project-documentation.docx
+++ b/documentation/nicosys-portfolio-ecom-project-documentation.docx
@@ -27,6 +27,80 @@
         <w:rPr>
           <w:u w:val="single"/>
         </w:rPr>
+        <w:t>7/</w:t>
+      </w:r>
+      <w:r>
+        <w:rPr>
+          <w:u w:val="single"/>
+        </w:rPr>
+        <w:t>2</w:t>
+      </w:r>
+      <w:r>
+        <w:rPr>
+          <w:u w:val="single"/>
+        </w:rPr>
+        <w:t>6</w:t>
+      </w:r>
+      <w:r>
+        <w:rPr>
+          <w:u w:val="single"/>
+        </w:rPr>
+        <w:t>/2026</w:t>
+      </w:r>
+    </w:p>
+    <w:p>
+      <w:pPr>
+        <w:pStyle w:val="ListParagraph"/>
+        <w:numPr>
+          <w:ilvl w:val="0"/>
+          <w:numId w:val="3"/>
+        </w:numPr>
+      </w:pPr>
+      <w:r>
+        <w:t>Updated</w:t>
+      </w:r>
+      <w:r>
+        <w:t>/completed</w:t>
+      </w:r>
+      <w:r>
+        <w:t xml:space="preserve"> question</w:t>
+      </w:r>
+      <w:r>
+        <w:t>s</w:t>
+      </w:r>
+      <w:r>
+        <w:t xml:space="preserve"> in SQL Script</w:t>
+      </w:r>
+    </w:p>
+    <w:p>
+      <w:pPr>
+        <w:pStyle w:val="ListParagraph"/>
+        <w:numPr>
+          <w:ilvl w:val="0"/>
+          <w:numId w:val="3"/>
+        </w:numPr>
+      </w:pPr>
+      <w:r>
+        <w:t xml:space="preserve">Next thing to validate SQL findings in Excel </w:t>
+      </w:r>
+    </w:p>
+    <w:p>
+      <w:pPr>
+        <w:rPr>
+          <w:u w:val="single"/>
+        </w:rPr>
+      </w:pPr>
+    </w:p>
+    <w:p>
+      <w:pPr>
+        <w:rPr>
+          <w:u w:val="single"/>
+        </w:rPr>
+      </w:pPr>
+      <w:r>
+        <w:rPr>
+          <w:u w:val="single"/>
+        </w:rPr>
         <w:t>7/2</w:t>
       </w:r>
       <w:r>
@@ -51,8 +125,13 @@
         </w:numPr>
       </w:pPr>
       <w:r>
-        <w:t>Updated and verified SQL scripts function properly within PGadmin</w:t>
-      </w:r>
+        <w:t xml:space="preserve">Updated and verified SQL scripts function properly within </w:t>
+      </w:r>
+      <w:proofErr w:type="spellStart"/>
+      <w:r>
+        <w:t>PGadmin</w:t>
+      </w:r>
+      <w:proofErr w:type="spellEnd"/>
     </w:p>
     <w:p>
       <w:pPr>
@@ -69,7 +148,6 @@
         <w:t xml:space="preserve"> (pending- keep defining all business questions).</w:t>
       </w:r>
     </w:p>
-    <w:p/>
     <w:p>
       <w:pPr>
         <w:rPr>
@@ -280,6 +358,119 @@
     </w:lvl>
   </w:abstractNum>
   <w:abstractNum w:abstractNumId="1" w15:restartNumberingAfterBreak="0">
+    <w:nsid w:val="645D107A"/>
+    <w:multiLevelType w:val="hybridMultilevel"/>
+    <w:tmpl w:val="97D0B1B0"/>
+    <w:lvl w:ilvl="0" w:tplc="0409000D">
+      <w:start w:val="1"/>
+      <w:numFmt w:val="bullet"/>
+      <w:lvlText w:val=""/>
+      <w:lvlJc w:val="left"/>
+      <w:pPr>
+        <w:ind w:left="720" w:hanging="360"/>
+      </w:pPr>
+      <w:rPr>
+        <w:rFonts w:ascii="Wingdings" w:hAnsi="Wingdings" w:hint="default"/>
+      </w:rPr>
+    </w:lvl>
+    <w:lvl w:ilvl="1" w:tplc="04090003" w:tentative="1">
+      <w:start w:val="1"/>
+      <w:numFmt w:val="bullet"/>
+      <w:lvlText w:val="o"/>
+      <w:lvlJc w:val="left"/>
+      <w:pPr>
+        <w:ind w:left="1440" w:hanging="360"/>
+      </w:pPr>
+      <w:rPr>
+        <w:rFonts w:ascii="Courier New" w:hAnsi="Courier New" w:cs="Courier New" w:hint="default"/>
+      </w:rPr>
+    </w:lvl>
+    <w:lvl w:ilvl="2" w:tplc="04090005" w:tentative="1">
+      <w:start w:val="1"/>
+      <w:numFmt w:val="bullet"/>
+      <w:lvlText w:val=""/>
+      <w:lvlJc w:val="left"/>
+      <w:pPr>
+        <w:ind w:left="2160" w:hanging="360"/>
+      </w:pPr>
+      <w:rPr>
+        <w:rFonts w:ascii="Wingdings" w:hAnsi="Wingdings" w:hint="default"/>
+      </w:rPr>
+    </w:lvl>
+    <w:lvl w:ilvl="3" w:tplc="04090001" w:tentative="1">
+      <w:start w:val="1"/>
+      <w:numFmt w:val="bullet"/>
+      <w:lvlText w:val=""/>
+      <w:lvlJc w:val="left"/>
+      <w:pPr>
+        <w:ind w:left="2880" w:hanging="360"/>
+      </w:pPr>
+      <w:rPr>
+        <w:rFonts w:ascii="Symbol" w:hAnsi="Symbol" w:hint="default"/>
+      </w:rPr>
+    </w:lvl>
+    <w:lvl w:ilvl="4" w:tplc="04090003" w:tentative="1">
+      <w:start w:val="1"/>
+      <w:numFmt w:val="bullet"/>
+      <w:lvlText w:val="o"/>
+      <w:lvlJc w:val="left"/>
+      <w:pPr>
+        <w:ind w:left="3600" w:hanging="360"/>
+      </w:pPr>
+      <w:rPr>
+        <w:rFonts w:ascii="Courier New" w:hAnsi="Courier New" w:cs="Courier New" w:hint="default"/>
+      </w:rPr>
+    </w:lvl>
+    <w:lvl w:ilvl="5" w:tplc="04090005" w:tentative="1">
+      <w:start w:val="1"/>
+      <w:numFmt w:val="bullet"/>
+      <w:lvlText w:val=""/>
+      <w:lvlJc w:val="left"/>
+      <w:pPr>
+        <w:ind w:left="4320" w:hanging="360"/>
+      </w:pPr>
+      <w:rPr>
+        <w:rFonts w:ascii="Wingdings" w:hAnsi="Wingdings" w:hint="default"/>
+      </w:rPr>
+    </w:lvl>
+    <w:lvl w:ilvl="6" w:tplc="04090001" w:tentative="1">
+      <w:start w:val="1"/>
+      <w:numFmt w:val="bullet"/>
+      <w:lvlText w:val=""/>
+      <w:lvlJc w:val="left"/>
+      <w:pPr>
+        <w:ind w:left="5040" w:hanging="360"/>
+      </w:pPr>
+      <w:rPr>
+        <w:rFonts w:ascii="Symbol" w:hAnsi="Symbol" w:hint="default"/>
+      </w:rPr>
+    </w:lvl>
+    <w:lvl w:ilvl="7" w:tplc="04090003" w:tentative="1">
+      <w:start w:val="1"/>
+      <w:numFmt w:val="bullet"/>
+      <w:lvlText w:val="o"/>
+      <w:lvlJc w:val="left"/>
+      <w:pPr>
+        <w:ind w:left="5760" w:hanging="360"/>
+      </w:pPr>
+      <w:rPr>
+        <w:rFonts w:ascii="Courier New" w:hAnsi="Courier New" w:cs="Courier New" w:hint="default"/>
+      </w:rPr>
+    </w:lvl>
+    <w:lvl w:ilvl="8" w:tplc="04090005" w:tentative="1">
+      <w:start w:val="1"/>
+      <w:numFmt w:val="bullet"/>
+      <w:lvlText w:val=""/>
+      <w:lvlJc w:val="left"/>
+      <w:pPr>
+        <w:ind w:left="6480" w:hanging="360"/>
+      </w:pPr>
+      <w:rPr>
+        <w:rFonts w:ascii="Wingdings" w:hAnsi="Wingdings" w:hint="default"/>
+      </w:rPr>
+    </w:lvl>
+  </w:abstractNum>
+  <w:abstractNum w:abstractNumId="2" w15:restartNumberingAfterBreak="0">
     <w:nsid w:val="7BD9063B"/>
     <w:multiLevelType w:val="hybridMultilevel"/>
     <w:tmpl w:val="8AC4E370"/>
@@ -396,6 +587,9 @@
     <w:abstractNumId w:val="0"/>
   </w:num>
   <w:num w:numId="2" w16cid:durableId="1065299797">
+    <w:abstractNumId w:val="2"/>
+  </w:num>
+  <w:num w:numId="3" w16cid:durableId="938029151">
     <w:abstractNumId w:val="1"/>
   </w:num>
 </w:numbering>

</xml_diff>

<commit_message>
vaidated SQL results in Excel and updated project documentation
</commit_message>
<xml_diff>
--- a/documentation/nicosys-portfolio-ecom-project-documentation.docx
+++ b/documentation/nicosys-portfolio-ecom-project-documentation.docx
@@ -16,6 +16,127 @@
         </w:rPr>
         <w:t>E-Commerce Sales Analysis Project</w:t>
       </w:r>
+    </w:p>
+    <w:p>
+      <w:pPr>
+        <w:rPr>
+          <w:u w:val="single"/>
+        </w:rPr>
+      </w:pPr>
+      <w:r>
+        <w:rPr>
+          <w:u w:val="single"/>
+        </w:rPr>
+        <w:t>7/</w:t>
+      </w:r>
+      <w:r>
+        <w:rPr>
+          <w:u w:val="single"/>
+        </w:rPr>
+        <w:t>2</w:t>
+      </w:r>
+      <w:r>
+        <w:rPr>
+          <w:u w:val="single"/>
+        </w:rPr>
+        <w:t>7</w:t>
+      </w:r>
+      <w:r>
+        <w:rPr>
+          <w:u w:val="single"/>
+        </w:rPr>
+        <w:t>/2026</w:t>
+      </w:r>
+    </w:p>
+    <w:p>
+      <w:pPr>
+        <w:pStyle w:val="ListParagraph"/>
+        <w:numPr>
+          <w:ilvl w:val="0"/>
+          <w:numId w:val="3"/>
+        </w:numPr>
+      </w:pPr>
+      <w:r>
+        <w:t>V</w:t>
+      </w:r>
+      <w:r>
+        <w:t>alidat</w:t>
+      </w:r>
+      <w:r>
+        <w:t>ed</w:t>
+      </w:r>
+      <w:r>
+        <w:t xml:space="preserve"> SQL findings in Excel</w:t>
+      </w:r>
+    </w:p>
+    <w:p>
+      <w:pPr>
+        <w:pStyle w:val="ListParagraph"/>
+        <w:numPr>
+          <w:ilvl w:val="1"/>
+          <w:numId w:val="3"/>
+        </w:numPr>
+      </w:pPr>
+      <w:r>
+        <w:t>T</w:t>
+      </w:r>
+      <w:r>
+        <w:t xml:space="preserve">otal gross and net sales are from Squarespace and TikTok Shop </w:t>
+      </w:r>
+      <w:r>
+        <w:t>platforms</w:t>
+      </w:r>
+    </w:p>
+    <w:p>
+      <w:pPr>
+        <w:pStyle w:val="ListParagraph"/>
+        <w:numPr>
+          <w:ilvl w:val="1"/>
+          <w:numId w:val="3"/>
+        </w:numPr>
+      </w:pPr>
+      <w:r>
+        <w:t xml:space="preserve"> </w:t>
+      </w:r>
+      <w:r>
+        <w:t>The top selling products</w:t>
+      </w:r>
+    </w:p>
+    <w:p>
+      <w:pPr>
+        <w:pStyle w:val="ListParagraph"/>
+        <w:numPr>
+          <w:ilvl w:val="1"/>
+          <w:numId w:val="3"/>
+        </w:numPr>
+      </w:pPr>
+      <w:r>
+        <w:t>Sales by state</w:t>
+      </w:r>
+    </w:p>
+    <w:p>
+      <w:pPr>
+        <w:pStyle w:val="ListParagraph"/>
+        <w:numPr>
+          <w:ilvl w:val="2"/>
+          <w:numId w:val="3"/>
+        </w:numPr>
+      </w:pPr>
+      <w:r>
+        <w:t>Top selling products within top 3 states</w:t>
+      </w:r>
+    </w:p>
+    <w:p>
+      <w:r>
+        <w:t xml:space="preserve">Next move to recreating Dashboard </w:t>
+      </w:r>
+    </w:p>
+    <w:p>
+      <w:pPr>
+        <w:rPr>
+          <w:u w:val="single"/>
+        </w:rPr>
+      </w:pPr>
     </w:p>
     <w:p>
       <w:pPr>
@@ -373,7 +494,7 @@
         <w:rFonts w:ascii="Wingdings" w:hAnsi="Wingdings" w:hint="default"/>
       </w:rPr>
     </w:lvl>
-    <w:lvl w:ilvl="1" w:tplc="04090003" w:tentative="1">
+    <w:lvl w:ilvl="1" w:tplc="04090003">
       <w:start w:val="1"/>
       <w:numFmt w:val="bullet"/>
       <w:lvlText w:val="o"/>
@@ -385,7 +506,7 @@
         <w:rFonts w:ascii="Courier New" w:hAnsi="Courier New" w:cs="Courier New" w:hint="default"/>
       </w:rPr>
     </w:lvl>
-    <w:lvl w:ilvl="2" w:tplc="04090005" w:tentative="1">
+    <w:lvl w:ilvl="2" w:tplc="04090005">
       <w:start w:val="1"/>
       <w:numFmt w:val="bullet"/>
       <w:lvlText w:val=""/>

</xml_diff>

<commit_message>
Completed updates on ecom dashboard and updated project documentation
</commit_message>
<xml_diff>
--- a/documentation/nicosys-portfolio-ecom-project-documentation.docx
+++ b/documentation/nicosys-portfolio-ecom-project-documentation.docx
@@ -1,6 +1,6 @@
 
 <file path=word/document.xml><?xml version="1.0" encoding="utf-8"?>
-<w:document xmlns:wpc="http://schemas.microsoft.com/office/word/2010/wordprocessingCanvas" xmlns:cx="http://schemas.microsoft.com/office/drawing/2014/chartex" xmlns:cx1="http://schemas.microsoft.com/office/drawing/2015/9/8/chartex" xmlns:cx2="http://schemas.microsoft.com/office/drawing/2015/10/21/chartex" xmlns:cx3="http://schemas.microsoft.com/office/drawing/2016/5/9/chartex" xmlns:cx4="http://schemas.microsoft.com/office/drawing/2016/5/10/chartex" xmlns:cx5="http://schemas.microsoft.com/office/drawing/2016/5/11/chartex" xmlns:cx6="http://schemas.microsoft.com/office/drawing/2016/5/12/chartex" xmlns:cx7="http://schemas.microsoft.com/office/drawing/2016/5/13/chartex" xmlns:cx8="http://schemas.microsoft.com/office/drawing/2016/5/14/chartex" xmlns:mc="http://schemas.openxmlformats.org/markup-compatibility/2006" xmlns:aink="http://schemas.microsoft.com/office/drawing/2016/ink" xmlns:am3d="http://schemas.microsoft.com/office/drawing/2017/model3d" xmlns:o="urn:schemas-microsoft-com:office:office" xmlns:oel="http://schemas.microsoft.com/office/2019/extlst" xmlns:r="http://schemas.openxmlformats.org/officeDocument/2006/relationships" xmlns:m="http://schemas.openxmlformats.org/officeDocument/2006/math" xmlns:v="urn:schemas-microsoft-com:vml" xmlns:wp14="http://schemas.microsoft.com/office/word/2010/wordprocessingDrawing" xmlns:wp="http://schemas.openxmlformats.org/drawingml/2006/wordprocessingDrawing" xmlns:w10="urn:schemas-microsoft-com:office:word" xmlns:w="http://schemas.openxmlformats.org/wordprocessingml/2006/main" xmlns:w14="http://schemas.microsoft.com/office/word/2010/wordml" xmlns:w15="http://schemas.microsoft.com/office/word/2012/wordml" xmlns:w16cex="http://schemas.microsoft.com/office/word/2018/wordml/cex" xmlns:w16cid="http://schemas.microsoft.com/office/word/2016/wordml/cid" xmlns:w16="http://schemas.microsoft.com/office/word/2018/wordml" xmlns:w16du="http://schemas.microsoft.com/office/word/2023/wordml/word16du" xmlns:w16sdtdh="http://schemas.microsoft.com/office/word/2020/wordml/sdtdatahash" xmlns:w16sdtfl="http://schemas.microsoft.com/office/word/2024/wordml/sdtformatlock" xmlns:w16se="http://schemas.microsoft.com/office/word/2015/wordml/symex" xmlns:wpg="http://schemas.microsoft.com/office/word/2010/wordprocessingGroup" xmlns:wpi="http://schemas.microsoft.com/office/word/2010/wordprocessingInk" xmlns:wne="http://schemas.microsoft.com/office/word/2006/wordml" xmlns:wps="http://schemas.microsoft.com/office/word/2010/wordprocessingShape" mc:Ignorable="w14 w15 w16se w16cid w16 w16cex w16sdtdh w16sdtfl w16du wp14">
+<w:document xmlns:wpc="http://schemas.microsoft.com/office/word/2010/wordprocessingCanvas" xmlns:cx="http://schemas.microsoft.com/office/drawing/2014/chartex" xmlns:cx1="http://schemas.microsoft.com/office/drawing/2015/9/8/chartex" xmlns:cx2="http://schemas.microsoft.com/office/drawing/2015/10/21/chartex" xmlns:cx3="http://schemas.microsoft.com/office/drawing/2016/5/9/chartex" xmlns:cx4="http://schemas.microsoft.com/office/drawing/2016/5/10/chartex" xmlns:cx5="http://schemas.microsoft.com/office/drawing/2016/5/11/chartex" xmlns:cx6="http://schemas.microsoft.com/office/drawing/2016/5/12/chartex" xmlns:cx7="http://schemas.microsoft.com/office/drawing/2016/5/13/chartex" xmlns:cx8="http://schemas.microsoft.com/office/drawing/2016/5/14/chartex" xmlns:mc="http://schemas.openxmlformats.org/markup-compatibility/2006" xmlns:aink="http://schemas.microsoft.com/office/drawing/2016/ink" xmlns:am3d="http://schemas.microsoft.com/office/drawing/2017/model3d" xmlns:o="urn:schemas-microsoft-com:office:office" xmlns:oel="http://schemas.microsoft.com/office/2019/extlst" xmlns:r="http://schemas.openxmlformats.org/officeDocument/2006/relationships" xmlns:m="http://schemas.openxmlformats.org/officeDocument/2006/math" xmlns:v="urn:schemas-microsoft-com:vml" xmlns:wp14="http://schemas.microsoft.com/office/word/2010/wordprocessingDrawing" xmlns:wp="http://schemas.openxmlformats.org/drawingml/2006/wordprocessingDrawing" xmlns:w10="urn:schemas-microsoft-com:office:word" xmlns:w="http://schemas.openxmlformats.org/wordprocessingml/2006/main" xmlns:w14="http://schemas.microsoft.com/office/word/2010/wordml" xmlns:w15="http://schemas.microsoft.com/office/word/2012/wordml" xmlns:w16cei="http://schemas.microsoft.com/office/word/2026/wordml/cei" xmlns:w16cex="http://schemas.microsoft.com/office/word/2018/wordml/cex" xmlns:w16cid="http://schemas.microsoft.com/office/word/2016/wordml/cid" xmlns:w16="http://schemas.microsoft.com/office/word/2018/wordml" xmlns:w16du="http://schemas.microsoft.com/office/word/2023/wordml/word16du" xmlns:w16sdtdh="http://schemas.microsoft.com/office/word/2020/wordml/sdtdatahash" xmlns:w16sdtfl="http://schemas.microsoft.com/office/word/2024/wordml/sdtformatlock" xmlns:w16se="http://schemas.microsoft.com/office/word/2015/wordml/symex" xmlns:wpg="http://schemas.microsoft.com/office/word/2010/wordprocessingGroup" xmlns:wpi="http://schemas.microsoft.com/office/word/2010/wordprocessingInk" xmlns:wne="http://schemas.microsoft.com/office/word/2006/wordml" xmlns:wps="http://schemas.microsoft.com/office/word/2010/wordprocessingShape" mc:Ignorable="w14 w15 w16se w16cid w16 w16cex w16sdtdh w16sdtfl w16du wp14">
   <w:body>
     <w:p>
       <w:pPr>
@@ -27,25 +27,25 @@
         <w:rPr>
           <w:u w:val="single"/>
         </w:rPr>
-        <w:t>7/</w:t>
-      </w:r>
-      <w:r>
-        <w:rPr>
-          <w:u w:val="single"/>
-        </w:rPr>
-        <w:t>2</w:t>
-      </w:r>
-      <w:r>
-        <w:rPr>
-          <w:u w:val="single"/>
-        </w:rPr>
-        <w:t>7</w:t>
-      </w:r>
-      <w:r>
-        <w:rPr>
-          <w:u w:val="single"/>
-        </w:rPr>
-        <w:t>/2026</w:t>
+        <w:t>7/28/2026</w:t>
+      </w:r>
+    </w:p>
+    <w:p>
+      <w:r>
+        <w:t xml:space="preserve">It does not make sense to redo the work I’ve created already for my e-commerce dashboard. I must bring over the explanations on how I arrived at each graph, chart, and KPI to present for this project. Get this file from </w:t>
+      </w:r>
+      <w:r>
+        <w:t xml:space="preserve">my Tier II project working with Mika. </w:t>
+      </w:r>
+    </w:p>
+    <w:p>
+      <w:r>
+        <w:t>This makes me realize that I should do this type of descriptive logic on all my other projects too: Healthcare and Operations-Dash.</w:t>
+      </w:r>
+    </w:p>
+    <w:p>
+      <w:r>
+        <w:t xml:space="preserve">I’ll have to create an ERD for both projects: Healthcare and Operations-dash. </w:t>
       </w:r>
     </w:p>
     <w:p>
@@ -57,10 +57,45 @@
         </w:numPr>
       </w:pPr>
       <w:r>
-        <w:t>V</w:t>
-      </w:r>
-      <w:r>
-        <w:t>alidat</w:t>
+        <w:t>Ecommerce dashboard complete</w:t>
+      </w:r>
+    </w:p>
+    <w:p/>
+    <w:p>
+      <w:pPr>
+        <w:rPr>
+          <w:u w:val="single"/>
+        </w:rPr>
+      </w:pPr>
+      <w:r>
+        <w:rPr>
+          <w:u w:val="single"/>
+        </w:rPr>
+        <w:t>7/</w:t>
+      </w:r>
+      <w:r>
+        <w:rPr>
+          <w:u w:val="single"/>
+        </w:rPr>
+        <w:t>27</w:t>
+      </w:r>
+      <w:r>
+        <w:rPr>
+          <w:u w:val="single"/>
+        </w:rPr>
+        <w:t>/2026</w:t>
+      </w:r>
+    </w:p>
+    <w:p>
+      <w:pPr>
+        <w:pStyle w:val="ListParagraph"/>
+        <w:numPr>
+          <w:ilvl w:val="0"/>
+          <w:numId w:val="3"/>
+        </w:numPr>
+      </w:pPr>
+      <w:r>
+        <w:t>Validat</w:t>
       </w:r>
       <w:r>
         <w:t>ed</w:t>
@@ -96,10 +131,7 @@
         </w:numPr>
       </w:pPr>
       <w:r>
-        <w:t xml:space="preserve"> </w:t>
-      </w:r>
-      <w:r>
-        <w:t>The top selling products</w:t>
+        <w:t xml:space="preserve"> The top selling products</w:t>
       </w:r>
     </w:p>
     <w:p>
@@ -246,13 +278,8 @@
         </w:numPr>
       </w:pPr>
       <w:r>
-        <w:t xml:space="preserve">Updated and verified SQL scripts function properly within </w:t>
-      </w:r>
-      <w:proofErr w:type="spellStart"/>
-      <w:r>
-        <w:t>PGadmin</w:t>
-      </w:r>
-      <w:proofErr w:type="spellEnd"/>
+        <w:t>Updated and verified SQL scripts function properly within PGadmin</w:t>
+      </w:r>
     </w:p>
     <w:p>
       <w:pPr>
@@ -291,6 +318,7 @@
     </w:p>
     <w:p>
       <w:r>
+        <w:lastRenderedPageBreak/>
         <w:t>After r</w:t>
       </w:r>
       <w:r>
@@ -364,7 +392,7 @@
 </file>
 
 <file path=word/numbering.xml><?xml version="1.0" encoding="utf-8"?>
-<w:numbering xmlns:wpc="http://schemas.microsoft.com/office/word/2010/wordprocessingCanvas" xmlns:cx="http://schemas.microsoft.com/office/drawing/2014/chartex" xmlns:cx1="http://schemas.microsoft.com/office/drawing/2015/9/8/chartex" xmlns:cx2="http://schemas.microsoft.com/office/drawing/2015/10/21/chartex" xmlns:cx3="http://schemas.microsoft.com/office/drawing/2016/5/9/chartex" xmlns:cx4="http://schemas.microsoft.com/office/drawing/2016/5/10/chartex" xmlns:cx5="http://schemas.microsoft.com/office/drawing/2016/5/11/chartex" xmlns:cx6="http://schemas.microsoft.com/office/drawing/2016/5/12/chartex" xmlns:cx7="http://schemas.microsoft.com/office/drawing/2016/5/13/chartex" xmlns:cx8="http://schemas.microsoft.com/office/drawing/2016/5/14/chartex" xmlns:mc="http://schemas.openxmlformats.org/markup-compatibility/2006" xmlns:aink="http://schemas.microsoft.com/office/drawing/2016/ink" xmlns:am3d="http://schemas.microsoft.com/office/drawing/2017/model3d" xmlns:o="urn:schemas-microsoft-com:office:office" xmlns:oel="http://schemas.microsoft.com/office/2019/extlst" xmlns:r="http://schemas.openxmlformats.org/officeDocument/2006/relationships" xmlns:m="http://schemas.openxmlformats.org/officeDocument/2006/math" xmlns:v="urn:schemas-microsoft-com:vml" xmlns:wp14="http://schemas.microsoft.com/office/word/2010/wordprocessingDrawing" xmlns:wp="http://schemas.openxmlformats.org/drawingml/2006/wordprocessingDrawing" xmlns:w10="urn:schemas-microsoft-com:office:word" xmlns:w="http://schemas.openxmlformats.org/wordprocessingml/2006/main" xmlns:w14="http://schemas.microsoft.com/office/word/2010/wordml" xmlns:w15="http://schemas.microsoft.com/office/word/2012/wordml" xmlns:w16cex="http://schemas.microsoft.com/office/word/2018/wordml/cex" xmlns:w16cid="http://schemas.microsoft.com/office/word/2016/wordml/cid" xmlns:w16="http://schemas.microsoft.com/office/word/2018/wordml" xmlns:w16du="http://schemas.microsoft.com/office/word/2023/wordml/word16du" xmlns:w16sdtdh="http://schemas.microsoft.com/office/word/2020/wordml/sdtdatahash" xmlns:w16sdtfl="http://schemas.microsoft.com/office/word/2024/wordml/sdtformatlock" xmlns:w16se="http://schemas.microsoft.com/office/word/2015/wordml/symex" xmlns:wpg="http://schemas.microsoft.com/office/word/2010/wordprocessingGroup" xmlns:wpi="http://schemas.microsoft.com/office/word/2010/wordprocessingInk" xmlns:wne="http://schemas.microsoft.com/office/word/2006/wordml" xmlns:wps="http://schemas.microsoft.com/office/word/2010/wordprocessingShape" mc:Ignorable="w14 w15 w16se w16cid w16 w16cex w16sdtdh w16sdtfl w16du wp14">
+<w:numbering xmlns:wpc="http://schemas.microsoft.com/office/word/2010/wordprocessingCanvas" xmlns:cx="http://schemas.microsoft.com/office/drawing/2014/chartex" xmlns:cx1="http://schemas.microsoft.com/office/drawing/2015/9/8/chartex" xmlns:cx2="http://schemas.microsoft.com/office/drawing/2015/10/21/chartex" xmlns:cx3="http://schemas.microsoft.com/office/drawing/2016/5/9/chartex" xmlns:cx4="http://schemas.microsoft.com/office/drawing/2016/5/10/chartex" xmlns:cx5="http://schemas.microsoft.com/office/drawing/2016/5/11/chartex" xmlns:cx6="http://schemas.microsoft.com/office/drawing/2016/5/12/chartex" xmlns:cx7="http://schemas.microsoft.com/office/drawing/2016/5/13/chartex" xmlns:cx8="http://schemas.microsoft.com/office/drawing/2016/5/14/chartex" xmlns:mc="http://schemas.openxmlformats.org/markup-compatibility/2006" xmlns:aink="http://schemas.microsoft.com/office/drawing/2016/ink" xmlns:am3d="http://schemas.microsoft.com/office/drawing/2017/model3d" xmlns:o="urn:schemas-microsoft-com:office:office" xmlns:oel="http://schemas.microsoft.com/office/2019/extlst" xmlns:r="http://schemas.openxmlformats.org/officeDocument/2006/relationships" xmlns:m="http://schemas.openxmlformats.org/officeDocument/2006/math" xmlns:v="urn:schemas-microsoft-com:vml" xmlns:wp14="http://schemas.microsoft.com/office/word/2010/wordprocessingDrawing" xmlns:wp="http://schemas.openxmlformats.org/drawingml/2006/wordprocessingDrawing" xmlns:w10="urn:schemas-microsoft-com:office:word" xmlns:w="http://schemas.openxmlformats.org/wordprocessingml/2006/main" xmlns:w14="http://schemas.microsoft.com/office/word/2010/wordml" xmlns:w15="http://schemas.microsoft.com/office/word/2012/wordml" xmlns:w16cei="http://schemas.microsoft.com/office/word/2026/wordml/cei" xmlns:w16cex="http://schemas.microsoft.com/office/word/2018/wordml/cex" xmlns:w16cid="http://schemas.microsoft.com/office/word/2016/wordml/cid" xmlns:w16="http://schemas.microsoft.com/office/word/2018/wordml" xmlns:w16du="http://schemas.microsoft.com/office/word/2023/wordml/word16du" xmlns:w16sdtdh="http://schemas.microsoft.com/office/word/2020/wordml/sdtdatahash" xmlns:w16sdtfl="http://schemas.microsoft.com/office/word/2024/wordml/sdtformatlock" xmlns:w16se="http://schemas.microsoft.com/office/word/2015/wordml/symex" xmlns:wpg="http://schemas.microsoft.com/office/word/2010/wordprocessingGroup" xmlns:wpi="http://schemas.microsoft.com/office/word/2010/wordprocessingInk" xmlns:wne="http://schemas.microsoft.com/office/word/2006/wordml" xmlns:wps="http://schemas.microsoft.com/office/word/2010/wordprocessingShape" mc:Ignorable="w14 w15 w16se w16cid w16 w16cex w16sdtdh w16sdtfl w16du wp14">
   <w:abstractNum w:abstractNumId="0" w15:restartNumberingAfterBreak="0">
     <w:nsid w:val="40E42E62"/>
     <w:multiLevelType w:val="hybridMultilevel"/>

</xml_diff>

<commit_message>
created PDF and PowerPoint for presentation
</commit_message>
<xml_diff>
--- a/documentation/nicosys-portfolio-ecom-project-documentation.docx
+++ b/documentation/nicosys-portfolio-ecom-project-documentation.docx
@@ -27,6 +27,1004 @@
         <w:rPr>
           <w:u w:val="single"/>
         </w:rPr>
+        <w:t>8/7/2026</w:t>
+      </w:r>
+    </w:p>
+    <w:p>
+      <w:r>
+        <w:t xml:space="preserve">Completed my portfolio in Canva. Created PDF and PowerPoint versions of the Canva presentation. </w:t>
+      </w:r>
+    </w:p>
+    <w:p>
+      <w:pPr>
+        <w:rPr>
+          <w:u w:val="single"/>
+        </w:rPr>
+      </w:pPr>
+      <w:r>
+        <w:rPr>
+          <w:u w:val="single"/>
+        </w:rPr>
+        <w:t>8/6/2026</w:t>
+      </w:r>
+    </w:p>
+    <w:p>
+      <w:r>
+        <w:t>Continued working on portfolio presentation in Canva. Defined the slides needed for my portfolio because my previous ideas were too complicated. I will use this format for this project and all other portfolio projects:</w:t>
+      </w:r>
+    </w:p>
+    <w:p>
+      <w:pPr>
+        <w:pStyle w:val="ListParagraph"/>
+        <w:numPr>
+          <w:ilvl w:val="0"/>
+          <w:numId w:val="14"/>
+        </w:numPr>
+      </w:pPr>
+      <w:r>
+        <w:t>Problem &amp; Goal</w:t>
+      </w:r>
+    </w:p>
+    <w:p>
+      <w:pPr>
+        <w:pStyle w:val="ListParagraph"/>
+        <w:numPr>
+          <w:ilvl w:val="0"/>
+          <w:numId w:val="14"/>
+        </w:numPr>
+      </w:pPr>
+      <w:r>
+        <w:t>Tools Used</w:t>
+      </w:r>
+    </w:p>
+    <w:p>
+      <w:pPr>
+        <w:pStyle w:val="ListParagraph"/>
+        <w:numPr>
+          <w:ilvl w:val="0"/>
+          <w:numId w:val="14"/>
+        </w:numPr>
+      </w:pPr>
+      <w:r>
+        <w:t>SQL and Modeling Workflow</w:t>
+      </w:r>
+    </w:p>
+    <w:p>
+      <w:pPr>
+        <w:pStyle w:val="ListParagraph"/>
+        <w:numPr>
+          <w:ilvl w:val="0"/>
+          <w:numId w:val="14"/>
+        </w:numPr>
+      </w:pPr>
+      <w:r>
+        <w:t>Insights</w:t>
+      </w:r>
+    </w:p>
+    <w:p>
+      <w:pPr>
+        <w:pStyle w:val="ListParagraph"/>
+        <w:numPr>
+          <w:ilvl w:val="0"/>
+          <w:numId w:val="14"/>
+        </w:numPr>
+      </w:pPr>
+      <w:r>
+        <w:t>Business Recommendations</w:t>
+      </w:r>
+    </w:p>
+    <w:p>
+      <w:pPr>
+        <w:pStyle w:val="ListParagraph"/>
+        <w:numPr>
+          <w:ilvl w:val="0"/>
+          <w:numId w:val="14"/>
+        </w:numPr>
+      </w:pPr>
+      <w:r>
+        <w:t>Impact</w:t>
+      </w:r>
+    </w:p>
+    <w:p>
+      <w:pPr>
+        <w:rPr>
+          <w:u w:val="single"/>
+        </w:rPr>
+      </w:pPr>
+      <w:r>
+        <w:rPr>
+          <w:u w:val="single"/>
+        </w:rPr>
+        <w:t>8/5/2026</w:t>
+      </w:r>
+    </w:p>
+    <w:p>
+      <w:r>
+        <w:t>For this project, and all my other projects for my portfolio, I’ll use the following format to present:</w:t>
+      </w:r>
+    </w:p>
+    <w:p>
+      <w:pPr>
+        <w:rPr>
+          <w:b/>
+          <w:bCs/>
+        </w:rPr>
+      </w:pPr>
+      <w:r>
+        <w:rPr>
+          <w:b/>
+          <w:bCs/>
+        </w:rPr>
+        <w:t>1. Title Slide</w:t>
+      </w:r>
+    </w:p>
+    <w:p>
+      <w:pPr>
+        <w:numPr>
+          <w:ilvl w:val="0"/>
+          <w:numId w:val="5"/>
+        </w:numPr>
+      </w:pPr>
+      <w:r>
+        <w:t>Clean, minimal.</w:t>
+      </w:r>
+    </w:p>
+    <w:p>
+      <w:pPr>
+        <w:numPr>
+          <w:ilvl w:val="0"/>
+          <w:numId w:val="5"/>
+        </w:numPr>
+      </w:pPr>
+      <w:r>
+        <w:t>Project name + your name.</w:t>
+      </w:r>
+    </w:p>
+    <w:p>
+      <w:pPr>
+        <w:numPr>
+          <w:ilvl w:val="0"/>
+          <w:numId w:val="5"/>
+        </w:numPr>
+      </w:pPr>
+      <w:r>
+        <w:t>Optional: a single visual hint (e.g., a product grid for e</w:t>
+      </w:r>
+      <w:r>
+        <w:noBreakHyphen/>
+        <w:t>commerce, a hospital icon for healthcare).</w:t>
+      </w:r>
+    </w:p>
+    <w:p>
+      <w:pPr>
+        <w:rPr>
+          <w:b/>
+          <w:bCs/>
+        </w:rPr>
+      </w:pPr>
+      <w:r>
+        <w:rPr>
+          <w:b/>
+          <w:bCs/>
+        </w:rPr>
+        <w:t>2. Executive Summary</w:t>
+      </w:r>
+    </w:p>
+    <w:p>
+      <w:r>
+        <w:t>One slide. Three bullets:</w:t>
+      </w:r>
+    </w:p>
+    <w:p>
+      <w:pPr>
+        <w:numPr>
+          <w:ilvl w:val="0"/>
+          <w:numId w:val="6"/>
+        </w:numPr>
+      </w:pPr>
+      <w:r>
+        <w:t>What problem you solved</w:t>
+      </w:r>
+    </w:p>
+    <w:p>
+      <w:pPr>
+        <w:numPr>
+          <w:ilvl w:val="0"/>
+          <w:numId w:val="6"/>
+        </w:numPr>
+      </w:pPr>
+      <w:r>
+        <w:t>What data you used</w:t>
+      </w:r>
+    </w:p>
+    <w:p>
+      <w:pPr>
+        <w:numPr>
+          <w:ilvl w:val="0"/>
+          <w:numId w:val="6"/>
+        </w:numPr>
+      </w:pPr>
+      <w:r>
+        <w:t>What insights you delivered</w:t>
+      </w:r>
+    </w:p>
+    <w:p>
+      <w:r>
+        <w:t>This helps hiring managers understand your value in seconds.</w:t>
+      </w:r>
+    </w:p>
+    <w:p>
+      <w:pPr>
+        <w:rPr>
+          <w:b/>
+          <w:bCs/>
+        </w:rPr>
+      </w:pPr>
+      <w:r>
+        <w:rPr>
+          <w:b/>
+          <w:bCs/>
+        </w:rPr>
+        <w:t>3. Business Problem</w:t>
+      </w:r>
+    </w:p>
+    <w:p>
+      <w:r>
+        <w:lastRenderedPageBreak/>
+        <w:t xml:space="preserve">Explain the </w:t>
+      </w:r>
+      <w:r>
+        <w:rPr>
+          <w:i/>
+          <w:iCs/>
+        </w:rPr>
+        <w:t>real-world pain point</w:t>
+      </w:r>
+      <w:r>
+        <w:t xml:space="preserve"> in plain language.</w:t>
+      </w:r>
+    </w:p>
+    <w:p>
+      <w:pPr>
+        <w:numPr>
+          <w:ilvl w:val="0"/>
+          <w:numId w:val="7"/>
+        </w:numPr>
+      </w:pPr>
+      <w:r>
+        <w:t>Why does this problem matter?</w:t>
+      </w:r>
+    </w:p>
+    <w:p>
+      <w:pPr>
+        <w:numPr>
+          <w:ilvl w:val="0"/>
+          <w:numId w:val="7"/>
+        </w:numPr>
+      </w:pPr>
+      <w:r>
+        <w:t>Who is affected?</w:t>
+      </w:r>
+    </w:p>
+    <w:p>
+      <w:pPr>
+        <w:numPr>
+          <w:ilvl w:val="0"/>
+          <w:numId w:val="7"/>
+        </w:numPr>
+      </w:pPr>
+      <w:r>
+        <w:t>What happens if it’s not solved?</w:t>
+      </w:r>
+    </w:p>
+    <w:p>
+      <w:pPr>
+        <w:rPr>
+          <w:b/>
+          <w:bCs/>
+        </w:rPr>
+      </w:pPr>
+      <w:r>
+        <w:rPr>
+          <w:b/>
+          <w:bCs/>
+        </w:rPr>
+        <w:t>4. Data Sources</w:t>
+      </w:r>
+    </w:p>
+    <w:p>
+      <w:r>
+        <w:t>Show logos or icons instead of text walls.</w:t>
+      </w:r>
+    </w:p>
+    <w:p>
+      <w:pPr>
+        <w:numPr>
+          <w:ilvl w:val="0"/>
+          <w:numId w:val="8"/>
+        </w:numPr>
+      </w:pPr>
+      <w:r>
+        <w:t>Squarespace, TikTok Shop</w:t>
+      </w:r>
+    </w:p>
+    <w:p>
+      <w:pPr>
+        <w:numPr>
+          <w:ilvl w:val="0"/>
+          <w:numId w:val="8"/>
+        </w:numPr>
+      </w:pPr>
+      <w:r>
+        <w:t>ER operational datasets</w:t>
+      </w:r>
+    </w:p>
+    <w:p>
+      <w:pPr>
+        <w:numPr>
+          <w:ilvl w:val="0"/>
+          <w:numId w:val="8"/>
+        </w:numPr>
+      </w:pPr>
+      <w:r>
+        <w:t>DoorDash delivery logs</w:t>
+      </w:r>
+    </w:p>
+    <w:p>
+      <w:r>
+        <w:t>Add a simple diagram showing how data flows into your analysis.</w:t>
+      </w:r>
+    </w:p>
+    <w:p>
+      <w:pPr>
+        <w:rPr>
+          <w:b/>
+          <w:bCs/>
+        </w:rPr>
+      </w:pPr>
+      <w:r>
+        <w:rPr>
+          <w:b/>
+          <w:bCs/>
+        </w:rPr>
+        <w:t>5. Methodology</w:t>
+      </w:r>
+    </w:p>
+    <w:p>
+      <w:r>
+        <w:t>Use a 3–5 step process:</w:t>
+      </w:r>
+    </w:p>
+    <w:p>
+      <w:pPr>
+        <w:numPr>
+          <w:ilvl w:val="0"/>
+          <w:numId w:val="9"/>
+        </w:numPr>
+      </w:pPr>
+      <w:r>
+        <w:t>Data cleaning</w:t>
+      </w:r>
+    </w:p>
+    <w:p>
+      <w:pPr>
+        <w:numPr>
+          <w:ilvl w:val="0"/>
+          <w:numId w:val="9"/>
+        </w:numPr>
+      </w:pPr>
+      <w:r>
+        <w:t>Joining datasets</w:t>
+      </w:r>
+    </w:p>
+    <w:p>
+      <w:pPr>
+        <w:numPr>
+          <w:ilvl w:val="0"/>
+          <w:numId w:val="9"/>
+        </w:numPr>
+      </w:pPr>
+      <w:r>
+        <w:t>Feature engineering</w:t>
+      </w:r>
+    </w:p>
+    <w:p>
+      <w:pPr>
+        <w:numPr>
+          <w:ilvl w:val="0"/>
+          <w:numId w:val="9"/>
+        </w:numPr>
+      </w:pPr>
+      <w:r>
+        <w:t>Analysis</w:t>
+      </w:r>
+    </w:p>
+    <w:p>
+      <w:pPr>
+        <w:numPr>
+          <w:ilvl w:val="0"/>
+          <w:numId w:val="9"/>
+        </w:numPr>
+      </w:pPr>
+      <w:r>
+        <w:t>Visualization</w:t>
+      </w:r>
+    </w:p>
+    <w:p>
+      <w:r>
+        <w:t>Keep it visual — arrows, icons, timelines.</w:t>
+      </w:r>
+    </w:p>
+    <w:p>
+      <w:pPr>
+        <w:rPr>
+          <w:b/>
+          <w:bCs/>
+        </w:rPr>
+      </w:pPr>
+      <w:r>
+        <w:rPr>
+          <w:b/>
+          <w:bCs/>
+        </w:rPr>
+        <w:t>6. Key Insights</w:t>
+      </w:r>
+    </w:p>
+    <w:p>
+      <w:r>
+        <w:t>This is the heart of your deck. Use:</w:t>
+      </w:r>
+    </w:p>
+    <w:p>
+      <w:pPr>
+        <w:numPr>
+          <w:ilvl w:val="0"/>
+          <w:numId w:val="10"/>
+        </w:numPr>
+      </w:pPr>
+      <w:r>
+        <w:t>Big numbers</w:t>
+      </w:r>
+    </w:p>
+    <w:p>
+      <w:pPr>
+        <w:numPr>
+          <w:ilvl w:val="0"/>
+          <w:numId w:val="10"/>
+        </w:numPr>
+      </w:pPr>
+      <w:r>
+        <w:t>Clear charts</w:t>
+      </w:r>
+    </w:p>
+    <w:p>
+      <w:pPr>
+        <w:numPr>
+          <w:ilvl w:val="0"/>
+          <w:numId w:val="10"/>
+        </w:numPr>
+      </w:pPr>
+      <w:r>
+        <w:t>Short interpretations (“What this means”)</w:t>
+      </w:r>
+    </w:p>
+    <w:p>
+      <w:pPr>
+        <w:rPr>
+          <w:b/>
+          <w:bCs/>
+        </w:rPr>
+      </w:pPr>
+      <w:r>
+        <w:rPr>
+          <w:b/>
+          <w:bCs/>
+        </w:rPr>
+        <w:t>7. Recommendations</w:t>
+      </w:r>
+    </w:p>
+    <w:p>
+      <w:r>
+        <w:t>Show that you think like an analyst, not just a data technician.</w:t>
+      </w:r>
+    </w:p>
+    <w:p>
+      <w:pPr>
+        <w:rPr>
+          <w:b/>
+          <w:bCs/>
+        </w:rPr>
+      </w:pPr>
+      <w:r>
+        <w:rPr>
+          <w:b/>
+          <w:bCs/>
+        </w:rPr>
+        <w:t>8. Impact</w:t>
+      </w:r>
+    </w:p>
+    <w:p>
+      <w:r>
+        <w:lastRenderedPageBreak/>
+        <w:t>One slide summarizing:</w:t>
+      </w:r>
+    </w:p>
+    <w:p>
+      <w:pPr>
+        <w:numPr>
+          <w:ilvl w:val="0"/>
+          <w:numId w:val="11"/>
+        </w:numPr>
+      </w:pPr>
+      <w:r>
+        <w:t>What changed</w:t>
+      </w:r>
+    </w:p>
+    <w:p>
+      <w:pPr>
+        <w:numPr>
+          <w:ilvl w:val="0"/>
+          <w:numId w:val="11"/>
+        </w:numPr>
+      </w:pPr>
+      <w:r>
+        <w:t>What could change</w:t>
+      </w:r>
+    </w:p>
+    <w:p>
+      <w:pPr>
+        <w:numPr>
+          <w:ilvl w:val="0"/>
+          <w:numId w:val="11"/>
+        </w:numPr>
+      </w:pPr>
+      <w:r>
+        <w:t>Why your work matters</w:t>
+      </w:r>
+    </w:p>
+    <w:p>
+      <w:pPr>
+        <w:rPr>
+          <w:b/>
+          <w:bCs/>
+        </w:rPr>
+      </w:pPr>
+      <w:r>
+        <w:rPr>
+          <w:b/>
+          <w:bCs/>
+        </w:rPr>
+        <w:t>9. Tech Stack</w:t>
+      </w:r>
+    </w:p>
+    <w:p>
+      <w:r>
+        <w:t>Logos only:</w:t>
+      </w:r>
+    </w:p>
+    <w:p>
+      <w:pPr>
+        <w:numPr>
+          <w:ilvl w:val="0"/>
+          <w:numId w:val="12"/>
+        </w:numPr>
+      </w:pPr>
+      <w:r>
+        <w:t>Power BI</w:t>
+      </w:r>
+    </w:p>
+    <w:p>
+      <w:pPr>
+        <w:numPr>
+          <w:ilvl w:val="0"/>
+          <w:numId w:val="12"/>
+        </w:numPr>
+      </w:pPr>
+      <w:r>
+        <w:t>SQL</w:t>
+      </w:r>
+    </w:p>
+    <w:p>
+      <w:pPr>
+        <w:numPr>
+          <w:ilvl w:val="0"/>
+          <w:numId w:val="12"/>
+        </w:numPr>
+      </w:pPr>
+      <w:r>
+        <w:t>Python</w:t>
+      </w:r>
+    </w:p>
+    <w:p>
+      <w:pPr>
+        <w:numPr>
+          <w:ilvl w:val="0"/>
+          <w:numId w:val="12"/>
+        </w:numPr>
+      </w:pPr>
+      <w:r>
+        <w:t>Canva</w:t>
+      </w:r>
+    </w:p>
+    <w:p>
+      <w:pPr>
+        <w:numPr>
+          <w:ilvl w:val="0"/>
+          <w:numId w:val="12"/>
+        </w:numPr>
+      </w:pPr>
+      <w:r>
+        <w:t>GitHub</w:t>
+      </w:r>
+    </w:p>
+    <w:p>
+      <w:pPr>
+        <w:rPr>
+          <w:b/>
+          <w:bCs/>
+        </w:rPr>
+      </w:pPr>
+      <w:r>
+        <w:rPr>
+          <w:b/>
+          <w:bCs/>
+        </w:rPr>
+        <w:t>10. Closing Slide</w:t>
+      </w:r>
+    </w:p>
+    <w:p>
+      <w:r>
+        <w:t>Invite conversation:</w:t>
+      </w:r>
+    </w:p>
+    <w:p>
+      <w:pPr>
+        <w:numPr>
+          <w:ilvl w:val="0"/>
+          <w:numId w:val="13"/>
+        </w:numPr>
+      </w:pPr>
+      <w:r>
+        <w:t>“Let’s talk data.”</w:t>
+      </w:r>
+    </w:p>
+    <w:p>
+      <w:pPr>
+        <w:numPr>
+          <w:ilvl w:val="0"/>
+          <w:numId w:val="13"/>
+        </w:numPr>
+      </w:pPr>
+      <w:r>
+        <w:t>Your GitHub link</w:t>
+      </w:r>
+    </w:p>
+    <w:p>
+      <w:pPr>
+        <w:numPr>
+          <w:ilvl w:val="0"/>
+          <w:numId w:val="13"/>
+        </w:numPr>
+      </w:pPr>
+      <w:r>
+        <w:t>Your email</w:t>
+      </w:r>
+    </w:p>
+    <w:p/>
+    <w:p>
+      <w:r>
+        <w:t xml:space="preserve">However, this seems out of order. Review this later and </w:t>
+      </w:r>
+      <w:proofErr w:type="gramStart"/>
+      <w:r>
+        <w:t>arrange</w:t>
+      </w:r>
+      <w:proofErr w:type="gramEnd"/>
+      <w:r>
+        <w:t xml:space="preserve"> in a way that makes more sense. </w:t>
+      </w:r>
+    </w:p>
+    <w:p/>
+    <w:p>
+      <w:pPr>
+        <w:rPr>
+          <w:u w:val="single"/>
+        </w:rPr>
+      </w:pPr>
+      <w:r>
+        <w:rPr>
+          <w:u w:val="single"/>
+        </w:rPr>
+        <w:t>8/3/2026</w:t>
+      </w:r>
+    </w:p>
+    <w:p>
+      <w:r>
+        <w:t>Slide 1 — Title &amp; Summary</w:t>
+      </w:r>
+    </w:p>
+    <w:p>
+      <w:r>
+        <w:t>Project name: Multi-Platform Ecommerce Analytics</w:t>
+      </w:r>
+    </w:p>
+    <w:p>
+      <w:r>
+        <w:t>Your name: Nico Rafael</w:t>
+      </w:r>
+      <w:r>
+        <w:tab/>
+        <w:t xml:space="preserve"> </w:t>
+      </w:r>
+    </w:p>
+    <w:p>
+      <w:r>
+        <w:t xml:space="preserve">This dashboard analyzes sales performance across </w:t>
+      </w:r>
+      <w:r>
+        <w:t xml:space="preserve">the business’s </w:t>
+      </w:r>
+      <w:r>
+        <w:t>two ecommerce platforms: TikTok Shop and Squarespace</w:t>
+      </w:r>
+      <w:r>
+        <w:t>.</w:t>
+      </w:r>
+    </w:p>
+    <w:p>
+      <w:r>
+        <w:t>Tools Used:</w:t>
+      </w:r>
+    </w:p>
+    <w:p>
+      <w:pPr>
+        <w:pStyle w:val="ListParagraph"/>
+        <w:numPr>
+          <w:ilvl w:val="0"/>
+          <w:numId w:val="4"/>
+        </w:numPr>
+      </w:pPr>
+      <w:r>
+        <w:lastRenderedPageBreak/>
+        <w:t xml:space="preserve">SQL </w:t>
+      </w:r>
+    </w:p>
+    <w:p>
+      <w:pPr>
+        <w:pStyle w:val="ListParagraph"/>
+        <w:numPr>
+          <w:ilvl w:val="0"/>
+          <w:numId w:val="4"/>
+        </w:numPr>
+      </w:pPr>
+      <w:proofErr w:type="spellStart"/>
+      <w:r>
+        <w:t>Exel</w:t>
+      </w:r>
+      <w:proofErr w:type="spellEnd"/>
+    </w:p>
+    <w:p>
+      <w:pPr>
+        <w:pStyle w:val="ListParagraph"/>
+        <w:numPr>
+          <w:ilvl w:val="0"/>
+          <w:numId w:val="4"/>
+        </w:numPr>
+      </w:pPr>
+      <w:r>
+        <w:t>Power BI</w:t>
+      </w:r>
+    </w:p>
+    <w:p>
+      <w:pPr>
+        <w:pStyle w:val="ListParagraph"/>
+        <w:numPr>
+          <w:ilvl w:val="0"/>
+          <w:numId w:val="4"/>
+        </w:numPr>
+      </w:pPr>
+    </w:p>
+    <w:p/>
+    <w:p>
+      <w:r>
+        <w:t>Slide 2 — Problem / Goal</w:t>
+      </w:r>
+    </w:p>
+    <w:p>
+      <w:r>
+        <w:t>What you set out to solve</w:t>
+      </w:r>
+    </w:p>
+    <w:p>
+      <w:r>
+        <w:t>I was tasked to provide insight on the top selling products and look for opportunities to increase sales. I also decided to look further into areas in the county where that made the most purchases.</w:t>
+      </w:r>
+    </w:p>
+    <w:p>
+      <w:r>
+        <w:t>Why it matters</w:t>
+      </w:r>
+    </w:p>
+    <w:p>
+      <w:r>
+        <w:t xml:space="preserve">Over the past two years, the owner had noticed sales were going down, and it was growing more challenging to get views on social media. The owner believed that decreased sales were due to a lack of content creation and low visibility. </w:t>
+      </w:r>
+    </w:p>
+    <w:p>
+      <w:r>
+        <w:t xml:space="preserve">  </w:t>
+      </w:r>
+    </w:p>
+    <w:p>
+      <w:r>
+        <w:t>Slide 3 — Data &amp; Process</w:t>
+      </w:r>
+    </w:p>
+    <w:p>
+      <w:r>
+        <w:t>Data sources</w:t>
+      </w:r>
+    </w:p>
+    <w:p>
+      <w:r>
+        <w:t xml:space="preserve">From the business’s accounts, I exported .csv files from TikTok Shop and Squarespace. </w:t>
+      </w:r>
+      <w:r>
+        <w:t xml:space="preserve">TikTok only had gross and net sales data. However, Squarespace provided more information on product sales and customers. </w:t>
+      </w:r>
+    </w:p>
+    <w:p/>
+    <w:p>
+      <w:r>
+        <w:t>Cleaning steps</w:t>
+      </w:r>
+    </w:p>
+    <w:p>
+      <w:r>
+        <w:t xml:space="preserve">I joined the datasets from TikTok and Squarespace to get segmented representation of sales trends and total earnings overall. </w:t>
+      </w:r>
+    </w:p>
+    <w:p>
+      <w:r>
+        <w:t>I also h</w:t>
+      </w:r>
+      <w:r>
+        <w:t>andled missing values to ensure accurate and consistent calculations.</w:t>
+      </w:r>
+    </w:p>
+    <w:p/>
+    <w:p>
+      <w:r>
+        <w:t>SQL or modeling workflow</w:t>
+      </w:r>
+    </w:p>
+    <w:p>
+      <w:r>
+        <w:t>Tools involved</w:t>
+      </w:r>
+    </w:p>
+    <w:p>
+      <w:r>
+        <w:t>Logos of PostgreSQL, Excel, Power BI, git bash, and GitHub</w:t>
+      </w:r>
+    </w:p>
+    <w:p/>
+    <w:p>
+      <w:r>
+        <w:t>Slide 4 — Key Insights</w:t>
+      </w:r>
+    </w:p>
+    <w:p>
+      <w:r>
+        <w:t>2–4 visuals</w:t>
+      </w:r>
+    </w:p>
+    <w:p>
+      <w:r>
+        <w:t>Most important findings</w:t>
+      </w:r>
+    </w:p>
+    <w:p/>
+    <w:p>
+      <w:r>
+        <w:t>Slide 5 — Final Dashboard / Product</w:t>
+      </w:r>
+    </w:p>
+    <w:p>
+      <w:r>
+        <w:t>Full screenshot</w:t>
+      </w:r>
+    </w:p>
+    <w:p>
+      <w:r>
+        <w:t>Highlight core features</w:t>
+      </w:r>
+    </w:p>
+    <w:p/>
+    <w:p>
+      <w:r>
+        <w:t>Slide 6 — Results / Impact</w:t>
+      </w:r>
+    </w:p>
+    <w:p>
+      <w:r>
+        <w:t>Business value</w:t>
+      </w:r>
+    </w:p>
+    <w:p>
+      <w:r>
+        <w:t>Quantified improvements (real or hypothetical)</w:t>
+      </w:r>
+    </w:p>
+    <w:p/>
+    <w:p>
+      <w:r>
+        <w:t>Slide 7 — Technical Skills Demonstrated</w:t>
+      </w:r>
+    </w:p>
+    <w:p>
+      <w:r>
+        <w:t>SQL, Power BI, Git, HTML/CSS/JS, etc.</w:t>
+      </w:r>
+    </w:p>
+    <w:p>
+      <w:r>
+        <w:t xml:space="preserve">What </w:t>
+      </w:r>
+      <w:proofErr w:type="gramStart"/>
+      <w:r>
+        <w:t>you specifically did</w:t>
+      </w:r>
+      <w:proofErr w:type="gramEnd"/>
+      <w:r>
+        <w:t>?</w:t>
+      </w:r>
+    </w:p>
+    <w:p/>
+    <w:p>
+      <w:r>
+        <w:t>Slide 8 — Reflection &amp; Links</w:t>
+      </w:r>
+    </w:p>
+    <w:p>
+      <w:r>
+        <w:t>What you learned</w:t>
+      </w:r>
+    </w:p>
+    <w:p>
+      <w:r>
+        <w:t>What you’d improve:</w:t>
+      </w:r>
+    </w:p>
+    <w:p>
+      <w:r>
+        <w:t>GitHub repo + contact info</w:t>
+      </w:r>
+    </w:p>
+    <w:p>
+      <w:pPr>
+        <w:rPr>
+          <w:u w:val="single"/>
+        </w:rPr>
+      </w:pPr>
+    </w:p>
+    <w:p>
+      <w:pPr>
+        <w:rPr>
+          <w:u w:val="single"/>
+        </w:rPr>
+      </w:pPr>
+    </w:p>
+    <w:p>
+      <w:pPr>
+        <w:rPr>
+          <w:u w:val="single"/>
+        </w:rPr>
+      </w:pPr>
+      <w:r>
+        <w:rPr>
+          <w:u w:val="single"/>
+        </w:rPr>
         <w:t>7/28/2026</w:t>
       </w:r>
     </w:p>
@@ -40,6 +1038,7 @@
     </w:p>
     <w:p>
       <w:r>
+        <w:lastRenderedPageBreak/>
         <w:t>This makes me realize that I should do this type of descriptive logic on all my other projects too: Healthcare and Operations-Dash.</w:t>
       </w:r>
     </w:p>
@@ -278,8 +1277,13 @@
         </w:numPr>
       </w:pPr>
       <w:r>
-        <w:t>Updated and verified SQL scripts function properly within PGadmin</w:t>
-      </w:r>
+        <w:t xml:space="preserve">Updated and verified SQL scripts function properly within </w:t>
+      </w:r>
+      <w:proofErr w:type="spellStart"/>
+      <w:r>
+        <w:t>PGadmin</w:t>
+      </w:r>
+      <w:proofErr w:type="spellEnd"/>
     </w:p>
     <w:p>
       <w:pPr>
@@ -318,42 +1322,70 @@
     </w:p>
     <w:p>
       <w:r>
+        <w:t>After r</w:t>
+      </w:r>
+      <w:r>
+        <w:t>eviewing</w:t>
+      </w:r>
+      <w:r>
+        <w:t xml:space="preserve"> the</w:t>
+      </w:r>
+      <w:r>
+        <w:t xml:space="preserve"> files</w:t>
+      </w:r>
+      <w:r>
+        <w:t xml:space="preserve"> on my local and remote repos, I have found the SQL code for this project missing. </w:t>
+      </w:r>
+    </w:p>
+    <w:p>
+      <w:r>
+        <w:t xml:space="preserve">I’ll need the SQL code stored on my home </w:t>
+      </w:r>
+      <w:proofErr w:type="gramStart"/>
+      <w:r>
+        <w:t>computer, and</w:t>
+      </w:r>
+      <w:proofErr w:type="gramEnd"/>
+      <w:r>
+        <w:t xml:space="preserve"> then </w:t>
+      </w:r>
+      <w:proofErr w:type="gramStart"/>
+      <w:r>
+        <w:t>transfer</w:t>
+      </w:r>
+      <w:proofErr w:type="gramEnd"/>
+      <w:r>
+        <w:t xml:space="preserve"> to local/remote repos</w:t>
+      </w:r>
+      <w:r>
+        <w:t xml:space="preserve">. </w:t>
+      </w:r>
+    </w:p>
+    <w:p/>
+    <w:p>
+      <w:pPr>
+        <w:rPr>
+          <w:u w:val="single"/>
+        </w:rPr>
+      </w:pPr>
+      <w:r>
+        <w:rPr>
+          <w:u w:val="single"/>
+        </w:rPr>
+        <w:t>July 21, 2026</w:t>
+      </w:r>
+    </w:p>
+    <w:p>
+      <w:pPr>
+        <w:pStyle w:val="ListParagraph"/>
+        <w:numPr>
+          <w:ilvl w:val="0"/>
+          <w:numId w:val="1"/>
+        </w:numPr>
+      </w:pPr>
+      <w:r>
         <w:lastRenderedPageBreak/>
-        <w:t>After r</w:t>
-      </w:r>
-      <w:r>
-        <w:t>eviewing</w:t>
-      </w:r>
-      <w:r>
-        <w:t xml:space="preserve"> the</w:t>
-      </w:r>
-      <w:r>
-        <w:t xml:space="preserve"> files</w:t>
-      </w:r>
-      <w:r>
-        <w:t xml:space="preserve"> on my local and remote repos, I have found the SQL code for this project missing. </w:t>
-      </w:r>
-    </w:p>
-    <w:p>
-      <w:r>
-        <w:t>I’ll need the SQL code stored on my home computer, and then transfer to local/remote repos</w:t>
-      </w:r>
-      <w:r>
-        <w:t xml:space="preserve">. </w:t>
-      </w:r>
-    </w:p>
-    <w:p/>
-    <w:p>
-      <w:pPr>
-        <w:rPr>
-          <w:u w:val="single"/>
-        </w:rPr>
-      </w:pPr>
-      <w:r>
-        <w:rPr>
-          <w:u w:val="single"/>
-        </w:rPr>
-        <w:t>July 21, 2026</w:t>
+        <w:t>Git Hub repo was created</w:t>
       </w:r>
     </w:p>
     <w:p>
@@ -365,19 +1397,15 @@
         </w:numPr>
       </w:pPr>
       <w:r>
-        <w:t>Git Hub repo was created</w:t>
-      </w:r>
-    </w:p>
-    <w:p>
-      <w:pPr>
-        <w:pStyle w:val="ListParagraph"/>
-        <w:numPr>
-          <w:ilvl w:val="0"/>
-          <w:numId w:val="1"/>
-        </w:numPr>
-      </w:pPr>
-      <w:r>
-        <w:t xml:space="preserve">Project Files imported onto local and remote repos </w:t>
+        <w:t xml:space="preserve">Project Files imported </w:t>
+      </w:r>
+      <w:proofErr w:type="gramStart"/>
+      <w:r>
+        <w:t>onto</w:t>
+      </w:r>
+      <w:proofErr w:type="gramEnd"/>
+      <w:r>
+        <w:t xml:space="preserve"> local and remote repos </w:t>
       </w:r>
     </w:p>
     <w:p/>
@@ -394,6 +1422,1126 @@
 <file path=word/numbering.xml><?xml version="1.0" encoding="utf-8"?>
 <w:numbering xmlns:wpc="http://schemas.microsoft.com/office/word/2010/wordprocessingCanvas" xmlns:cx="http://schemas.microsoft.com/office/drawing/2014/chartex" xmlns:cx1="http://schemas.microsoft.com/office/drawing/2015/9/8/chartex" xmlns:cx2="http://schemas.microsoft.com/office/drawing/2015/10/21/chartex" xmlns:cx3="http://schemas.microsoft.com/office/drawing/2016/5/9/chartex" xmlns:cx4="http://schemas.microsoft.com/office/drawing/2016/5/10/chartex" xmlns:cx5="http://schemas.microsoft.com/office/drawing/2016/5/11/chartex" xmlns:cx6="http://schemas.microsoft.com/office/drawing/2016/5/12/chartex" xmlns:cx7="http://schemas.microsoft.com/office/drawing/2016/5/13/chartex" xmlns:cx8="http://schemas.microsoft.com/office/drawing/2016/5/14/chartex" xmlns:mc="http://schemas.openxmlformats.org/markup-compatibility/2006" xmlns:aink="http://schemas.microsoft.com/office/drawing/2016/ink" xmlns:am3d="http://schemas.microsoft.com/office/drawing/2017/model3d" xmlns:o="urn:schemas-microsoft-com:office:office" xmlns:oel="http://schemas.microsoft.com/office/2019/extlst" xmlns:r="http://schemas.openxmlformats.org/officeDocument/2006/relationships" xmlns:m="http://schemas.openxmlformats.org/officeDocument/2006/math" xmlns:v="urn:schemas-microsoft-com:vml" xmlns:wp14="http://schemas.microsoft.com/office/word/2010/wordprocessingDrawing" xmlns:wp="http://schemas.openxmlformats.org/drawingml/2006/wordprocessingDrawing" xmlns:w10="urn:schemas-microsoft-com:office:word" xmlns:w="http://schemas.openxmlformats.org/wordprocessingml/2006/main" xmlns:w14="http://schemas.microsoft.com/office/word/2010/wordml" xmlns:w15="http://schemas.microsoft.com/office/word/2012/wordml" xmlns:w16cei="http://schemas.microsoft.com/office/word/2026/wordml/cei" xmlns:w16cex="http://schemas.microsoft.com/office/word/2018/wordml/cex" xmlns:w16cid="http://schemas.microsoft.com/office/word/2016/wordml/cid" xmlns:w16="http://schemas.microsoft.com/office/word/2018/wordml" xmlns:w16du="http://schemas.microsoft.com/office/word/2023/wordml/word16du" xmlns:w16sdtdh="http://schemas.microsoft.com/office/word/2020/wordml/sdtdatahash" xmlns:w16sdtfl="http://schemas.microsoft.com/office/word/2024/wordml/sdtformatlock" xmlns:w16se="http://schemas.microsoft.com/office/word/2015/wordml/symex" xmlns:wpg="http://schemas.microsoft.com/office/word/2010/wordprocessingGroup" xmlns:wpi="http://schemas.microsoft.com/office/word/2010/wordprocessingInk" xmlns:wne="http://schemas.microsoft.com/office/word/2006/wordml" xmlns:wps="http://schemas.microsoft.com/office/word/2010/wordprocessingShape" mc:Ignorable="w14 w15 w16se w16cid w16 w16cex w16sdtdh w16sdtfl w16du wp14">
   <w:abstractNum w:abstractNumId="0" w15:restartNumberingAfterBreak="0">
+    <w:nsid w:val="040F561D"/>
+    <w:multiLevelType w:val="hybridMultilevel"/>
+    <w:tmpl w:val="C55602EA"/>
+    <w:lvl w:ilvl="0" w:tplc="04090001">
+      <w:start w:val="1"/>
+      <w:numFmt w:val="bullet"/>
+      <w:lvlText w:val=""/>
+      <w:lvlJc w:val="left"/>
+      <w:pPr>
+        <w:ind w:left="720" w:hanging="360"/>
+      </w:pPr>
+      <w:rPr>
+        <w:rFonts w:ascii="Symbol" w:hAnsi="Symbol" w:hint="default"/>
+      </w:rPr>
+    </w:lvl>
+    <w:lvl w:ilvl="1" w:tplc="04090003" w:tentative="1">
+      <w:start w:val="1"/>
+      <w:numFmt w:val="bullet"/>
+      <w:lvlText w:val="o"/>
+      <w:lvlJc w:val="left"/>
+      <w:pPr>
+        <w:ind w:left="1440" w:hanging="360"/>
+      </w:pPr>
+      <w:rPr>
+        <w:rFonts w:ascii="Courier New" w:hAnsi="Courier New" w:cs="Courier New" w:hint="default"/>
+      </w:rPr>
+    </w:lvl>
+    <w:lvl w:ilvl="2" w:tplc="04090005" w:tentative="1">
+      <w:start w:val="1"/>
+      <w:numFmt w:val="bullet"/>
+      <w:lvlText w:val=""/>
+      <w:lvlJc w:val="left"/>
+      <w:pPr>
+        <w:ind w:left="2160" w:hanging="360"/>
+      </w:pPr>
+      <w:rPr>
+        <w:rFonts w:ascii="Wingdings" w:hAnsi="Wingdings" w:hint="default"/>
+      </w:rPr>
+    </w:lvl>
+    <w:lvl w:ilvl="3" w:tplc="04090001" w:tentative="1">
+      <w:start w:val="1"/>
+      <w:numFmt w:val="bullet"/>
+      <w:lvlText w:val=""/>
+      <w:lvlJc w:val="left"/>
+      <w:pPr>
+        <w:ind w:left="2880" w:hanging="360"/>
+      </w:pPr>
+      <w:rPr>
+        <w:rFonts w:ascii="Symbol" w:hAnsi="Symbol" w:hint="default"/>
+      </w:rPr>
+    </w:lvl>
+    <w:lvl w:ilvl="4" w:tplc="04090003" w:tentative="1">
+      <w:start w:val="1"/>
+      <w:numFmt w:val="bullet"/>
+      <w:lvlText w:val="o"/>
+      <w:lvlJc w:val="left"/>
+      <w:pPr>
+        <w:ind w:left="3600" w:hanging="360"/>
+      </w:pPr>
+      <w:rPr>
+        <w:rFonts w:ascii="Courier New" w:hAnsi="Courier New" w:cs="Courier New" w:hint="default"/>
+      </w:rPr>
+    </w:lvl>
+    <w:lvl w:ilvl="5" w:tplc="04090005" w:tentative="1">
+      <w:start w:val="1"/>
+      <w:numFmt w:val="bullet"/>
+      <w:lvlText w:val=""/>
+      <w:lvlJc w:val="left"/>
+      <w:pPr>
+        <w:ind w:left="4320" w:hanging="360"/>
+      </w:pPr>
+      <w:rPr>
+        <w:rFonts w:ascii="Wingdings" w:hAnsi="Wingdings" w:hint="default"/>
+      </w:rPr>
+    </w:lvl>
+    <w:lvl w:ilvl="6" w:tplc="04090001" w:tentative="1">
+      <w:start w:val="1"/>
+      <w:numFmt w:val="bullet"/>
+      <w:lvlText w:val=""/>
+      <w:lvlJc w:val="left"/>
+      <w:pPr>
+        <w:ind w:left="5040" w:hanging="360"/>
+      </w:pPr>
+      <w:rPr>
+        <w:rFonts w:ascii="Symbol" w:hAnsi="Symbol" w:hint="default"/>
+      </w:rPr>
+    </w:lvl>
+    <w:lvl w:ilvl="7" w:tplc="04090003" w:tentative="1">
+      <w:start w:val="1"/>
+      <w:numFmt w:val="bullet"/>
+      <w:lvlText w:val="o"/>
+      <w:lvlJc w:val="left"/>
+      <w:pPr>
+        <w:ind w:left="5760" w:hanging="360"/>
+      </w:pPr>
+      <w:rPr>
+        <w:rFonts w:ascii="Courier New" w:hAnsi="Courier New" w:cs="Courier New" w:hint="default"/>
+      </w:rPr>
+    </w:lvl>
+    <w:lvl w:ilvl="8" w:tplc="04090005" w:tentative="1">
+      <w:start w:val="1"/>
+      <w:numFmt w:val="bullet"/>
+      <w:lvlText w:val=""/>
+      <w:lvlJc w:val="left"/>
+      <w:pPr>
+        <w:ind w:left="6480" w:hanging="360"/>
+      </w:pPr>
+      <w:rPr>
+        <w:rFonts w:ascii="Wingdings" w:hAnsi="Wingdings" w:hint="default"/>
+      </w:rPr>
+    </w:lvl>
+  </w:abstractNum>
+  <w:abstractNum w:abstractNumId="1" w15:restartNumberingAfterBreak="0">
+    <w:nsid w:val="1AF446B2"/>
+    <w:multiLevelType w:val="hybridMultilevel"/>
+    <w:tmpl w:val="E0547FE0"/>
+    <w:lvl w:ilvl="0" w:tplc="04090001">
+      <w:start w:val="1"/>
+      <w:numFmt w:val="bullet"/>
+      <w:lvlText w:val=""/>
+      <w:lvlJc w:val="left"/>
+      <w:pPr>
+        <w:ind w:left="720" w:hanging="360"/>
+      </w:pPr>
+      <w:rPr>
+        <w:rFonts w:ascii="Symbol" w:hAnsi="Symbol" w:hint="default"/>
+      </w:rPr>
+    </w:lvl>
+    <w:lvl w:ilvl="1" w:tplc="04090003" w:tentative="1">
+      <w:start w:val="1"/>
+      <w:numFmt w:val="bullet"/>
+      <w:lvlText w:val="o"/>
+      <w:lvlJc w:val="left"/>
+      <w:pPr>
+        <w:ind w:left="1440" w:hanging="360"/>
+      </w:pPr>
+      <w:rPr>
+        <w:rFonts w:ascii="Courier New" w:hAnsi="Courier New" w:cs="Courier New" w:hint="default"/>
+      </w:rPr>
+    </w:lvl>
+    <w:lvl w:ilvl="2" w:tplc="04090005" w:tentative="1">
+      <w:start w:val="1"/>
+      <w:numFmt w:val="bullet"/>
+      <w:lvlText w:val=""/>
+      <w:lvlJc w:val="left"/>
+      <w:pPr>
+        <w:ind w:left="2160" w:hanging="360"/>
+      </w:pPr>
+      <w:rPr>
+        <w:rFonts w:ascii="Wingdings" w:hAnsi="Wingdings" w:hint="default"/>
+      </w:rPr>
+    </w:lvl>
+    <w:lvl w:ilvl="3" w:tplc="04090001" w:tentative="1">
+      <w:start w:val="1"/>
+      <w:numFmt w:val="bullet"/>
+      <w:lvlText w:val=""/>
+      <w:lvlJc w:val="left"/>
+      <w:pPr>
+        <w:ind w:left="2880" w:hanging="360"/>
+      </w:pPr>
+      <w:rPr>
+        <w:rFonts w:ascii="Symbol" w:hAnsi="Symbol" w:hint="default"/>
+      </w:rPr>
+    </w:lvl>
+    <w:lvl w:ilvl="4" w:tplc="04090003" w:tentative="1">
+      <w:start w:val="1"/>
+      <w:numFmt w:val="bullet"/>
+      <w:lvlText w:val="o"/>
+      <w:lvlJc w:val="left"/>
+      <w:pPr>
+        <w:ind w:left="3600" w:hanging="360"/>
+      </w:pPr>
+      <w:rPr>
+        <w:rFonts w:ascii="Courier New" w:hAnsi="Courier New" w:cs="Courier New" w:hint="default"/>
+      </w:rPr>
+    </w:lvl>
+    <w:lvl w:ilvl="5" w:tplc="04090005" w:tentative="1">
+      <w:start w:val="1"/>
+      <w:numFmt w:val="bullet"/>
+      <w:lvlText w:val=""/>
+      <w:lvlJc w:val="left"/>
+      <w:pPr>
+        <w:ind w:left="4320" w:hanging="360"/>
+      </w:pPr>
+      <w:rPr>
+        <w:rFonts w:ascii="Wingdings" w:hAnsi="Wingdings" w:hint="default"/>
+      </w:rPr>
+    </w:lvl>
+    <w:lvl w:ilvl="6" w:tplc="04090001" w:tentative="1">
+      <w:start w:val="1"/>
+      <w:numFmt w:val="bullet"/>
+      <w:lvlText w:val=""/>
+      <w:lvlJc w:val="left"/>
+      <w:pPr>
+        <w:ind w:left="5040" w:hanging="360"/>
+      </w:pPr>
+      <w:rPr>
+        <w:rFonts w:ascii="Symbol" w:hAnsi="Symbol" w:hint="default"/>
+      </w:rPr>
+    </w:lvl>
+    <w:lvl w:ilvl="7" w:tplc="04090003" w:tentative="1">
+      <w:start w:val="1"/>
+      <w:numFmt w:val="bullet"/>
+      <w:lvlText w:val="o"/>
+      <w:lvlJc w:val="left"/>
+      <w:pPr>
+        <w:ind w:left="5760" w:hanging="360"/>
+      </w:pPr>
+      <w:rPr>
+        <w:rFonts w:ascii="Courier New" w:hAnsi="Courier New" w:cs="Courier New" w:hint="default"/>
+      </w:rPr>
+    </w:lvl>
+    <w:lvl w:ilvl="8" w:tplc="04090005" w:tentative="1">
+      <w:start w:val="1"/>
+      <w:numFmt w:val="bullet"/>
+      <w:lvlText w:val=""/>
+      <w:lvlJc w:val="left"/>
+      <w:pPr>
+        <w:ind w:left="6480" w:hanging="360"/>
+      </w:pPr>
+      <w:rPr>
+        <w:rFonts w:ascii="Wingdings" w:hAnsi="Wingdings" w:hint="default"/>
+      </w:rPr>
+    </w:lvl>
+  </w:abstractNum>
+  <w:abstractNum w:abstractNumId="2" w15:restartNumberingAfterBreak="0">
+    <w:nsid w:val="1C604758"/>
+    <w:multiLevelType w:val="multilevel"/>
+    <w:tmpl w:val="5CD82A52"/>
+    <w:lvl w:ilvl="0">
+      <w:start w:val="1"/>
+      <w:numFmt w:val="bullet"/>
+      <w:lvlText w:val=""/>
+      <w:lvlJc w:val="left"/>
+      <w:pPr>
+        <w:tabs>
+          <w:tab w:val="num" w:pos="720"/>
+        </w:tabs>
+        <w:ind w:left="720" w:hanging="360"/>
+      </w:pPr>
+      <w:rPr>
+        <w:rFonts w:ascii="Symbol" w:hAnsi="Symbol" w:hint="default"/>
+        <w:sz w:val="20"/>
+      </w:rPr>
+    </w:lvl>
+    <w:lvl w:ilvl="1" w:tentative="1">
+      <w:start w:val="1"/>
+      <w:numFmt w:val="bullet"/>
+      <w:lvlText w:val="o"/>
+      <w:lvlJc w:val="left"/>
+      <w:pPr>
+        <w:tabs>
+          <w:tab w:val="num" w:pos="1440"/>
+        </w:tabs>
+        <w:ind w:left="1440" w:hanging="360"/>
+      </w:pPr>
+      <w:rPr>
+        <w:rFonts w:ascii="Courier New" w:hAnsi="Courier New" w:hint="default"/>
+        <w:sz w:val="20"/>
+      </w:rPr>
+    </w:lvl>
+    <w:lvl w:ilvl="2" w:tentative="1">
+      <w:start w:val="1"/>
+      <w:numFmt w:val="bullet"/>
+      <w:lvlText w:val=""/>
+      <w:lvlJc w:val="left"/>
+      <w:pPr>
+        <w:tabs>
+          <w:tab w:val="num" w:pos="2160"/>
+        </w:tabs>
+        <w:ind w:left="2160" w:hanging="360"/>
+      </w:pPr>
+      <w:rPr>
+        <w:rFonts w:ascii="Wingdings" w:hAnsi="Wingdings" w:hint="default"/>
+        <w:sz w:val="20"/>
+      </w:rPr>
+    </w:lvl>
+    <w:lvl w:ilvl="3" w:tentative="1">
+      <w:start w:val="1"/>
+      <w:numFmt w:val="bullet"/>
+      <w:lvlText w:val=""/>
+      <w:lvlJc w:val="left"/>
+      <w:pPr>
+        <w:tabs>
+          <w:tab w:val="num" w:pos="2880"/>
+        </w:tabs>
+        <w:ind w:left="2880" w:hanging="360"/>
+      </w:pPr>
+      <w:rPr>
+        <w:rFonts w:ascii="Wingdings" w:hAnsi="Wingdings" w:hint="default"/>
+        <w:sz w:val="20"/>
+      </w:rPr>
+    </w:lvl>
+    <w:lvl w:ilvl="4" w:tentative="1">
+      <w:start w:val="1"/>
+      <w:numFmt w:val="bullet"/>
+      <w:lvlText w:val=""/>
+      <w:lvlJc w:val="left"/>
+      <w:pPr>
+        <w:tabs>
+          <w:tab w:val="num" w:pos="3600"/>
+        </w:tabs>
+        <w:ind w:left="3600" w:hanging="360"/>
+      </w:pPr>
+      <w:rPr>
+        <w:rFonts w:ascii="Wingdings" w:hAnsi="Wingdings" w:hint="default"/>
+        <w:sz w:val="20"/>
+      </w:rPr>
+    </w:lvl>
+    <w:lvl w:ilvl="5" w:tentative="1">
+      <w:start w:val="1"/>
+      <w:numFmt w:val="bullet"/>
+      <w:lvlText w:val=""/>
+      <w:lvlJc w:val="left"/>
+      <w:pPr>
+        <w:tabs>
+          <w:tab w:val="num" w:pos="4320"/>
+        </w:tabs>
+        <w:ind w:left="4320" w:hanging="360"/>
+      </w:pPr>
+      <w:rPr>
+        <w:rFonts w:ascii="Wingdings" w:hAnsi="Wingdings" w:hint="default"/>
+        <w:sz w:val="20"/>
+      </w:rPr>
+    </w:lvl>
+    <w:lvl w:ilvl="6" w:tentative="1">
+      <w:start w:val="1"/>
+      <w:numFmt w:val="bullet"/>
+      <w:lvlText w:val=""/>
+      <w:lvlJc w:val="left"/>
+      <w:pPr>
+        <w:tabs>
+          <w:tab w:val="num" w:pos="5040"/>
+        </w:tabs>
+        <w:ind w:left="5040" w:hanging="360"/>
+      </w:pPr>
+      <w:rPr>
+        <w:rFonts w:ascii="Wingdings" w:hAnsi="Wingdings" w:hint="default"/>
+        <w:sz w:val="20"/>
+      </w:rPr>
+    </w:lvl>
+    <w:lvl w:ilvl="7" w:tentative="1">
+      <w:start w:val="1"/>
+      <w:numFmt w:val="bullet"/>
+      <w:lvlText w:val=""/>
+      <w:lvlJc w:val="left"/>
+      <w:pPr>
+        <w:tabs>
+          <w:tab w:val="num" w:pos="5760"/>
+        </w:tabs>
+        <w:ind w:left="5760" w:hanging="360"/>
+      </w:pPr>
+      <w:rPr>
+        <w:rFonts w:ascii="Wingdings" w:hAnsi="Wingdings" w:hint="default"/>
+        <w:sz w:val="20"/>
+      </w:rPr>
+    </w:lvl>
+    <w:lvl w:ilvl="8" w:tentative="1">
+      <w:start w:val="1"/>
+      <w:numFmt w:val="bullet"/>
+      <w:lvlText w:val=""/>
+      <w:lvlJc w:val="left"/>
+      <w:pPr>
+        <w:tabs>
+          <w:tab w:val="num" w:pos="6480"/>
+        </w:tabs>
+        <w:ind w:left="6480" w:hanging="360"/>
+      </w:pPr>
+      <w:rPr>
+        <w:rFonts w:ascii="Wingdings" w:hAnsi="Wingdings" w:hint="default"/>
+        <w:sz w:val="20"/>
+      </w:rPr>
+    </w:lvl>
+  </w:abstractNum>
+  <w:abstractNum w:abstractNumId="3" w15:restartNumberingAfterBreak="0">
+    <w:nsid w:val="2B5B022A"/>
+    <w:multiLevelType w:val="multilevel"/>
+    <w:tmpl w:val="4724A382"/>
+    <w:lvl w:ilvl="0">
+      <w:start w:val="1"/>
+      <w:numFmt w:val="bullet"/>
+      <w:lvlText w:val=""/>
+      <w:lvlJc w:val="left"/>
+      <w:pPr>
+        <w:tabs>
+          <w:tab w:val="num" w:pos="720"/>
+        </w:tabs>
+        <w:ind w:left="720" w:hanging="360"/>
+      </w:pPr>
+      <w:rPr>
+        <w:rFonts w:ascii="Symbol" w:hAnsi="Symbol" w:hint="default"/>
+        <w:sz w:val="20"/>
+      </w:rPr>
+    </w:lvl>
+    <w:lvl w:ilvl="1" w:tentative="1">
+      <w:start w:val="1"/>
+      <w:numFmt w:val="bullet"/>
+      <w:lvlText w:val="o"/>
+      <w:lvlJc w:val="left"/>
+      <w:pPr>
+        <w:tabs>
+          <w:tab w:val="num" w:pos="1440"/>
+        </w:tabs>
+        <w:ind w:left="1440" w:hanging="360"/>
+      </w:pPr>
+      <w:rPr>
+        <w:rFonts w:ascii="Courier New" w:hAnsi="Courier New" w:hint="default"/>
+        <w:sz w:val="20"/>
+      </w:rPr>
+    </w:lvl>
+    <w:lvl w:ilvl="2" w:tentative="1">
+      <w:start w:val="1"/>
+      <w:numFmt w:val="bullet"/>
+      <w:lvlText w:val=""/>
+      <w:lvlJc w:val="left"/>
+      <w:pPr>
+        <w:tabs>
+          <w:tab w:val="num" w:pos="2160"/>
+        </w:tabs>
+        <w:ind w:left="2160" w:hanging="360"/>
+      </w:pPr>
+      <w:rPr>
+        <w:rFonts w:ascii="Wingdings" w:hAnsi="Wingdings" w:hint="default"/>
+        <w:sz w:val="20"/>
+      </w:rPr>
+    </w:lvl>
+    <w:lvl w:ilvl="3" w:tentative="1">
+      <w:start w:val="1"/>
+      <w:numFmt w:val="bullet"/>
+      <w:lvlText w:val=""/>
+      <w:lvlJc w:val="left"/>
+      <w:pPr>
+        <w:tabs>
+          <w:tab w:val="num" w:pos="2880"/>
+        </w:tabs>
+        <w:ind w:left="2880" w:hanging="360"/>
+      </w:pPr>
+      <w:rPr>
+        <w:rFonts w:ascii="Wingdings" w:hAnsi="Wingdings" w:hint="default"/>
+        <w:sz w:val="20"/>
+      </w:rPr>
+    </w:lvl>
+    <w:lvl w:ilvl="4" w:tentative="1">
+      <w:start w:val="1"/>
+      <w:numFmt w:val="bullet"/>
+      <w:lvlText w:val=""/>
+      <w:lvlJc w:val="left"/>
+      <w:pPr>
+        <w:tabs>
+          <w:tab w:val="num" w:pos="3600"/>
+        </w:tabs>
+        <w:ind w:left="3600" w:hanging="360"/>
+      </w:pPr>
+      <w:rPr>
+        <w:rFonts w:ascii="Wingdings" w:hAnsi="Wingdings" w:hint="default"/>
+        <w:sz w:val="20"/>
+      </w:rPr>
+    </w:lvl>
+    <w:lvl w:ilvl="5" w:tentative="1">
+      <w:start w:val="1"/>
+      <w:numFmt w:val="bullet"/>
+      <w:lvlText w:val=""/>
+      <w:lvlJc w:val="left"/>
+      <w:pPr>
+        <w:tabs>
+          <w:tab w:val="num" w:pos="4320"/>
+        </w:tabs>
+        <w:ind w:left="4320" w:hanging="360"/>
+      </w:pPr>
+      <w:rPr>
+        <w:rFonts w:ascii="Wingdings" w:hAnsi="Wingdings" w:hint="default"/>
+        <w:sz w:val="20"/>
+      </w:rPr>
+    </w:lvl>
+    <w:lvl w:ilvl="6" w:tentative="1">
+      <w:start w:val="1"/>
+      <w:numFmt w:val="bullet"/>
+      <w:lvlText w:val=""/>
+      <w:lvlJc w:val="left"/>
+      <w:pPr>
+        <w:tabs>
+          <w:tab w:val="num" w:pos="5040"/>
+        </w:tabs>
+        <w:ind w:left="5040" w:hanging="360"/>
+      </w:pPr>
+      <w:rPr>
+        <w:rFonts w:ascii="Wingdings" w:hAnsi="Wingdings" w:hint="default"/>
+        <w:sz w:val="20"/>
+      </w:rPr>
+    </w:lvl>
+    <w:lvl w:ilvl="7" w:tentative="1">
+      <w:start w:val="1"/>
+      <w:numFmt w:val="bullet"/>
+      <w:lvlText w:val=""/>
+      <w:lvlJc w:val="left"/>
+      <w:pPr>
+        <w:tabs>
+          <w:tab w:val="num" w:pos="5760"/>
+        </w:tabs>
+        <w:ind w:left="5760" w:hanging="360"/>
+      </w:pPr>
+      <w:rPr>
+        <w:rFonts w:ascii="Wingdings" w:hAnsi="Wingdings" w:hint="default"/>
+        <w:sz w:val="20"/>
+      </w:rPr>
+    </w:lvl>
+    <w:lvl w:ilvl="8" w:tentative="1">
+      <w:start w:val="1"/>
+      <w:numFmt w:val="bullet"/>
+      <w:lvlText w:val=""/>
+      <w:lvlJc w:val="left"/>
+      <w:pPr>
+        <w:tabs>
+          <w:tab w:val="num" w:pos="6480"/>
+        </w:tabs>
+        <w:ind w:left="6480" w:hanging="360"/>
+      </w:pPr>
+      <w:rPr>
+        <w:rFonts w:ascii="Wingdings" w:hAnsi="Wingdings" w:hint="default"/>
+        <w:sz w:val="20"/>
+      </w:rPr>
+    </w:lvl>
+  </w:abstractNum>
+  <w:abstractNum w:abstractNumId="4" w15:restartNumberingAfterBreak="0">
+    <w:nsid w:val="2BFB72AE"/>
+    <w:multiLevelType w:val="multilevel"/>
+    <w:tmpl w:val="C0F2B846"/>
+    <w:lvl w:ilvl="0">
+      <w:start w:val="1"/>
+      <w:numFmt w:val="bullet"/>
+      <w:lvlText w:val=""/>
+      <w:lvlJc w:val="left"/>
+      <w:pPr>
+        <w:tabs>
+          <w:tab w:val="num" w:pos="720"/>
+        </w:tabs>
+        <w:ind w:left="720" w:hanging="360"/>
+      </w:pPr>
+      <w:rPr>
+        <w:rFonts w:ascii="Symbol" w:hAnsi="Symbol" w:hint="default"/>
+        <w:sz w:val="20"/>
+      </w:rPr>
+    </w:lvl>
+    <w:lvl w:ilvl="1" w:tentative="1">
+      <w:start w:val="1"/>
+      <w:numFmt w:val="bullet"/>
+      <w:lvlText w:val="o"/>
+      <w:lvlJc w:val="left"/>
+      <w:pPr>
+        <w:tabs>
+          <w:tab w:val="num" w:pos="1440"/>
+        </w:tabs>
+        <w:ind w:left="1440" w:hanging="360"/>
+      </w:pPr>
+      <w:rPr>
+        <w:rFonts w:ascii="Courier New" w:hAnsi="Courier New" w:hint="default"/>
+        <w:sz w:val="20"/>
+      </w:rPr>
+    </w:lvl>
+    <w:lvl w:ilvl="2" w:tentative="1">
+      <w:start w:val="1"/>
+      <w:numFmt w:val="bullet"/>
+      <w:lvlText w:val=""/>
+      <w:lvlJc w:val="left"/>
+      <w:pPr>
+        <w:tabs>
+          <w:tab w:val="num" w:pos="2160"/>
+        </w:tabs>
+        <w:ind w:left="2160" w:hanging="360"/>
+      </w:pPr>
+      <w:rPr>
+        <w:rFonts w:ascii="Wingdings" w:hAnsi="Wingdings" w:hint="default"/>
+        <w:sz w:val="20"/>
+      </w:rPr>
+    </w:lvl>
+    <w:lvl w:ilvl="3" w:tentative="1">
+      <w:start w:val="1"/>
+      <w:numFmt w:val="bullet"/>
+      <w:lvlText w:val=""/>
+      <w:lvlJc w:val="left"/>
+      <w:pPr>
+        <w:tabs>
+          <w:tab w:val="num" w:pos="2880"/>
+        </w:tabs>
+        <w:ind w:left="2880" w:hanging="360"/>
+      </w:pPr>
+      <w:rPr>
+        <w:rFonts w:ascii="Wingdings" w:hAnsi="Wingdings" w:hint="default"/>
+        <w:sz w:val="20"/>
+      </w:rPr>
+    </w:lvl>
+    <w:lvl w:ilvl="4" w:tentative="1">
+      <w:start w:val="1"/>
+      <w:numFmt w:val="bullet"/>
+      <w:lvlText w:val=""/>
+      <w:lvlJc w:val="left"/>
+      <w:pPr>
+        <w:tabs>
+          <w:tab w:val="num" w:pos="3600"/>
+        </w:tabs>
+        <w:ind w:left="3600" w:hanging="360"/>
+      </w:pPr>
+      <w:rPr>
+        <w:rFonts w:ascii="Wingdings" w:hAnsi="Wingdings" w:hint="default"/>
+        <w:sz w:val="20"/>
+      </w:rPr>
+    </w:lvl>
+    <w:lvl w:ilvl="5" w:tentative="1">
+      <w:start w:val="1"/>
+      <w:numFmt w:val="bullet"/>
+      <w:lvlText w:val=""/>
+      <w:lvlJc w:val="left"/>
+      <w:pPr>
+        <w:tabs>
+          <w:tab w:val="num" w:pos="4320"/>
+        </w:tabs>
+        <w:ind w:left="4320" w:hanging="360"/>
+      </w:pPr>
+      <w:rPr>
+        <w:rFonts w:ascii="Wingdings" w:hAnsi="Wingdings" w:hint="default"/>
+        <w:sz w:val="20"/>
+      </w:rPr>
+    </w:lvl>
+    <w:lvl w:ilvl="6" w:tentative="1">
+      <w:start w:val="1"/>
+      <w:numFmt w:val="bullet"/>
+      <w:lvlText w:val=""/>
+      <w:lvlJc w:val="left"/>
+      <w:pPr>
+        <w:tabs>
+          <w:tab w:val="num" w:pos="5040"/>
+        </w:tabs>
+        <w:ind w:left="5040" w:hanging="360"/>
+      </w:pPr>
+      <w:rPr>
+        <w:rFonts w:ascii="Wingdings" w:hAnsi="Wingdings" w:hint="default"/>
+        <w:sz w:val="20"/>
+      </w:rPr>
+    </w:lvl>
+    <w:lvl w:ilvl="7" w:tentative="1">
+      <w:start w:val="1"/>
+      <w:numFmt w:val="bullet"/>
+      <w:lvlText w:val=""/>
+      <w:lvlJc w:val="left"/>
+      <w:pPr>
+        <w:tabs>
+          <w:tab w:val="num" w:pos="5760"/>
+        </w:tabs>
+        <w:ind w:left="5760" w:hanging="360"/>
+      </w:pPr>
+      <w:rPr>
+        <w:rFonts w:ascii="Wingdings" w:hAnsi="Wingdings" w:hint="default"/>
+        <w:sz w:val="20"/>
+      </w:rPr>
+    </w:lvl>
+    <w:lvl w:ilvl="8" w:tentative="1">
+      <w:start w:val="1"/>
+      <w:numFmt w:val="bullet"/>
+      <w:lvlText w:val=""/>
+      <w:lvlJc w:val="left"/>
+      <w:pPr>
+        <w:tabs>
+          <w:tab w:val="num" w:pos="6480"/>
+        </w:tabs>
+        <w:ind w:left="6480" w:hanging="360"/>
+      </w:pPr>
+      <w:rPr>
+        <w:rFonts w:ascii="Wingdings" w:hAnsi="Wingdings" w:hint="default"/>
+        <w:sz w:val="20"/>
+      </w:rPr>
+    </w:lvl>
+  </w:abstractNum>
+  <w:abstractNum w:abstractNumId="5" w15:restartNumberingAfterBreak="0">
+    <w:nsid w:val="321B7521"/>
+    <w:multiLevelType w:val="multilevel"/>
+    <w:tmpl w:val="6B04029A"/>
+    <w:lvl w:ilvl="0">
+      <w:start w:val="1"/>
+      <w:numFmt w:val="bullet"/>
+      <w:lvlText w:val=""/>
+      <w:lvlJc w:val="left"/>
+      <w:pPr>
+        <w:tabs>
+          <w:tab w:val="num" w:pos="720"/>
+        </w:tabs>
+        <w:ind w:left="720" w:hanging="360"/>
+      </w:pPr>
+      <w:rPr>
+        <w:rFonts w:ascii="Symbol" w:hAnsi="Symbol" w:hint="default"/>
+        <w:sz w:val="20"/>
+      </w:rPr>
+    </w:lvl>
+    <w:lvl w:ilvl="1" w:tentative="1">
+      <w:start w:val="1"/>
+      <w:numFmt w:val="bullet"/>
+      <w:lvlText w:val="o"/>
+      <w:lvlJc w:val="left"/>
+      <w:pPr>
+        <w:tabs>
+          <w:tab w:val="num" w:pos="1440"/>
+        </w:tabs>
+        <w:ind w:left="1440" w:hanging="360"/>
+      </w:pPr>
+      <w:rPr>
+        <w:rFonts w:ascii="Courier New" w:hAnsi="Courier New" w:hint="default"/>
+        <w:sz w:val="20"/>
+      </w:rPr>
+    </w:lvl>
+    <w:lvl w:ilvl="2" w:tentative="1">
+      <w:start w:val="1"/>
+      <w:numFmt w:val="bullet"/>
+      <w:lvlText w:val=""/>
+      <w:lvlJc w:val="left"/>
+      <w:pPr>
+        <w:tabs>
+          <w:tab w:val="num" w:pos="2160"/>
+        </w:tabs>
+        <w:ind w:left="2160" w:hanging="360"/>
+      </w:pPr>
+      <w:rPr>
+        <w:rFonts w:ascii="Wingdings" w:hAnsi="Wingdings" w:hint="default"/>
+        <w:sz w:val="20"/>
+      </w:rPr>
+    </w:lvl>
+    <w:lvl w:ilvl="3" w:tentative="1">
+      <w:start w:val="1"/>
+      <w:numFmt w:val="bullet"/>
+      <w:lvlText w:val=""/>
+      <w:lvlJc w:val="left"/>
+      <w:pPr>
+        <w:tabs>
+          <w:tab w:val="num" w:pos="2880"/>
+        </w:tabs>
+        <w:ind w:left="2880" w:hanging="360"/>
+      </w:pPr>
+      <w:rPr>
+        <w:rFonts w:ascii="Wingdings" w:hAnsi="Wingdings" w:hint="default"/>
+        <w:sz w:val="20"/>
+      </w:rPr>
+    </w:lvl>
+    <w:lvl w:ilvl="4" w:tentative="1">
+      <w:start w:val="1"/>
+      <w:numFmt w:val="bullet"/>
+      <w:lvlText w:val=""/>
+      <w:lvlJc w:val="left"/>
+      <w:pPr>
+        <w:tabs>
+          <w:tab w:val="num" w:pos="3600"/>
+        </w:tabs>
+        <w:ind w:left="3600" w:hanging="360"/>
+      </w:pPr>
+      <w:rPr>
+        <w:rFonts w:ascii="Wingdings" w:hAnsi="Wingdings" w:hint="default"/>
+        <w:sz w:val="20"/>
+      </w:rPr>
+    </w:lvl>
+    <w:lvl w:ilvl="5" w:tentative="1">
+      <w:start w:val="1"/>
+      <w:numFmt w:val="bullet"/>
+      <w:lvlText w:val=""/>
+      <w:lvlJc w:val="left"/>
+      <w:pPr>
+        <w:tabs>
+          <w:tab w:val="num" w:pos="4320"/>
+        </w:tabs>
+        <w:ind w:left="4320" w:hanging="360"/>
+      </w:pPr>
+      <w:rPr>
+        <w:rFonts w:ascii="Wingdings" w:hAnsi="Wingdings" w:hint="default"/>
+        <w:sz w:val="20"/>
+      </w:rPr>
+    </w:lvl>
+    <w:lvl w:ilvl="6" w:tentative="1">
+      <w:start w:val="1"/>
+      <w:numFmt w:val="bullet"/>
+      <w:lvlText w:val=""/>
+      <w:lvlJc w:val="left"/>
+      <w:pPr>
+        <w:tabs>
+          <w:tab w:val="num" w:pos="5040"/>
+        </w:tabs>
+        <w:ind w:left="5040" w:hanging="360"/>
+      </w:pPr>
+      <w:rPr>
+        <w:rFonts w:ascii="Wingdings" w:hAnsi="Wingdings" w:hint="default"/>
+        <w:sz w:val="20"/>
+      </w:rPr>
+    </w:lvl>
+    <w:lvl w:ilvl="7" w:tentative="1">
+      <w:start w:val="1"/>
+      <w:numFmt w:val="bullet"/>
+      <w:lvlText w:val=""/>
+      <w:lvlJc w:val="left"/>
+      <w:pPr>
+        <w:tabs>
+          <w:tab w:val="num" w:pos="5760"/>
+        </w:tabs>
+        <w:ind w:left="5760" w:hanging="360"/>
+      </w:pPr>
+      <w:rPr>
+        <w:rFonts w:ascii="Wingdings" w:hAnsi="Wingdings" w:hint="default"/>
+        <w:sz w:val="20"/>
+      </w:rPr>
+    </w:lvl>
+    <w:lvl w:ilvl="8" w:tentative="1">
+      <w:start w:val="1"/>
+      <w:numFmt w:val="bullet"/>
+      <w:lvlText w:val=""/>
+      <w:lvlJc w:val="left"/>
+      <w:pPr>
+        <w:tabs>
+          <w:tab w:val="num" w:pos="6480"/>
+        </w:tabs>
+        <w:ind w:left="6480" w:hanging="360"/>
+      </w:pPr>
+      <w:rPr>
+        <w:rFonts w:ascii="Wingdings" w:hAnsi="Wingdings" w:hint="default"/>
+        <w:sz w:val="20"/>
+      </w:rPr>
+    </w:lvl>
+  </w:abstractNum>
+  <w:abstractNum w:abstractNumId="6" w15:restartNumberingAfterBreak="0">
+    <w:nsid w:val="35A37385"/>
+    <w:multiLevelType w:val="multilevel"/>
+    <w:tmpl w:val="1D06C9C2"/>
+    <w:lvl w:ilvl="0">
+      <w:start w:val="1"/>
+      <w:numFmt w:val="bullet"/>
+      <w:lvlText w:val=""/>
+      <w:lvlJc w:val="left"/>
+      <w:pPr>
+        <w:tabs>
+          <w:tab w:val="num" w:pos="720"/>
+        </w:tabs>
+        <w:ind w:left="720" w:hanging="360"/>
+      </w:pPr>
+      <w:rPr>
+        <w:rFonts w:ascii="Symbol" w:hAnsi="Symbol" w:hint="default"/>
+        <w:sz w:val="20"/>
+      </w:rPr>
+    </w:lvl>
+    <w:lvl w:ilvl="1" w:tentative="1">
+      <w:start w:val="1"/>
+      <w:numFmt w:val="bullet"/>
+      <w:lvlText w:val="o"/>
+      <w:lvlJc w:val="left"/>
+      <w:pPr>
+        <w:tabs>
+          <w:tab w:val="num" w:pos="1440"/>
+        </w:tabs>
+        <w:ind w:left="1440" w:hanging="360"/>
+      </w:pPr>
+      <w:rPr>
+        <w:rFonts w:ascii="Courier New" w:hAnsi="Courier New" w:hint="default"/>
+        <w:sz w:val="20"/>
+      </w:rPr>
+    </w:lvl>
+    <w:lvl w:ilvl="2" w:tentative="1">
+      <w:start w:val="1"/>
+      <w:numFmt w:val="bullet"/>
+      <w:lvlText w:val=""/>
+      <w:lvlJc w:val="left"/>
+      <w:pPr>
+        <w:tabs>
+          <w:tab w:val="num" w:pos="2160"/>
+        </w:tabs>
+        <w:ind w:left="2160" w:hanging="360"/>
+      </w:pPr>
+      <w:rPr>
+        <w:rFonts w:ascii="Wingdings" w:hAnsi="Wingdings" w:hint="default"/>
+        <w:sz w:val="20"/>
+      </w:rPr>
+    </w:lvl>
+    <w:lvl w:ilvl="3" w:tentative="1">
+      <w:start w:val="1"/>
+      <w:numFmt w:val="bullet"/>
+      <w:lvlText w:val=""/>
+      <w:lvlJc w:val="left"/>
+      <w:pPr>
+        <w:tabs>
+          <w:tab w:val="num" w:pos="2880"/>
+        </w:tabs>
+        <w:ind w:left="2880" w:hanging="360"/>
+      </w:pPr>
+      <w:rPr>
+        <w:rFonts w:ascii="Wingdings" w:hAnsi="Wingdings" w:hint="default"/>
+        <w:sz w:val="20"/>
+      </w:rPr>
+    </w:lvl>
+    <w:lvl w:ilvl="4" w:tentative="1">
+      <w:start w:val="1"/>
+      <w:numFmt w:val="bullet"/>
+      <w:lvlText w:val=""/>
+      <w:lvlJc w:val="left"/>
+      <w:pPr>
+        <w:tabs>
+          <w:tab w:val="num" w:pos="3600"/>
+        </w:tabs>
+        <w:ind w:left="3600" w:hanging="360"/>
+      </w:pPr>
+      <w:rPr>
+        <w:rFonts w:ascii="Wingdings" w:hAnsi="Wingdings" w:hint="default"/>
+        <w:sz w:val="20"/>
+      </w:rPr>
+    </w:lvl>
+    <w:lvl w:ilvl="5" w:tentative="1">
+      <w:start w:val="1"/>
+      <w:numFmt w:val="bullet"/>
+      <w:lvlText w:val=""/>
+      <w:lvlJc w:val="left"/>
+      <w:pPr>
+        <w:tabs>
+          <w:tab w:val="num" w:pos="4320"/>
+        </w:tabs>
+        <w:ind w:left="4320" w:hanging="360"/>
+      </w:pPr>
+      <w:rPr>
+        <w:rFonts w:ascii="Wingdings" w:hAnsi="Wingdings" w:hint="default"/>
+        <w:sz w:val="20"/>
+      </w:rPr>
+    </w:lvl>
+    <w:lvl w:ilvl="6" w:tentative="1">
+      <w:start w:val="1"/>
+      <w:numFmt w:val="bullet"/>
+      <w:lvlText w:val=""/>
+      <w:lvlJc w:val="left"/>
+      <w:pPr>
+        <w:tabs>
+          <w:tab w:val="num" w:pos="5040"/>
+        </w:tabs>
+        <w:ind w:left="5040" w:hanging="360"/>
+      </w:pPr>
+      <w:rPr>
+        <w:rFonts w:ascii="Wingdings" w:hAnsi="Wingdings" w:hint="default"/>
+        <w:sz w:val="20"/>
+      </w:rPr>
+    </w:lvl>
+    <w:lvl w:ilvl="7" w:tentative="1">
+      <w:start w:val="1"/>
+      <w:numFmt w:val="bullet"/>
+      <w:lvlText w:val=""/>
+      <w:lvlJc w:val="left"/>
+      <w:pPr>
+        <w:tabs>
+          <w:tab w:val="num" w:pos="5760"/>
+        </w:tabs>
+        <w:ind w:left="5760" w:hanging="360"/>
+      </w:pPr>
+      <w:rPr>
+        <w:rFonts w:ascii="Wingdings" w:hAnsi="Wingdings" w:hint="default"/>
+        <w:sz w:val="20"/>
+      </w:rPr>
+    </w:lvl>
+    <w:lvl w:ilvl="8" w:tentative="1">
+      <w:start w:val="1"/>
+      <w:numFmt w:val="bullet"/>
+      <w:lvlText w:val=""/>
+      <w:lvlJc w:val="left"/>
+      <w:pPr>
+        <w:tabs>
+          <w:tab w:val="num" w:pos="6480"/>
+        </w:tabs>
+        <w:ind w:left="6480" w:hanging="360"/>
+      </w:pPr>
+      <w:rPr>
+        <w:rFonts w:ascii="Wingdings" w:hAnsi="Wingdings" w:hint="default"/>
+        <w:sz w:val="20"/>
+      </w:rPr>
+    </w:lvl>
+  </w:abstractNum>
+  <w:abstractNum w:abstractNumId="7" w15:restartNumberingAfterBreak="0">
+    <w:nsid w:val="3CD617F3"/>
+    <w:multiLevelType w:val="multilevel"/>
+    <w:tmpl w:val="DA92952E"/>
+    <w:lvl w:ilvl="0">
+      <w:start w:val="1"/>
+      <w:numFmt w:val="bullet"/>
+      <w:lvlText w:val=""/>
+      <w:lvlJc w:val="left"/>
+      <w:pPr>
+        <w:tabs>
+          <w:tab w:val="num" w:pos="720"/>
+        </w:tabs>
+        <w:ind w:left="720" w:hanging="360"/>
+      </w:pPr>
+      <w:rPr>
+        <w:rFonts w:ascii="Symbol" w:hAnsi="Symbol" w:hint="default"/>
+        <w:sz w:val="20"/>
+      </w:rPr>
+    </w:lvl>
+    <w:lvl w:ilvl="1" w:tentative="1">
+      <w:start w:val="1"/>
+      <w:numFmt w:val="bullet"/>
+      <w:lvlText w:val="o"/>
+      <w:lvlJc w:val="left"/>
+      <w:pPr>
+        <w:tabs>
+          <w:tab w:val="num" w:pos="1440"/>
+        </w:tabs>
+        <w:ind w:left="1440" w:hanging="360"/>
+      </w:pPr>
+      <w:rPr>
+        <w:rFonts w:ascii="Courier New" w:hAnsi="Courier New" w:hint="default"/>
+        <w:sz w:val="20"/>
+      </w:rPr>
+    </w:lvl>
+    <w:lvl w:ilvl="2" w:tentative="1">
+      <w:start w:val="1"/>
+      <w:numFmt w:val="bullet"/>
+      <w:lvlText w:val=""/>
+      <w:lvlJc w:val="left"/>
+      <w:pPr>
+        <w:tabs>
+          <w:tab w:val="num" w:pos="2160"/>
+        </w:tabs>
+        <w:ind w:left="2160" w:hanging="360"/>
+      </w:pPr>
+      <w:rPr>
+        <w:rFonts w:ascii="Wingdings" w:hAnsi="Wingdings" w:hint="default"/>
+        <w:sz w:val="20"/>
+      </w:rPr>
+    </w:lvl>
+    <w:lvl w:ilvl="3" w:tentative="1">
+      <w:start w:val="1"/>
+      <w:numFmt w:val="bullet"/>
+      <w:lvlText w:val=""/>
+      <w:lvlJc w:val="left"/>
+      <w:pPr>
+        <w:tabs>
+          <w:tab w:val="num" w:pos="2880"/>
+        </w:tabs>
+        <w:ind w:left="2880" w:hanging="360"/>
+      </w:pPr>
+      <w:rPr>
+        <w:rFonts w:ascii="Wingdings" w:hAnsi="Wingdings" w:hint="default"/>
+        <w:sz w:val="20"/>
+      </w:rPr>
+    </w:lvl>
+    <w:lvl w:ilvl="4" w:tentative="1">
+      <w:start w:val="1"/>
+      <w:numFmt w:val="bullet"/>
+      <w:lvlText w:val=""/>
+      <w:lvlJc w:val="left"/>
+      <w:pPr>
+        <w:tabs>
+          <w:tab w:val="num" w:pos="3600"/>
+        </w:tabs>
+        <w:ind w:left="3600" w:hanging="360"/>
+      </w:pPr>
+      <w:rPr>
+        <w:rFonts w:ascii="Wingdings" w:hAnsi="Wingdings" w:hint="default"/>
+        <w:sz w:val="20"/>
+      </w:rPr>
+    </w:lvl>
+    <w:lvl w:ilvl="5" w:tentative="1">
+      <w:start w:val="1"/>
+      <w:numFmt w:val="bullet"/>
+      <w:lvlText w:val=""/>
+      <w:lvlJc w:val="left"/>
+      <w:pPr>
+        <w:tabs>
+          <w:tab w:val="num" w:pos="4320"/>
+        </w:tabs>
+        <w:ind w:left="4320" w:hanging="360"/>
+      </w:pPr>
+      <w:rPr>
+        <w:rFonts w:ascii="Wingdings" w:hAnsi="Wingdings" w:hint="default"/>
+        <w:sz w:val="20"/>
+      </w:rPr>
+    </w:lvl>
+    <w:lvl w:ilvl="6" w:tentative="1">
+      <w:start w:val="1"/>
+      <w:numFmt w:val="bullet"/>
+      <w:lvlText w:val=""/>
+      <w:lvlJc w:val="left"/>
+      <w:pPr>
+        <w:tabs>
+          <w:tab w:val="num" w:pos="5040"/>
+        </w:tabs>
+        <w:ind w:left="5040" w:hanging="360"/>
+      </w:pPr>
+      <w:rPr>
+        <w:rFonts w:ascii="Wingdings" w:hAnsi="Wingdings" w:hint="default"/>
+        <w:sz w:val="20"/>
+      </w:rPr>
+    </w:lvl>
+    <w:lvl w:ilvl="7" w:tentative="1">
+      <w:start w:val="1"/>
+      <w:numFmt w:val="bullet"/>
+      <w:lvlText w:val=""/>
+      <w:lvlJc w:val="left"/>
+      <w:pPr>
+        <w:tabs>
+          <w:tab w:val="num" w:pos="5760"/>
+        </w:tabs>
+        <w:ind w:left="5760" w:hanging="360"/>
+      </w:pPr>
+      <w:rPr>
+        <w:rFonts w:ascii="Wingdings" w:hAnsi="Wingdings" w:hint="default"/>
+        <w:sz w:val="20"/>
+      </w:rPr>
+    </w:lvl>
+    <w:lvl w:ilvl="8" w:tentative="1">
+      <w:start w:val="1"/>
+      <w:numFmt w:val="bullet"/>
+      <w:lvlText w:val=""/>
+      <w:lvlJc w:val="left"/>
+      <w:pPr>
+        <w:tabs>
+          <w:tab w:val="num" w:pos="6480"/>
+        </w:tabs>
+        <w:ind w:left="6480" w:hanging="360"/>
+      </w:pPr>
+      <w:rPr>
+        <w:rFonts w:ascii="Wingdings" w:hAnsi="Wingdings" w:hint="default"/>
+        <w:sz w:val="20"/>
+      </w:rPr>
+    </w:lvl>
+  </w:abstractNum>
+  <w:abstractNum w:abstractNumId="8" w15:restartNumberingAfterBreak="0">
     <w:nsid w:val="40E42E62"/>
     <w:multiLevelType w:val="hybridMultilevel"/>
     <w:tmpl w:val="5A2804D4"/>
@@ -506,7 +2654,454 @@
       </w:rPr>
     </w:lvl>
   </w:abstractNum>
-  <w:abstractNum w:abstractNumId="1" w15:restartNumberingAfterBreak="0">
+  <w:abstractNum w:abstractNumId="9" w15:restartNumberingAfterBreak="0">
+    <w:nsid w:val="5D500BE8"/>
+    <w:multiLevelType w:val="multilevel"/>
+    <w:tmpl w:val="D3281B2A"/>
+    <w:lvl w:ilvl="0">
+      <w:start w:val="1"/>
+      <w:numFmt w:val="bullet"/>
+      <w:lvlText w:val=""/>
+      <w:lvlJc w:val="left"/>
+      <w:pPr>
+        <w:tabs>
+          <w:tab w:val="num" w:pos="720"/>
+        </w:tabs>
+        <w:ind w:left="720" w:hanging="360"/>
+      </w:pPr>
+      <w:rPr>
+        <w:rFonts w:ascii="Symbol" w:hAnsi="Symbol" w:hint="default"/>
+        <w:sz w:val="20"/>
+      </w:rPr>
+    </w:lvl>
+    <w:lvl w:ilvl="1" w:tentative="1">
+      <w:start w:val="1"/>
+      <w:numFmt w:val="bullet"/>
+      <w:lvlText w:val="o"/>
+      <w:lvlJc w:val="left"/>
+      <w:pPr>
+        <w:tabs>
+          <w:tab w:val="num" w:pos="1440"/>
+        </w:tabs>
+        <w:ind w:left="1440" w:hanging="360"/>
+      </w:pPr>
+      <w:rPr>
+        <w:rFonts w:ascii="Courier New" w:hAnsi="Courier New" w:hint="default"/>
+        <w:sz w:val="20"/>
+      </w:rPr>
+    </w:lvl>
+    <w:lvl w:ilvl="2" w:tentative="1">
+      <w:start w:val="1"/>
+      <w:numFmt w:val="bullet"/>
+      <w:lvlText w:val=""/>
+      <w:lvlJc w:val="left"/>
+      <w:pPr>
+        <w:tabs>
+          <w:tab w:val="num" w:pos="2160"/>
+        </w:tabs>
+        <w:ind w:left="2160" w:hanging="360"/>
+      </w:pPr>
+      <w:rPr>
+        <w:rFonts w:ascii="Wingdings" w:hAnsi="Wingdings" w:hint="default"/>
+        <w:sz w:val="20"/>
+      </w:rPr>
+    </w:lvl>
+    <w:lvl w:ilvl="3" w:tentative="1">
+      <w:start w:val="1"/>
+      <w:numFmt w:val="bullet"/>
+      <w:lvlText w:val=""/>
+      <w:lvlJc w:val="left"/>
+      <w:pPr>
+        <w:tabs>
+          <w:tab w:val="num" w:pos="2880"/>
+        </w:tabs>
+        <w:ind w:left="2880" w:hanging="360"/>
+      </w:pPr>
+      <w:rPr>
+        <w:rFonts w:ascii="Wingdings" w:hAnsi="Wingdings" w:hint="default"/>
+        <w:sz w:val="20"/>
+      </w:rPr>
+    </w:lvl>
+    <w:lvl w:ilvl="4" w:tentative="1">
+      <w:start w:val="1"/>
+      <w:numFmt w:val="bullet"/>
+      <w:lvlText w:val=""/>
+      <w:lvlJc w:val="left"/>
+      <w:pPr>
+        <w:tabs>
+          <w:tab w:val="num" w:pos="3600"/>
+        </w:tabs>
+        <w:ind w:left="3600" w:hanging="360"/>
+      </w:pPr>
+      <w:rPr>
+        <w:rFonts w:ascii="Wingdings" w:hAnsi="Wingdings" w:hint="default"/>
+        <w:sz w:val="20"/>
+      </w:rPr>
+    </w:lvl>
+    <w:lvl w:ilvl="5" w:tentative="1">
+      <w:start w:val="1"/>
+      <w:numFmt w:val="bullet"/>
+      <w:lvlText w:val=""/>
+      <w:lvlJc w:val="left"/>
+      <w:pPr>
+        <w:tabs>
+          <w:tab w:val="num" w:pos="4320"/>
+        </w:tabs>
+        <w:ind w:left="4320" w:hanging="360"/>
+      </w:pPr>
+      <w:rPr>
+        <w:rFonts w:ascii="Wingdings" w:hAnsi="Wingdings" w:hint="default"/>
+        <w:sz w:val="20"/>
+      </w:rPr>
+    </w:lvl>
+    <w:lvl w:ilvl="6" w:tentative="1">
+      <w:start w:val="1"/>
+      <w:numFmt w:val="bullet"/>
+      <w:lvlText w:val=""/>
+      <w:lvlJc w:val="left"/>
+      <w:pPr>
+        <w:tabs>
+          <w:tab w:val="num" w:pos="5040"/>
+        </w:tabs>
+        <w:ind w:left="5040" w:hanging="360"/>
+      </w:pPr>
+      <w:rPr>
+        <w:rFonts w:ascii="Wingdings" w:hAnsi="Wingdings" w:hint="default"/>
+        <w:sz w:val="20"/>
+      </w:rPr>
+    </w:lvl>
+    <w:lvl w:ilvl="7" w:tentative="1">
+      <w:start w:val="1"/>
+      <w:numFmt w:val="bullet"/>
+      <w:lvlText w:val=""/>
+      <w:lvlJc w:val="left"/>
+      <w:pPr>
+        <w:tabs>
+          <w:tab w:val="num" w:pos="5760"/>
+        </w:tabs>
+        <w:ind w:left="5760" w:hanging="360"/>
+      </w:pPr>
+      <w:rPr>
+        <w:rFonts w:ascii="Wingdings" w:hAnsi="Wingdings" w:hint="default"/>
+        <w:sz w:val="20"/>
+      </w:rPr>
+    </w:lvl>
+    <w:lvl w:ilvl="8" w:tentative="1">
+      <w:start w:val="1"/>
+      <w:numFmt w:val="bullet"/>
+      <w:lvlText w:val=""/>
+      <w:lvlJc w:val="left"/>
+      <w:pPr>
+        <w:tabs>
+          <w:tab w:val="num" w:pos="6480"/>
+        </w:tabs>
+        <w:ind w:left="6480" w:hanging="360"/>
+      </w:pPr>
+      <w:rPr>
+        <w:rFonts w:ascii="Wingdings" w:hAnsi="Wingdings" w:hint="default"/>
+        <w:sz w:val="20"/>
+      </w:rPr>
+    </w:lvl>
+  </w:abstractNum>
+  <w:abstractNum w:abstractNumId="10" w15:restartNumberingAfterBreak="0">
+    <w:nsid w:val="5F824454"/>
+    <w:multiLevelType w:val="multilevel"/>
+    <w:tmpl w:val="40A0BEE2"/>
+    <w:lvl w:ilvl="0">
+      <w:start w:val="1"/>
+      <w:numFmt w:val="bullet"/>
+      <w:lvlText w:val=""/>
+      <w:lvlJc w:val="left"/>
+      <w:pPr>
+        <w:tabs>
+          <w:tab w:val="num" w:pos="720"/>
+        </w:tabs>
+        <w:ind w:left="720" w:hanging="360"/>
+      </w:pPr>
+      <w:rPr>
+        <w:rFonts w:ascii="Symbol" w:hAnsi="Symbol" w:hint="default"/>
+        <w:sz w:val="20"/>
+      </w:rPr>
+    </w:lvl>
+    <w:lvl w:ilvl="1" w:tentative="1">
+      <w:start w:val="1"/>
+      <w:numFmt w:val="bullet"/>
+      <w:lvlText w:val="o"/>
+      <w:lvlJc w:val="left"/>
+      <w:pPr>
+        <w:tabs>
+          <w:tab w:val="num" w:pos="1440"/>
+        </w:tabs>
+        <w:ind w:left="1440" w:hanging="360"/>
+      </w:pPr>
+      <w:rPr>
+        <w:rFonts w:ascii="Courier New" w:hAnsi="Courier New" w:hint="default"/>
+        <w:sz w:val="20"/>
+      </w:rPr>
+    </w:lvl>
+    <w:lvl w:ilvl="2" w:tentative="1">
+      <w:start w:val="1"/>
+      <w:numFmt w:val="bullet"/>
+      <w:lvlText w:val=""/>
+      <w:lvlJc w:val="left"/>
+      <w:pPr>
+        <w:tabs>
+          <w:tab w:val="num" w:pos="2160"/>
+        </w:tabs>
+        <w:ind w:left="2160" w:hanging="360"/>
+      </w:pPr>
+      <w:rPr>
+        <w:rFonts w:ascii="Wingdings" w:hAnsi="Wingdings" w:hint="default"/>
+        <w:sz w:val="20"/>
+      </w:rPr>
+    </w:lvl>
+    <w:lvl w:ilvl="3" w:tentative="1">
+      <w:start w:val="1"/>
+      <w:numFmt w:val="bullet"/>
+      <w:lvlText w:val=""/>
+      <w:lvlJc w:val="left"/>
+      <w:pPr>
+        <w:tabs>
+          <w:tab w:val="num" w:pos="2880"/>
+        </w:tabs>
+        <w:ind w:left="2880" w:hanging="360"/>
+      </w:pPr>
+      <w:rPr>
+        <w:rFonts w:ascii="Wingdings" w:hAnsi="Wingdings" w:hint="default"/>
+        <w:sz w:val="20"/>
+      </w:rPr>
+    </w:lvl>
+    <w:lvl w:ilvl="4" w:tentative="1">
+      <w:start w:val="1"/>
+      <w:numFmt w:val="bullet"/>
+      <w:lvlText w:val=""/>
+      <w:lvlJc w:val="left"/>
+      <w:pPr>
+        <w:tabs>
+          <w:tab w:val="num" w:pos="3600"/>
+        </w:tabs>
+        <w:ind w:left="3600" w:hanging="360"/>
+      </w:pPr>
+      <w:rPr>
+        <w:rFonts w:ascii="Wingdings" w:hAnsi="Wingdings" w:hint="default"/>
+        <w:sz w:val="20"/>
+      </w:rPr>
+    </w:lvl>
+    <w:lvl w:ilvl="5" w:tentative="1">
+      <w:start w:val="1"/>
+      <w:numFmt w:val="bullet"/>
+      <w:lvlText w:val=""/>
+      <w:lvlJc w:val="left"/>
+      <w:pPr>
+        <w:tabs>
+          <w:tab w:val="num" w:pos="4320"/>
+        </w:tabs>
+        <w:ind w:left="4320" w:hanging="360"/>
+      </w:pPr>
+      <w:rPr>
+        <w:rFonts w:ascii="Wingdings" w:hAnsi="Wingdings" w:hint="default"/>
+        <w:sz w:val="20"/>
+      </w:rPr>
+    </w:lvl>
+    <w:lvl w:ilvl="6" w:tentative="1">
+      <w:start w:val="1"/>
+      <w:numFmt w:val="bullet"/>
+      <w:lvlText w:val=""/>
+      <w:lvlJc w:val="left"/>
+      <w:pPr>
+        <w:tabs>
+          <w:tab w:val="num" w:pos="5040"/>
+        </w:tabs>
+        <w:ind w:left="5040" w:hanging="360"/>
+      </w:pPr>
+      <w:rPr>
+        <w:rFonts w:ascii="Wingdings" w:hAnsi="Wingdings" w:hint="default"/>
+        <w:sz w:val="20"/>
+      </w:rPr>
+    </w:lvl>
+    <w:lvl w:ilvl="7" w:tentative="1">
+      <w:start w:val="1"/>
+      <w:numFmt w:val="bullet"/>
+      <w:lvlText w:val=""/>
+      <w:lvlJc w:val="left"/>
+      <w:pPr>
+        <w:tabs>
+          <w:tab w:val="num" w:pos="5760"/>
+        </w:tabs>
+        <w:ind w:left="5760" w:hanging="360"/>
+      </w:pPr>
+      <w:rPr>
+        <w:rFonts w:ascii="Wingdings" w:hAnsi="Wingdings" w:hint="default"/>
+        <w:sz w:val="20"/>
+      </w:rPr>
+    </w:lvl>
+    <w:lvl w:ilvl="8" w:tentative="1">
+      <w:start w:val="1"/>
+      <w:numFmt w:val="bullet"/>
+      <w:lvlText w:val=""/>
+      <w:lvlJc w:val="left"/>
+      <w:pPr>
+        <w:tabs>
+          <w:tab w:val="num" w:pos="6480"/>
+        </w:tabs>
+        <w:ind w:left="6480" w:hanging="360"/>
+      </w:pPr>
+      <w:rPr>
+        <w:rFonts w:ascii="Wingdings" w:hAnsi="Wingdings" w:hint="default"/>
+        <w:sz w:val="20"/>
+      </w:rPr>
+    </w:lvl>
+  </w:abstractNum>
+  <w:abstractNum w:abstractNumId="11" w15:restartNumberingAfterBreak="0">
+    <w:nsid w:val="5FD36612"/>
+    <w:multiLevelType w:val="multilevel"/>
+    <w:tmpl w:val="F7704030"/>
+    <w:lvl w:ilvl="0">
+      <w:start w:val="1"/>
+      <w:numFmt w:val="bullet"/>
+      <w:lvlText w:val=""/>
+      <w:lvlJc w:val="left"/>
+      <w:pPr>
+        <w:tabs>
+          <w:tab w:val="num" w:pos="720"/>
+        </w:tabs>
+        <w:ind w:left="720" w:hanging="360"/>
+      </w:pPr>
+      <w:rPr>
+        <w:rFonts w:ascii="Symbol" w:hAnsi="Symbol" w:hint="default"/>
+        <w:sz w:val="20"/>
+      </w:rPr>
+    </w:lvl>
+    <w:lvl w:ilvl="1" w:tentative="1">
+      <w:start w:val="1"/>
+      <w:numFmt w:val="bullet"/>
+      <w:lvlText w:val="o"/>
+      <w:lvlJc w:val="left"/>
+      <w:pPr>
+        <w:tabs>
+          <w:tab w:val="num" w:pos="1440"/>
+        </w:tabs>
+        <w:ind w:left="1440" w:hanging="360"/>
+      </w:pPr>
+      <w:rPr>
+        <w:rFonts w:ascii="Courier New" w:hAnsi="Courier New" w:hint="default"/>
+        <w:sz w:val="20"/>
+      </w:rPr>
+    </w:lvl>
+    <w:lvl w:ilvl="2" w:tentative="1">
+      <w:start w:val="1"/>
+      <w:numFmt w:val="bullet"/>
+      <w:lvlText w:val=""/>
+      <w:lvlJc w:val="left"/>
+      <w:pPr>
+        <w:tabs>
+          <w:tab w:val="num" w:pos="2160"/>
+        </w:tabs>
+        <w:ind w:left="2160" w:hanging="360"/>
+      </w:pPr>
+      <w:rPr>
+        <w:rFonts w:ascii="Wingdings" w:hAnsi="Wingdings" w:hint="default"/>
+        <w:sz w:val="20"/>
+      </w:rPr>
+    </w:lvl>
+    <w:lvl w:ilvl="3" w:tentative="1">
+      <w:start w:val="1"/>
+      <w:numFmt w:val="bullet"/>
+      <w:lvlText w:val=""/>
+      <w:lvlJc w:val="left"/>
+      <w:pPr>
+        <w:tabs>
+          <w:tab w:val="num" w:pos="2880"/>
+        </w:tabs>
+        <w:ind w:left="2880" w:hanging="360"/>
+      </w:pPr>
+      <w:rPr>
+        <w:rFonts w:ascii="Wingdings" w:hAnsi="Wingdings" w:hint="default"/>
+        <w:sz w:val="20"/>
+      </w:rPr>
+    </w:lvl>
+    <w:lvl w:ilvl="4" w:tentative="1">
+      <w:start w:val="1"/>
+      <w:numFmt w:val="bullet"/>
+      <w:lvlText w:val=""/>
+      <w:lvlJc w:val="left"/>
+      <w:pPr>
+        <w:tabs>
+          <w:tab w:val="num" w:pos="3600"/>
+        </w:tabs>
+        <w:ind w:left="3600" w:hanging="360"/>
+      </w:pPr>
+      <w:rPr>
+        <w:rFonts w:ascii="Wingdings" w:hAnsi="Wingdings" w:hint="default"/>
+        <w:sz w:val="20"/>
+      </w:rPr>
+    </w:lvl>
+    <w:lvl w:ilvl="5" w:tentative="1">
+      <w:start w:val="1"/>
+      <w:numFmt w:val="bullet"/>
+      <w:lvlText w:val=""/>
+      <w:lvlJc w:val="left"/>
+      <w:pPr>
+        <w:tabs>
+          <w:tab w:val="num" w:pos="4320"/>
+        </w:tabs>
+        <w:ind w:left="4320" w:hanging="360"/>
+      </w:pPr>
+      <w:rPr>
+        <w:rFonts w:ascii="Wingdings" w:hAnsi="Wingdings" w:hint="default"/>
+        <w:sz w:val="20"/>
+      </w:rPr>
+    </w:lvl>
+    <w:lvl w:ilvl="6" w:tentative="1">
+      <w:start w:val="1"/>
+      <w:numFmt w:val="bullet"/>
+      <w:lvlText w:val=""/>
+      <w:lvlJc w:val="left"/>
+      <w:pPr>
+        <w:tabs>
+          <w:tab w:val="num" w:pos="5040"/>
+        </w:tabs>
+        <w:ind w:left="5040" w:hanging="360"/>
+      </w:pPr>
+      <w:rPr>
+        <w:rFonts w:ascii="Wingdings" w:hAnsi="Wingdings" w:hint="default"/>
+        <w:sz w:val="20"/>
+      </w:rPr>
+    </w:lvl>
+    <w:lvl w:ilvl="7" w:tentative="1">
+      <w:start w:val="1"/>
+      <w:numFmt w:val="bullet"/>
+      <w:lvlText w:val=""/>
+      <w:lvlJc w:val="left"/>
+      <w:pPr>
+        <w:tabs>
+          <w:tab w:val="num" w:pos="5760"/>
+        </w:tabs>
+        <w:ind w:left="5760" w:hanging="360"/>
+      </w:pPr>
+      <w:rPr>
+        <w:rFonts w:ascii="Wingdings" w:hAnsi="Wingdings" w:hint="default"/>
+        <w:sz w:val="20"/>
+      </w:rPr>
+    </w:lvl>
+    <w:lvl w:ilvl="8" w:tentative="1">
+      <w:start w:val="1"/>
+      <w:numFmt w:val="bullet"/>
+      <w:lvlText w:val=""/>
+      <w:lvlJc w:val="left"/>
+      <w:pPr>
+        <w:tabs>
+          <w:tab w:val="num" w:pos="6480"/>
+        </w:tabs>
+        <w:ind w:left="6480" w:hanging="360"/>
+      </w:pPr>
+      <w:rPr>
+        <w:rFonts w:ascii="Wingdings" w:hAnsi="Wingdings" w:hint="default"/>
+        <w:sz w:val="20"/>
+      </w:rPr>
+    </w:lvl>
+  </w:abstractNum>
+  <w:abstractNum w:abstractNumId="12" w15:restartNumberingAfterBreak="0">
     <w:nsid w:val="645D107A"/>
     <w:multiLevelType w:val="hybridMultilevel"/>
     <w:tmpl w:val="97D0B1B0"/>
@@ -619,7 +3214,7 @@
       </w:rPr>
     </w:lvl>
   </w:abstractNum>
-  <w:abstractNum w:abstractNumId="2" w15:restartNumberingAfterBreak="0">
+  <w:abstractNum w:abstractNumId="13" w15:restartNumberingAfterBreak="0">
     <w:nsid w:val="7BD9063B"/>
     <w:multiLevelType w:val="hybridMultilevel"/>
     <w:tmpl w:val="8AC4E370"/>
@@ -733,12 +3328,45 @@
     </w:lvl>
   </w:abstractNum>
   <w:num w:numId="1" w16cid:durableId="149906089">
+    <w:abstractNumId w:val="8"/>
+  </w:num>
+  <w:num w:numId="2" w16cid:durableId="1065299797">
+    <w:abstractNumId w:val="13"/>
+  </w:num>
+  <w:num w:numId="3" w16cid:durableId="938029151">
+    <w:abstractNumId w:val="12"/>
+  </w:num>
+  <w:num w:numId="4" w16cid:durableId="1331298900">
     <w:abstractNumId w:val="0"/>
   </w:num>
-  <w:num w:numId="2" w16cid:durableId="1065299797">
+  <w:num w:numId="5" w16cid:durableId="623341600">
+    <w:abstractNumId w:val="3"/>
+  </w:num>
+  <w:num w:numId="6" w16cid:durableId="1081414000">
+    <w:abstractNumId w:val="7"/>
+  </w:num>
+  <w:num w:numId="7" w16cid:durableId="365906303">
+    <w:abstractNumId w:val="5"/>
+  </w:num>
+  <w:num w:numId="8" w16cid:durableId="1584297232">
+    <w:abstractNumId w:val="11"/>
+  </w:num>
+  <w:num w:numId="9" w16cid:durableId="1492331197">
+    <w:abstractNumId w:val="6"/>
+  </w:num>
+  <w:num w:numId="10" w16cid:durableId="1104039219">
+    <w:abstractNumId w:val="9"/>
+  </w:num>
+  <w:num w:numId="11" w16cid:durableId="1168903982">
+    <w:abstractNumId w:val="10"/>
+  </w:num>
+  <w:num w:numId="12" w16cid:durableId="1952007713">
     <w:abstractNumId w:val="2"/>
   </w:num>
-  <w:num w:numId="3" w16cid:durableId="938029151">
+  <w:num w:numId="13" w16cid:durableId="1989938610">
+    <w:abstractNumId w:val="4"/>
+  </w:num>
+  <w:num w:numId="14" w16cid:durableId="1643535026">
     <w:abstractNumId w:val="1"/>
   </w:num>
 </w:numbering>

</xml_diff>

<commit_message>
Updated project documentation with Python and Pandas Translations
</commit_message>
<xml_diff>
--- a/documentation/nicosys-portfolio-ecom-project-documentation.docx
+++ b/documentation/nicosys-portfolio-ecom-project-documentation.docx
@@ -1,6 +1,6 @@
 
 <file path=word/document.xml><?xml version="1.0" encoding="utf-8"?>
-<w:document xmlns:wpc="http://schemas.microsoft.com/office/word/2010/wordprocessingCanvas" xmlns:cx="http://schemas.microsoft.com/office/drawing/2014/chartex" xmlns:cx1="http://schemas.microsoft.com/office/drawing/2015/9/8/chartex" xmlns:cx2="http://schemas.microsoft.com/office/drawing/2015/10/21/chartex" xmlns:cx3="http://schemas.microsoft.com/office/drawing/2016/5/9/chartex" xmlns:cx4="http://schemas.microsoft.com/office/drawing/2016/5/10/chartex" xmlns:cx5="http://schemas.microsoft.com/office/drawing/2016/5/11/chartex" xmlns:cx6="http://schemas.microsoft.com/office/drawing/2016/5/12/chartex" xmlns:cx7="http://schemas.microsoft.com/office/drawing/2016/5/13/chartex" xmlns:cx8="http://schemas.microsoft.com/office/drawing/2016/5/14/chartex" xmlns:mc="http://schemas.openxmlformats.org/markup-compatibility/2006" xmlns:aink="http://schemas.microsoft.com/office/drawing/2016/ink" xmlns:am3d="http://schemas.microsoft.com/office/drawing/2017/model3d" xmlns:o="urn:schemas-microsoft-com:office:office" xmlns:oel="http://schemas.microsoft.com/office/2019/extlst" xmlns:r="http://schemas.openxmlformats.org/officeDocument/2006/relationships" xmlns:m="http://schemas.openxmlformats.org/officeDocument/2006/math" xmlns:v="urn:schemas-microsoft-com:vml" xmlns:wp14="http://schemas.microsoft.com/office/word/2010/wordprocessingDrawing" xmlns:wp="http://schemas.openxmlformats.org/drawingml/2006/wordprocessingDrawing" xmlns:w10="urn:schemas-microsoft-com:office:word" xmlns:w="http://schemas.openxmlformats.org/wordprocessingml/2006/main" xmlns:w14="http://schemas.microsoft.com/office/word/2010/wordml" xmlns:w15="http://schemas.microsoft.com/office/word/2012/wordml" xmlns:w16cei="http://schemas.microsoft.com/office/word/2026/wordml/cei" xmlns:w16cex="http://schemas.microsoft.com/office/word/2018/wordml/cex" xmlns:w16cid="http://schemas.microsoft.com/office/word/2016/wordml/cid" xmlns:w16="http://schemas.microsoft.com/office/word/2018/wordml" xmlns:w16du="http://schemas.microsoft.com/office/word/2023/wordml/word16du" xmlns:w16sdtdh="http://schemas.microsoft.com/office/word/2020/wordml/sdtdatahash" xmlns:w16sdtfl="http://schemas.microsoft.com/office/word/2024/wordml/sdtformatlock" xmlns:w16se="http://schemas.microsoft.com/office/word/2015/wordml/symex" xmlns:wpg="http://schemas.microsoft.com/office/word/2010/wordprocessingGroup" xmlns:wpi="http://schemas.microsoft.com/office/word/2010/wordprocessingInk" xmlns:wne="http://schemas.microsoft.com/office/word/2006/wordml" xmlns:wps="http://schemas.microsoft.com/office/word/2010/wordprocessingShape" mc:Ignorable="w14 w15 w16se w16cid w16 w16cex w16sdtdh w16sdtfl w16du wp14">
+<w:document xmlns:wpc="http://schemas.microsoft.com/office/word/2010/wordprocessingCanvas" xmlns:cx="http://schemas.microsoft.com/office/drawing/2014/chartex" xmlns:cx1="http://schemas.microsoft.com/office/drawing/2015/9/8/chartex" xmlns:cx2="http://schemas.microsoft.com/office/drawing/2015/10/21/chartex" xmlns:cx3="http://schemas.microsoft.com/office/drawing/2016/5/9/chartex" xmlns:cx4="http://schemas.microsoft.com/office/drawing/2016/5/10/chartex" xmlns:cx5="http://schemas.microsoft.com/office/drawing/2016/5/11/chartex" xmlns:cx6="http://schemas.microsoft.com/office/drawing/2016/5/12/chartex" xmlns:cx7="http://schemas.microsoft.com/office/drawing/2016/5/13/chartex" xmlns:cx8="http://schemas.microsoft.com/office/drawing/2016/5/14/chartex" xmlns:mc="http://schemas.openxmlformats.org/markup-compatibility/2006" xmlns:aink="http://schemas.microsoft.com/office/drawing/2016/ink" xmlns:am3d="http://schemas.microsoft.com/office/drawing/2017/model3d" xmlns:o="urn:schemas-microsoft-com:office:office" xmlns:oel="http://schemas.microsoft.com/office/2019/extlst" xmlns:r="http://schemas.openxmlformats.org/officeDocument/2006/relationships" xmlns:m="http://schemas.openxmlformats.org/officeDocument/2006/math" xmlns:v="urn:schemas-microsoft-com:vml" xmlns:wp14="http://schemas.microsoft.com/office/word/2010/wordprocessingDrawing" xmlns:wp="http://schemas.openxmlformats.org/drawingml/2006/wordprocessingDrawing" xmlns:w10="urn:schemas-microsoft-com:office:word" xmlns:w="http://schemas.openxmlformats.org/wordprocessingml/2006/main" xmlns:w14="http://schemas.microsoft.com/office/word/2010/wordml" xmlns:w15="http://schemas.microsoft.com/office/word/2012/wordml" xmlns:w16cex="http://schemas.microsoft.com/office/word/2018/wordml/cex" xmlns:w16cid="http://schemas.microsoft.com/office/word/2016/wordml/cid" xmlns:w16="http://schemas.microsoft.com/office/word/2018/wordml" xmlns:w16du="http://schemas.microsoft.com/office/word/2023/wordml/word16du" xmlns:w16sdtdh="http://schemas.microsoft.com/office/word/2020/wordml/sdtdatahash" xmlns:w16sdtfl="http://schemas.microsoft.com/office/word/2024/wordml/sdtformatlock" xmlns:w16se="http://schemas.microsoft.com/office/word/2015/wordml/symex" xmlns:wpg="http://schemas.microsoft.com/office/word/2010/wordprocessingGroup" xmlns:wpi="http://schemas.microsoft.com/office/word/2010/wordprocessingInk" xmlns:wne="http://schemas.microsoft.com/office/word/2006/wordml" xmlns:wps="http://schemas.microsoft.com/office/word/2010/wordprocessingShape" mc:Ignorable="w14 w15 w16se w16cid w16 w16cex w16sdtdh w16sdtfl w16du wp14">
   <w:body>
     <w:p>
       <w:pPr>
@@ -27,6 +27,212 @@
         <w:rPr>
           <w:u w:val="single"/>
         </w:rPr>
+        <w:t>8/27/2026</w:t>
+      </w:r>
+    </w:p>
+    <w:p>
+      <w:r>
+        <w:t>Started Jupyter Notebook for SQL to Pandas translations</w:t>
+      </w:r>
+      <w:r>
+        <w:t>.</w:t>
+      </w:r>
+    </w:p>
+    <w:p>
+      <w:r>
+        <w:t>I’m learning how to filter using .isin like Where clause, and link multiple Group Bys</w:t>
+      </w:r>
+    </w:p>
+    <w:p>
+      <w:r>
+        <w:t>The two queries I’m validating are:</w:t>
+      </w:r>
+    </w:p>
+    <w:p>
+      <w:r>
+        <w:t xml:space="preserve">--Highest Sales by product from Top 3 Selling States </w:t>
+      </w:r>
+    </w:p>
+    <w:p>
+      <w:r>
+        <w:t xml:space="preserve">--Anime Mystery Box | Naruto Hoodie produce the highest sales from Texas, California, and Florida </w:t>
+      </w:r>
+      <w:r>
+        <w:br/>
+        <w:t>Select</w:t>
+      </w:r>
+      <w:r>
+        <w:br/>
+        <w:t> sum(ss.gross_sales) as total_sales_by_product</w:t>
+      </w:r>
+      <w:r>
+        <w:br/>
+        <w:t>, ss.state</w:t>
+      </w:r>
+      <w:r>
+        <w:br/>
+        <w:t>, ss.product_name</w:t>
+      </w:r>
+      <w:r>
+        <w:br/>
+      </w:r>
+      <w:r>
+        <w:br/>
+        <w:t>From</w:t>
+      </w:r>
+      <w:r>
+        <w:br/>
+        <w:t>squarespace_s ss</w:t>
+      </w:r>
+      <w:r>
+        <w:br/>
+      </w:r>
+      <w:r>
+        <w:br/>
+        <w:t>--Where</w:t>
+      </w:r>
+      <w:r>
+        <w:br/>
+        <w:t xml:space="preserve">-- product_name in ('Anime Mystery Box', 'Naruto Hoodie') </w:t>
+      </w:r>
+      <w:r>
+        <w:br/>
+      </w:r>
+      <w:r>
+        <w:br/>
+        <w:t>Group By</w:t>
+      </w:r>
+      <w:r>
+        <w:br/>
+        <w:t> ss.state</w:t>
+      </w:r>
+      <w:r>
+        <w:br/>
+        <w:t>, product_name</w:t>
+      </w:r>
+      <w:r>
+        <w:br/>
+      </w:r>
+      <w:r>
+        <w:br/>
+        <w:t>Having</w:t>
+      </w:r>
+      <w:r>
+        <w:br/>
+        <w:t>ss.state in ('Texas', 'California', 'Florida')</w:t>
+      </w:r>
+      <w:r>
+        <w:br/>
+      </w:r>
+      <w:r>
+        <w:br/>
+        <w:t>Order By</w:t>
+      </w:r>
+      <w:r>
+        <w:br/>
+        <w:t>total_sales_by_product desc</w:t>
+      </w:r>
+    </w:p>
+    <w:p>
+      <w:r>
+        <w:t>;</w:t>
+      </w:r>
+    </w:p>
+    <w:p/>
+    <w:p/>
+    <w:p/>
+    <w:p>
+      <w:r>
+        <w:lastRenderedPageBreak/>
+        <w:t>/*Daily Sales between TikTok Shop and Squarespace*/</w:t>
+      </w:r>
+      <w:r>
+        <w:br/>
+        <w:t>Select</w:t>
+      </w:r>
+      <w:r>
+        <w:br/>
+        <w:t> ss.order_date as order_date --Since Squarespace data has more days of year reported, will use date field to represent both shops</w:t>
+      </w:r>
+      <w:r>
+        <w:br/>
+        <w:t> , sum(ss.net_sales) as total_ss_sales</w:t>
+      </w:r>
+      <w:r>
+        <w:br/>
+        <w:t>--, tts.order_date as tt_order_date --commented out becuase we only need 1 date column to represent each store</w:t>
+      </w:r>
+      <w:r>
+        <w:br/>
+        <w:t>--, tt.total_sales as total_tt_sales --commented out due to null values</w:t>
+      </w:r>
+      <w:r>
+        <w:br/>
+        <w:t>, coalesce (tts.total_sales,0) as total_tts_sales_clean</w:t>
+      </w:r>
+      <w:r>
+        <w:br/>
+        <w:t>, sum(ss.net_sales)+(coalesce (tts.total_sales,0)) as total_sales_overall</w:t>
+      </w:r>
+      <w:r>
+        <w:br/>
+      </w:r>
+      <w:r>
+        <w:br/>
+        <w:t>From</w:t>
+      </w:r>
+      <w:r>
+        <w:br/>
+        <w:t>squarespace_s ss</w:t>
+      </w:r>
+      <w:r>
+        <w:br/>
+        <w:t>left join tiktok_s as tts</w:t>
+      </w:r>
+      <w:r>
+        <w:br/>
+        <w:t>on ss.order_date=tts.order_date</w:t>
+      </w:r>
+      <w:r>
+        <w:br/>
+        <w:t>Group By</w:t>
+      </w:r>
+      <w:r>
+        <w:br/>
+        <w:t> ss.order_date</w:t>
+      </w:r>
+      <w:r>
+        <w:br/>
+        <w:t>, tts.order_date</w:t>
+      </w:r>
+      <w:r>
+        <w:br/>
+        <w:t>, tts.total_sales</w:t>
+      </w:r>
+      <w:r>
+        <w:br/>
+        <w:t>Order By</w:t>
+      </w:r>
+      <w:r>
+        <w:br/>
+        <w:t>ss.order_date</w:t>
+      </w:r>
+      <w:r>
+        <w:br/>
+        <w:t>;</w:t>
+      </w:r>
+    </w:p>
+    <w:p/>
+    <w:p>
+      <w:pPr>
+        <w:rPr>
+          <w:u w:val="single"/>
+        </w:rPr>
+      </w:pPr>
+      <w:r>
+        <w:rPr>
+          <w:u w:val="single"/>
+        </w:rPr>
         <w:t>8/7/2026</w:t>
       </w:r>
     </w:p>
@@ -122,6 +328,7 @@
         </w:numPr>
       </w:pPr>
       <w:r>
+        <w:lastRenderedPageBreak/>
         <w:t>Impact</w:t>
       </w:r>
     </w:p>
@@ -270,7 +477,6 @@
     </w:p>
     <w:p>
       <w:r>
-        <w:lastRenderedPageBreak/>
         <w:t xml:space="preserve">Explain the </w:t>
       </w:r>
       <w:r>
@@ -387,6 +593,7 @@
           <w:b/>
           <w:bCs/>
         </w:rPr>
+        <w:lastRenderedPageBreak/>
         <w:t>5. Methodology</w:t>
       </w:r>
     </w:p>
@@ -545,7 +752,6 @@
     </w:p>
     <w:p>
       <w:r>
-        <w:lastRenderedPageBreak/>
         <w:t>One slide summarizing:</w:t>
       </w:r>
     </w:p>
@@ -654,6 +860,7 @@
         </w:numPr>
       </w:pPr>
       <w:r>
+        <w:lastRenderedPageBreak/>
         <w:t>GitHub</w:t>
       </w:r>
     </w:p>
@@ -713,15 +920,7 @@
     <w:p/>
     <w:p>
       <w:r>
-        <w:t xml:space="preserve">However, this seems out of order. Review this later and </w:t>
-      </w:r>
-      <w:proofErr w:type="gramStart"/>
-      <w:r>
-        <w:t>arrange</w:t>
-      </w:r>
-      <w:proofErr w:type="gramEnd"/>
-      <w:r>
-        <w:t xml:space="preserve"> in a way that makes more sense. </w:t>
+        <w:t xml:space="preserve">However, this seems out of order. Review this later and arrange in a way that makes more sense. </w:t>
       </w:r>
     </w:p>
     <w:p/>
@@ -785,204 +984,195 @@
         </w:numPr>
       </w:pPr>
       <w:r>
+        <w:t xml:space="preserve">SQL </w:t>
+      </w:r>
+    </w:p>
+    <w:p>
+      <w:pPr>
+        <w:pStyle w:val="ListParagraph"/>
+        <w:numPr>
+          <w:ilvl w:val="0"/>
+          <w:numId w:val="4"/>
+        </w:numPr>
+      </w:pPr>
+      <w:r>
+        <w:t>Exel</w:t>
+      </w:r>
+    </w:p>
+    <w:p>
+      <w:pPr>
+        <w:pStyle w:val="ListParagraph"/>
+        <w:numPr>
+          <w:ilvl w:val="0"/>
+          <w:numId w:val="4"/>
+        </w:numPr>
+      </w:pPr>
+      <w:r>
+        <w:t>Power BI</w:t>
+      </w:r>
+    </w:p>
+    <w:p>
+      <w:pPr>
+        <w:pStyle w:val="ListParagraph"/>
+        <w:numPr>
+          <w:ilvl w:val="0"/>
+          <w:numId w:val="4"/>
+        </w:numPr>
+      </w:pPr>
+    </w:p>
+    <w:p/>
+    <w:p>
+      <w:r>
+        <w:t>Slide 2 — Problem / Goal</w:t>
+      </w:r>
+    </w:p>
+    <w:p>
+      <w:r>
+        <w:t>What you set out to solve</w:t>
+      </w:r>
+    </w:p>
+    <w:p>
+      <w:r>
+        <w:t>I was tasked to provide insight on the top selling products and look for opportunities to increase sales. I also decided to look further into areas in the county where that made the most purchases.</w:t>
+      </w:r>
+    </w:p>
+    <w:p>
+      <w:r>
+        <w:t>Why it matters</w:t>
+      </w:r>
+    </w:p>
+    <w:p>
+      <w:r>
         <w:lastRenderedPageBreak/>
-        <w:t xml:space="preserve">SQL </w:t>
-      </w:r>
-    </w:p>
-    <w:p>
-      <w:pPr>
-        <w:pStyle w:val="ListParagraph"/>
-        <w:numPr>
-          <w:ilvl w:val="0"/>
-          <w:numId w:val="4"/>
-        </w:numPr>
-      </w:pPr>
-      <w:proofErr w:type="spellStart"/>
-      <w:r>
-        <w:t>Exel</w:t>
-      </w:r>
-      <w:proofErr w:type="spellEnd"/>
-    </w:p>
-    <w:p>
-      <w:pPr>
-        <w:pStyle w:val="ListParagraph"/>
-        <w:numPr>
-          <w:ilvl w:val="0"/>
-          <w:numId w:val="4"/>
-        </w:numPr>
-      </w:pPr>
-      <w:r>
-        <w:t>Power BI</w:t>
-      </w:r>
-    </w:p>
-    <w:p>
-      <w:pPr>
-        <w:pStyle w:val="ListParagraph"/>
-        <w:numPr>
-          <w:ilvl w:val="0"/>
-          <w:numId w:val="4"/>
-        </w:numPr>
-      </w:pPr>
+        <w:t xml:space="preserve">Over the past two years, the owner had noticed sales were going down, and it was growing more challenging to get views on social media. The owner believed that decreased sales were due to a lack of content creation and low visibility. </w:t>
+      </w:r>
+    </w:p>
+    <w:p>
+      <w:r>
+        <w:t xml:space="preserve">  </w:t>
+      </w:r>
+    </w:p>
+    <w:p>
+      <w:r>
+        <w:t>Slide 3 — Data &amp; Process</w:t>
+      </w:r>
+    </w:p>
+    <w:p>
+      <w:r>
+        <w:t>Data sources</w:t>
+      </w:r>
+    </w:p>
+    <w:p>
+      <w:r>
+        <w:t xml:space="preserve">From the business’s accounts, I exported .csv files from TikTok Shop and Squarespace. </w:t>
+      </w:r>
+      <w:r>
+        <w:t xml:space="preserve">TikTok only had gross and net sales data. However, Squarespace provided more information on product sales and customers. </w:t>
+      </w:r>
     </w:p>
     <w:p/>
     <w:p>
       <w:r>
-        <w:t>Slide 2 — Problem / Goal</w:t>
-      </w:r>
-    </w:p>
-    <w:p>
-      <w:r>
-        <w:t>What you set out to solve</w:t>
-      </w:r>
-    </w:p>
-    <w:p>
-      <w:r>
-        <w:t>I was tasked to provide insight on the top selling products and look for opportunities to increase sales. I also decided to look further into areas in the county where that made the most purchases.</w:t>
-      </w:r>
-    </w:p>
-    <w:p>
-      <w:r>
-        <w:t>Why it matters</w:t>
-      </w:r>
-    </w:p>
-    <w:p>
-      <w:r>
-        <w:t xml:space="preserve">Over the past two years, the owner had noticed sales were going down, and it was growing more challenging to get views on social media. The owner believed that decreased sales were due to a lack of content creation and low visibility. </w:t>
-      </w:r>
-    </w:p>
-    <w:p>
-      <w:r>
-        <w:t xml:space="preserve">  </w:t>
-      </w:r>
-    </w:p>
-    <w:p>
-      <w:r>
-        <w:t>Slide 3 — Data &amp; Process</w:t>
-      </w:r>
-    </w:p>
-    <w:p>
-      <w:r>
-        <w:t>Data sources</w:t>
-      </w:r>
-    </w:p>
-    <w:p>
-      <w:r>
-        <w:t xml:space="preserve">From the business’s accounts, I exported .csv files from TikTok Shop and Squarespace. </w:t>
-      </w:r>
-      <w:r>
-        <w:t xml:space="preserve">TikTok only had gross and net sales data. However, Squarespace provided more information on product sales and customers. </w:t>
+        <w:t>Cleaning steps</w:t>
+      </w:r>
+    </w:p>
+    <w:p>
+      <w:r>
+        <w:t xml:space="preserve">I joined the datasets from TikTok and Squarespace to get segmented representation of sales trends and total earnings overall. </w:t>
+      </w:r>
+    </w:p>
+    <w:p>
+      <w:r>
+        <w:t>I also h</w:t>
+      </w:r>
+      <w:r>
+        <w:t>andled missing values to ensure accurate and consistent calculations.</w:t>
       </w:r>
     </w:p>
     <w:p/>
     <w:p>
       <w:r>
-        <w:t>Cleaning steps</w:t>
-      </w:r>
-    </w:p>
-    <w:p>
-      <w:r>
-        <w:t xml:space="preserve">I joined the datasets from TikTok and Squarespace to get segmented representation of sales trends and total earnings overall. </w:t>
-      </w:r>
-    </w:p>
-    <w:p>
-      <w:r>
-        <w:t>I also h</w:t>
-      </w:r>
-      <w:r>
-        <w:t>andled missing values to ensure accurate and consistent calculations.</w:t>
+        <w:t>SQL or modeling workflow</w:t>
+      </w:r>
+    </w:p>
+    <w:p>
+      <w:r>
+        <w:t>Tools involved</w:t>
+      </w:r>
+    </w:p>
+    <w:p>
+      <w:r>
+        <w:t>Logos of PostgreSQL, Excel, Power BI, git bash, and GitHub</w:t>
       </w:r>
     </w:p>
     <w:p/>
     <w:p>
       <w:r>
-        <w:t>SQL or modeling workflow</w:t>
-      </w:r>
-    </w:p>
-    <w:p>
-      <w:r>
-        <w:t>Tools involved</w:t>
-      </w:r>
-    </w:p>
-    <w:p>
-      <w:r>
-        <w:t>Logos of PostgreSQL, Excel, Power BI, git bash, and GitHub</w:t>
+        <w:t>Slide 4 — Key Insights</w:t>
+      </w:r>
+    </w:p>
+    <w:p>
+      <w:r>
+        <w:t>2–4 visuals</w:t>
+      </w:r>
+    </w:p>
+    <w:p>
+      <w:r>
+        <w:t>Most important findings</w:t>
       </w:r>
     </w:p>
     <w:p/>
     <w:p>
       <w:r>
-        <w:t>Slide 4 — Key Insights</w:t>
-      </w:r>
-    </w:p>
-    <w:p>
-      <w:r>
-        <w:t>2–4 visuals</w:t>
-      </w:r>
-    </w:p>
-    <w:p>
-      <w:r>
-        <w:t>Most important findings</w:t>
+        <w:t>Slide 5 — Final Dashboard / Product</w:t>
+      </w:r>
+    </w:p>
+    <w:p>
+      <w:r>
+        <w:t>Full screenshot</w:t>
+      </w:r>
+    </w:p>
+    <w:p>
+      <w:r>
+        <w:t>Highlight core features</w:t>
       </w:r>
     </w:p>
     <w:p/>
     <w:p>
       <w:r>
-        <w:t>Slide 5 — Final Dashboard / Product</w:t>
-      </w:r>
-    </w:p>
-    <w:p>
-      <w:r>
-        <w:t>Full screenshot</w:t>
-      </w:r>
-    </w:p>
-    <w:p>
-      <w:r>
-        <w:t>Highlight core features</w:t>
+        <w:lastRenderedPageBreak/>
+        <w:t>Slide 6 — Results / Impact</w:t>
+      </w:r>
+    </w:p>
+    <w:p>
+      <w:r>
+        <w:t>Business value</w:t>
+      </w:r>
+    </w:p>
+    <w:p>
+      <w:r>
+        <w:t>Quantified improvements (real or hypothetical)</w:t>
       </w:r>
     </w:p>
     <w:p/>
     <w:p>
       <w:r>
-        <w:t>Slide 6 — Results / Impact</w:t>
-      </w:r>
-    </w:p>
-    <w:p>
-      <w:r>
-        <w:t>Business value</w:t>
-      </w:r>
-    </w:p>
-    <w:p>
-      <w:r>
-        <w:t>Quantified improvements (real or hypothetical)</w:t>
+        <w:t>Slide 7 — Technical Skills Demonstrated</w:t>
+      </w:r>
+    </w:p>
+    <w:p>
+      <w:r>
+        <w:t>SQL, Power BI, Git, HTML/CSS/JS, etc.</w:t>
+      </w:r>
+    </w:p>
+    <w:p>
+      <w:r>
+        <w:t>What you specifically did?</w:t>
       </w:r>
     </w:p>
     <w:p/>
     <w:p>
       <w:r>
-        <w:t>Slide 7 — Technical Skills Demonstrated</w:t>
-      </w:r>
-    </w:p>
-    <w:p>
-      <w:r>
-        <w:t>SQL, Power BI, Git, HTML/CSS/JS, etc.</w:t>
-      </w:r>
-    </w:p>
-    <w:p>
-      <w:r>
-        <w:t xml:space="preserve">What </w:t>
-      </w:r>
-      <w:proofErr w:type="gramStart"/>
-      <w:r>
-        <w:t>you specifically did</w:t>
-      </w:r>
-      <w:proofErr w:type="gramEnd"/>
-      <w:r>
-        <w:t>?</w:t>
-      </w:r>
-    </w:p>
-    <w:p/>
-    <w:p>
-      <w:r>
         <w:t>Slide 8 — Reflection &amp; Links</w:t>
       </w:r>
     </w:p>
@@ -1038,7 +1228,6 @@
     </w:p>
     <w:p>
       <w:r>
-        <w:lastRenderedPageBreak/>
         <w:t>This makes me realize that I should do this type of descriptive logic on all my other projects too: Healthcare and Operations-Dash.</w:t>
       </w:r>
     </w:p>
@@ -1154,6 +1343,7 @@
         </w:numPr>
       </w:pPr>
       <w:r>
+        <w:lastRenderedPageBreak/>
         <w:t>Top selling products within top 3 states</w:t>
       </w:r>
     </w:p>
@@ -1277,13 +1467,8 @@
         </w:numPr>
       </w:pPr>
       <w:r>
-        <w:t xml:space="preserve">Updated and verified SQL scripts function properly within </w:t>
-      </w:r>
-      <w:proofErr w:type="spellStart"/>
-      <w:r>
-        <w:t>PGadmin</w:t>
-      </w:r>
-      <w:proofErr w:type="spellEnd"/>
+        <w:t>Updated and verified SQL scripts function properly within PGadmin</w:t>
+      </w:r>
     </w:p>
     <w:p>
       <w:pPr>
@@ -1339,23 +1524,7 @@
     </w:p>
     <w:p>
       <w:r>
-        <w:t xml:space="preserve">I’ll need the SQL code stored on my home </w:t>
-      </w:r>
-      <w:proofErr w:type="gramStart"/>
-      <w:r>
-        <w:t>computer, and</w:t>
-      </w:r>
-      <w:proofErr w:type="gramEnd"/>
-      <w:r>
-        <w:t xml:space="preserve"> then </w:t>
-      </w:r>
-      <w:proofErr w:type="gramStart"/>
-      <w:r>
-        <w:t>transfer</w:t>
-      </w:r>
-      <w:proofErr w:type="gramEnd"/>
-      <w:r>
-        <w:t xml:space="preserve"> to local/remote repos</w:t>
+        <w:t>I’ll need the SQL code stored on my home computer, and then transfer to local/remote repos</w:t>
       </w:r>
       <w:r>
         <w:t xml:space="preserve">. </w:t>
@@ -1384,7 +1553,6 @@
         </w:numPr>
       </w:pPr>
       <w:r>
-        <w:lastRenderedPageBreak/>
         <w:t>Git Hub repo was created</w:t>
       </w:r>
     </w:p>
@@ -1397,15 +1565,7 @@
         </w:numPr>
       </w:pPr>
       <w:r>
-        <w:t xml:space="preserve">Project Files imported </w:t>
-      </w:r>
-      <w:proofErr w:type="gramStart"/>
-      <w:r>
-        <w:t>onto</w:t>
-      </w:r>
-      <w:proofErr w:type="gramEnd"/>
-      <w:r>
-        <w:t xml:space="preserve"> local and remote repos </w:t>
+        <w:t xml:space="preserve">Project Files imported onto local and remote repos </w:t>
       </w:r>
     </w:p>
     <w:p/>
@@ -1420,7 +1580,7 @@
 </file>
 
 <file path=word/numbering.xml><?xml version="1.0" encoding="utf-8"?>
-<w:numbering xmlns:wpc="http://schemas.microsoft.com/office/word/2010/wordprocessingCanvas" xmlns:cx="http://schemas.microsoft.com/office/drawing/2014/chartex" xmlns:cx1="http://schemas.microsoft.com/office/drawing/2015/9/8/chartex" xmlns:cx2="http://schemas.microsoft.com/office/drawing/2015/10/21/chartex" xmlns:cx3="http://schemas.microsoft.com/office/drawing/2016/5/9/chartex" xmlns:cx4="http://schemas.microsoft.com/office/drawing/2016/5/10/chartex" xmlns:cx5="http://schemas.microsoft.com/office/drawing/2016/5/11/chartex" xmlns:cx6="http://schemas.microsoft.com/office/drawing/2016/5/12/chartex" xmlns:cx7="http://schemas.microsoft.com/office/drawing/2016/5/13/chartex" xmlns:cx8="http://schemas.microsoft.com/office/drawing/2016/5/14/chartex" xmlns:mc="http://schemas.openxmlformats.org/markup-compatibility/2006" xmlns:aink="http://schemas.microsoft.com/office/drawing/2016/ink" xmlns:am3d="http://schemas.microsoft.com/office/drawing/2017/model3d" xmlns:o="urn:schemas-microsoft-com:office:office" xmlns:oel="http://schemas.microsoft.com/office/2019/extlst" xmlns:r="http://schemas.openxmlformats.org/officeDocument/2006/relationships" xmlns:m="http://schemas.openxmlformats.org/officeDocument/2006/math" xmlns:v="urn:schemas-microsoft-com:vml" xmlns:wp14="http://schemas.microsoft.com/office/word/2010/wordprocessingDrawing" xmlns:wp="http://schemas.openxmlformats.org/drawingml/2006/wordprocessingDrawing" xmlns:w10="urn:schemas-microsoft-com:office:word" xmlns:w="http://schemas.openxmlformats.org/wordprocessingml/2006/main" xmlns:w14="http://schemas.microsoft.com/office/word/2010/wordml" xmlns:w15="http://schemas.microsoft.com/office/word/2012/wordml" xmlns:w16cei="http://schemas.microsoft.com/office/word/2026/wordml/cei" xmlns:w16cex="http://schemas.microsoft.com/office/word/2018/wordml/cex" xmlns:w16cid="http://schemas.microsoft.com/office/word/2016/wordml/cid" xmlns:w16="http://schemas.microsoft.com/office/word/2018/wordml" xmlns:w16du="http://schemas.microsoft.com/office/word/2023/wordml/word16du" xmlns:w16sdtdh="http://schemas.microsoft.com/office/word/2020/wordml/sdtdatahash" xmlns:w16sdtfl="http://schemas.microsoft.com/office/word/2024/wordml/sdtformatlock" xmlns:w16se="http://schemas.microsoft.com/office/word/2015/wordml/symex" xmlns:wpg="http://schemas.microsoft.com/office/word/2010/wordprocessingGroup" xmlns:wpi="http://schemas.microsoft.com/office/word/2010/wordprocessingInk" xmlns:wne="http://schemas.microsoft.com/office/word/2006/wordml" xmlns:wps="http://schemas.microsoft.com/office/word/2010/wordprocessingShape" mc:Ignorable="w14 w15 w16se w16cid w16 w16cex w16sdtdh w16sdtfl w16du wp14">
+<w:numbering xmlns:wpc="http://schemas.microsoft.com/office/word/2010/wordprocessingCanvas" xmlns:cx="http://schemas.microsoft.com/office/drawing/2014/chartex" xmlns:cx1="http://schemas.microsoft.com/office/drawing/2015/9/8/chartex" xmlns:cx2="http://schemas.microsoft.com/office/drawing/2015/10/21/chartex" xmlns:cx3="http://schemas.microsoft.com/office/drawing/2016/5/9/chartex" xmlns:cx4="http://schemas.microsoft.com/office/drawing/2016/5/10/chartex" xmlns:cx5="http://schemas.microsoft.com/office/drawing/2016/5/11/chartex" xmlns:cx6="http://schemas.microsoft.com/office/drawing/2016/5/12/chartex" xmlns:cx7="http://schemas.microsoft.com/office/drawing/2016/5/13/chartex" xmlns:cx8="http://schemas.microsoft.com/office/drawing/2016/5/14/chartex" xmlns:mc="http://schemas.openxmlformats.org/markup-compatibility/2006" xmlns:aink="http://schemas.microsoft.com/office/drawing/2016/ink" xmlns:am3d="http://schemas.microsoft.com/office/drawing/2017/model3d" xmlns:o="urn:schemas-microsoft-com:office:office" xmlns:oel="http://schemas.microsoft.com/office/2019/extlst" xmlns:r="http://schemas.openxmlformats.org/officeDocument/2006/relationships" xmlns:m="http://schemas.openxmlformats.org/officeDocument/2006/math" xmlns:v="urn:schemas-microsoft-com:vml" xmlns:wp14="http://schemas.microsoft.com/office/word/2010/wordprocessingDrawing" xmlns:wp="http://schemas.openxmlformats.org/drawingml/2006/wordprocessingDrawing" xmlns:w10="urn:schemas-microsoft-com:office:word" xmlns:w="http://schemas.openxmlformats.org/wordprocessingml/2006/main" xmlns:w14="http://schemas.microsoft.com/office/word/2010/wordml" xmlns:w15="http://schemas.microsoft.com/office/word/2012/wordml" xmlns:w16cex="http://schemas.microsoft.com/office/word/2018/wordml/cex" xmlns:w16cid="http://schemas.microsoft.com/office/word/2016/wordml/cid" xmlns:w16="http://schemas.microsoft.com/office/word/2018/wordml" xmlns:w16du="http://schemas.microsoft.com/office/word/2023/wordml/word16du" xmlns:w16sdtdh="http://schemas.microsoft.com/office/word/2020/wordml/sdtdatahash" xmlns:w16sdtfl="http://schemas.microsoft.com/office/word/2024/wordml/sdtformatlock" xmlns:w16se="http://schemas.microsoft.com/office/word/2015/wordml/symex" xmlns:wpg="http://schemas.microsoft.com/office/word/2010/wordprocessingGroup" xmlns:wpi="http://schemas.microsoft.com/office/word/2010/wordprocessingInk" xmlns:wne="http://schemas.microsoft.com/office/word/2006/wordml" xmlns:wps="http://schemas.microsoft.com/office/word/2010/wordprocessingShape" mc:Ignorable="w14 w15 w16se w16cid w16 w16cex w16sdtdh w16sdtfl w16du wp14">
   <w:abstractNum w:abstractNumId="0" w15:restartNumberingAfterBreak="0">
     <w:nsid w:val="040F561D"/>
     <w:multiLevelType w:val="hybridMultilevel"/>
@@ -3975,7 +4135,6 @@
   <w:style w:type="character" w:default="1" w:styleId="DefaultParagraphFont">
     <w:name w:val="Default Paragraph Font"/>
     <w:uiPriority w:val="1"/>
-    <w:semiHidden/>
     <w:unhideWhenUsed/>
   </w:style>
   <w:style w:type="table" w:default="1" w:styleId="TableNormal">

</xml_diff>

<commit_message>
Cleaned up Pandas code, organized code with markdown, and updated project documentation.
</commit_message>
<xml_diff>
--- a/documentation/nicosys-portfolio-ecom-project-documentation.docx
+++ b/documentation/nicosys-portfolio-ecom-project-documentation.docx
@@ -27,6 +27,117 @@
         <w:rPr>
           <w:u w:val="single"/>
         </w:rPr>
+        <w:t>8/31/2026</w:t>
+      </w:r>
+    </w:p>
+    <w:p>
+      <w:r>
+        <w:t xml:space="preserve">Completed clean up of Pandas code and included markdown code for organization and context to code. </w:t>
+      </w:r>
+    </w:p>
+    <w:p>
+      <w:pPr>
+        <w:rPr>
+          <w:u w:val="single"/>
+        </w:rPr>
+      </w:pPr>
+    </w:p>
+    <w:p>
+      <w:pPr>
+        <w:rPr>
+          <w:u w:val="single"/>
+        </w:rPr>
+      </w:pPr>
+      <w:r>
+        <w:rPr>
+          <w:u w:val="single"/>
+        </w:rPr>
+        <w:t>8/30/2026</w:t>
+      </w:r>
+    </w:p>
+    <w:p>
+      <w:r>
+        <w:t>Completed SQL to Pandas translations:</w:t>
+      </w:r>
+    </w:p>
+    <w:p>
+      <w:pPr>
+        <w:pStyle w:val="ListParagraph"/>
+        <w:numPr>
+          <w:ilvl w:val="0"/>
+          <w:numId w:val="15"/>
+        </w:numPr>
+        <w:rPr>
+          <w:u w:val="single"/>
+        </w:rPr>
+      </w:pPr>
+      <w:r>
+        <w:t xml:space="preserve">filter </w:t>
+      </w:r>
+    </w:p>
+    <w:p>
+      <w:pPr>
+        <w:pStyle w:val="ListParagraph"/>
+        <w:numPr>
+          <w:ilvl w:val="0"/>
+          <w:numId w:val="15"/>
+        </w:numPr>
+        <w:rPr>
+          <w:u w:val="single"/>
+        </w:rPr>
+      </w:pPr>
+      <w:r>
+        <w:t>multi-column group by</w:t>
+      </w:r>
+    </w:p>
+    <w:p>
+      <w:pPr>
+        <w:pStyle w:val="ListParagraph"/>
+        <w:numPr>
+          <w:ilvl w:val="0"/>
+          <w:numId w:val="15"/>
+        </w:numPr>
+        <w:rPr>
+          <w:u w:val="single"/>
+        </w:rPr>
+      </w:pPr>
+      <w:r>
+        <w:t>sum</w:t>
+      </w:r>
+    </w:p>
+    <w:p>
+      <w:pPr>
+        <w:pStyle w:val="ListParagraph"/>
+        <w:numPr>
+          <w:ilvl w:val="0"/>
+          <w:numId w:val="15"/>
+        </w:numPr>
+        <w:rPr>
+          <w:u w:val="single"/>
+        </w:rPr>
+      </w:pPr>
+      <w:r>
+        <w:t xml:space="preserve">sort </w:t>
+      </w:r>
+    </w:p>
+    <w:p>
+      <w:pPr>
+        <w:pStyle w:val="ListParagraph"/>
+        <w:rPr>
+          <w:u w:val="single"/>
+        </w:rPr>
+      </w:pPr>
+    </w:p>
+    <w:p>
+      <w:pPr>
+        <w:rPr>
+          <w:u w:val="single"/>
+        </w:rPr>
+      </w:pPr>
+      <w:r>
+        <w:rPr>
+          <w:u w:val="single"/>
+        </w:rPr>
         <w:t>8/27/2026</w:t>
       </w:r>
     </w:p>
@@ -108,6 +219,9 @@
       </w:r>
       <w:r>
         <w:br/>
+      </w:r>
+      <w:r>
+        <w:lastRenderedPageBreak/>
         <w:t>, product_name</w:t>
       </w:r>
       <w:r>
@@ -143,7 +257,6 @@
     <w:p/>
     <w:p>
       <w:r>
-        <w:lastRenderedPageBreak/>
         <w:t>/*Daily Sales between TikTok Shop and Squarespace*/</w:t>
       </w:r>
       <w:r>
@@ -238,6 +351,7 @@
     </w:p>
     <w:p>
       <w:r>
+        <w:lastRenderedPageBreak/>
         <w:t xml:space="preserve">Completed my portfolio in Canva. Created PDF and PowerPoint versions of the Canva presentation. </w:t>
       </w:r>
     </w:p>
@@ -328,7 +442,6 @@
         </w:numPr>
       </w:pPr>
       <w:r>
-        <w:lastRenderedPageBreak/>
         <w:t>Impact</w:t>
       </w:r>
     </w:p>
@@ -509,6 +622,7 @@
         </w:numPr>
       </w:pPr>
       <w:r>
+        <w:lastRenderedPageBreak/>
         <w:t>Who is affected?</w:t>
       </w:r>
     </w:p>
@@ -593,7 +707,6 @@
           <w:b/>
           <w:bCs/>
         </w:rPr>
-        <w:lastRenderedPageBreak/>
         <w:t>5. Methodology</w:t>
       </w:r>
     </w:p>
@@ -774,6 +887,7 @@
         </w:numPr>
       </w:pPr>
       <w:r>
+        <w:lastRenderedPageBreak/>
         <w:t>What could change</w:t>
       </w:r>
     </w:p>
@@ -860,7 +974,6 @@
         </w:numPr>
       </w:pPr>
       <w:r>
-        <w:lastRenderedPageBreak/>
         <w:t>GitHub</w:t>
       </w:r>
     </w:p>
@@ -1008,6 +1121,7 @@
         </w:numPr>
       </w:pPr>
       <w:r>
+        <w:lastRenderedPageBreak/>
         <w:t>Power BI</w:t>
       </w:r>
     </w:p>
@@ -1043,191 +1157,191 @@
     </w:p>
     <w:p>
       <w:r>
+        <w:t xml:space="preserve">Over the past two years, the owner had noticed sales were going down, and it was growing more challenging to get views on social media. The owner believed that decreased sales were due to a lack of content creation and low visibility. </w:t>
+      </w:r>
+    </w:p>
+    <w:p>
+      <w:r>
+        <w:t xml:space="preserve">  </w:t>
+      </w:r>
+    </w:p>
+    <w:p>
+      <w:r>
+        <w:t>Slide 3 — Data &amp; Process</w:t>
+      </w:r>
+    </w:p>
+    <w:p>
+      <w:r>
+        <w:t>Data sources</w:t>
+      </w:r>
+    </w:p>
+    <w:p>
+      <w:r>
+        <w:t xml:space="preserve">From the business’s accounts, I exported .csv files from TikTok Shop and Squarespace. </w:t>
+      </w:r>
+      <w:r>
+        <w:t xml:space="preserve">TikTok only had gross and net sales data. However, Squarespace provided more information on product sales and customers. </w:t>
+      </w:r>
+    </w:p>
+    <w:p/>
+    <w:p>
+      <w:r>
+        <w:t>Cleaning steps</w:t>
+      </w:r>
+    </w:p>
+    <w:p>
+      <w:r>
+        <w:t xml:space="preserve">I joined the datasets from TikTok and Squarespace to get segmented representation of sales trends and total earnings overall. </w:t>
+      </w:r>
+    </w:p>
+    <w:p>
+      <w:r>
+        <w:t>I also h</w:t>
+      </w:r>
+      <w:r>
+        <w:t>andled missing values to ensure accurate and consistent calculations.</w:t>
+      </w:r>
+    </w:p>
+    <w:p/>
+    <w:p>
+      <w:r>
+        <w:t>SQL or modeling workflow</w:t>
+      </w:r>
+    </w:p>
+    <w:p>
+      <w:r>
+        <w:t>Tools involved</w:t>
+      </w:r>
+    </w:p>
+    <w:p>
+      <w:r>
+        <w:t>Logos of PostgreSQL, Excel, Power BI, git bash, and GitHub</w:t>
+      </w:r>
+    </w:p>
+    <w:p/>
+    <w:p>
+      <w:r>
         <w:lastRenderedPageBreak/>
-        <w:t xml:space="preserve">Over the past two years, the owner had noticed sales were going down, and it was growing more challenging to get views on social media. The owner believed that decreased sales were due to a lack of content creation and low visibility. </w:t>
-      </w:r>
-    </w:p>
-    <w:p>
-      <w:r>
-        <w:t xml:space="preserve">  </w:t>
-      </w:r>
-    </w:p>
-    <w:p>
-      <w:r>
-        <w:t>Slide 3 — Data &amp; Process</w:t>
-      </w:r>
-    </w:p>
-    <w:p>
-      <w:r>
-        <w:t>Data sources</w:t>
-      </w:r>
-    </w:p>
-    <w:p>
-      <w:r>
-        <w:t xml:space="preserve">From the business’s accounts, I exported .csv files from TikTok Shop and Squarespace. </w:t>
-      </w:r>
-      <w:r>
-        <w:t xml:space="preserve">TikTok only had gross and net sales data. However, Squarespace provided more information on product sales and customers. </w:t>
+        <w:t>Slide 4 — Key Insights</w:t>
+      </w:r>
+    </w:p>
+    <w:p>
+      <w:r>
+        <w:t>2–4 visuals</w:t>
+      </w:r>
+    </w:p>
+    <w:p>
+      <w:r>
+        <w:t>Most important findings</w:t>
       </w:r>
     </w:p>
     <w:p/>
     <w:p>
       <w:r>
-        <w:t>Cleaning steps</w:t>
-      </w:r>
-    </w:p>
-    <w:p>
-      <w:r>
-        <w:t xml:space="preserve">I joined the datasets from TikTok and Squarespace to get segmented representation of sales trends and total earnings overall. </w:t>
-      </w:r>
-    </w:p>
-    <w:p>
-      <w:r>
-        <w:t>I also h</w:t>
-      </w:r>
-      <w:r>
-        <w:t>andled missing values to ensure accurate and consistent calculations.</w:t>
+        <w:t>Slide 5 — Final Dashboard / Product</w:t>
+      </w:r>
+    </w:p>
+    <w:p>
+      <w:r>
+        <w:t>Full screenshot</w:t>
+      </w:r>
+    </w:p>
+    <w:p>
+      <w:r>
+        <w:t>Highlight core features</w:t>
       </w:r>
     </w:p>
     <w:p/>
     <w:p>
       <w:r>
-        <w:t>SQL or modeling workflow</w:t>
-      </w:r>
-    </w:p>
-    <w:p>
-      <w:r>
-        <w:t>Tools involved</w:t>
-      </w:r>
-    </w:p>
-    <w:p>
-      <w:r>
-        <w:t>Logos of PostgreSQL, Excel, Power BI, git bash, and GitHub</w:t>
+        <w:t>Slide 6 — Results / Impact</w:t>
+      </w:r>
+    </w:p>
+    <w:p>
+      <w:r>
+        <w:t>Business value</w:t>
+      </w:r>
+    </w:p>
+    <w:p>
+      <w:r>
+        <w:t>Quantified improvements (real or hypothetical)</w:t>
       </w:r>
     </w:p>
     <w:p/>
     <w:p>
       <w:r>
-        <w:t>Slide 4 — Key Insights</w:t>
-      </w:r>
-    </w:p>
-    <w:p>
-      <w:r>
-        <w:t>2–4 visuals</w:t>
-      </w:r>
-    </w:p>
-    <w:p>
-      <w:r>
-        <w:t>Most important findings</w:t>
+        <w:t>Slide 7 — Technical Skills Demonstrated</w:t>
+      </w:r>
+    </w:p>
+    <w:p>
+      <w:r>
+        <w:t>SQL, Power BI, Git, HTML/CSS/JS, etc.</w:t>
+      </w:r>
+    </w:p>
+    <w:p>
+      <w:r>
+        <w:t>What you specifically did?</w:t>
       </w:r>
     </w:p>
     <w:p/>
     <w:p>
       <w:r>
-        <w:t>Slide 5 — Final Dashboard / Product</w:t>
-      </w:r>
-    </w:p>
-    <w:p>
-      <w:r>
-        <w:t>Full screenshot</w:t>
-      </w:r>
-    </w:p>
-    <w:p>
-      <w:r>
-        <w:t>Highlight core features</w:t>
-      </w:r>
-    </w:p>
-    <w:p/>
+        <w:t>Slide 8 — Reflection &amp; Links</w:t>
+      </w:r>
+    </w:p>
+    <w:p>
+      <w:r>
+        <w:t>What you learned</w:t>
+      </w:r>
+    </w:p>
+    <w:p>
+      <w:r>
+        <w:t>What you’d improve:</w:t>
+      </w:r>
+    </w:p>
+    <w:p>
+      <w:r>
+        <w:t>GitHub repo + contact info</w:t>
+      </w:r>
+    </w:p>
+    <w:p>
+      <w:pPr>
+        <w:rPr>
+          <w:u w:val="single"/>
+        </w:rPr>
+      </w:pPr>
+    </w:p>
+    <w:p>
+      <w:pPr>
+        <w:rPr>
+          <w:u w:val="single"/>
+        </w:rPr>
+      </w:pPr>
+    </w:p>
+    <w:p>
+      <w:pPr>
+        <w:rPr>
+          <w:u w:val="single"/>
+        </w:rPr>
+      </w:pPr>
+      <w:r>
+        <w:rPr>
+          <w:u w:val="single"/>
+        </w:rPr>
+        <w:t>7/28/2026</w:t>
+      </w:r>
+    </w:p>
+    <w:p>
+      <w:r>
+        <w:t xml:space="preserve">It does not make sense to redo the work I’ve created already for my e-commerce dashboard. I must bring over the explanations on how I arrived at each graph, chart, and KPI to present for this project. Get this file from </w:t>
+      </w:r>
+      <w:r>
+        <w:t xml:space="preserve">my Tier II project working with Mika. </w:t>
+      </w:r>
+    </w:p>
     <w:p>
       <w:r>
         <w:lastRenderedPageBreak/>
-        <w:t>Slide 6 — Results / Impact</w:t>
-      </w:r>
-    </w:p>
-    <w:p>
-      <w:r>
-        <w:t>Business value</w:t>
-      </w:r>
-    </w:p>
-    <w:p>
-      <w:r>
-        <w:t>Quantified improvements (real or hypothetical)</w:t>
-      </w:r>
-    </w:p>
-    <w:p/>
-    <w:p>
-      <w:r>
-        <w:t>Slide 7 — Technical Skills Demonstrated</w:t>
-      </w:r>
-    </w:p>
-    <w:p>
-      <w:r>
-        <w:t>SQL, Power BI, Git, HTML/CSS/JS, etc.</w:t>
-      </w:r>
-    </w:p>
-    <w:p>
-      <w:r>
-        <w:t>What you specifically did?</w:t>
-      </w:r>
-    </w:p>
-    <w:p/>
-    <w:p>
-      <w:r>
-        <w:t>Slide 8 — Reflection &amp; Links</w:t>
-      </w:r>
-    </w:p>
-    <w:p>
-      <w:r>
-        <w:t>What you learned</w:t>
-      </w:r>
-    </w:p>
-    <w:p>
-      <w:r>
-        <w:t>What you’d improve:</w:t>
-      </w:r>
-    </w:p>
-    <w:p>
-      <w:r>
-        <w:t>GitHub repo + contact info</w:t>
-      </w:r>
-    </w:p>
-    <w:p>
-      <w:pPr>
-        <w:rPr>
-          <w:u w:val="single"/>
-        </w:rPr>
-      </w:pPr>
-    </w:p>
-    <w:p>
-      <w:pPr>
-        <w:rPr>
-          <w:u w:val="single"/>
-        </w:rPr>
-      </w:pPr>
-    </w:p>
-    <w:p>
-      <w:pPr>
-        <w:rPr>
-          <w:u w:val="single"/>
-        </w:rPr>
-      </w:pPr>
-      <w:r>
-        <w:rPr>
-          <w:u w:val="single"/>
-        </w:rPr>
-        <w:t>7/28/2026</w:t>
-      </w:r>
-    </w:p>
-    <w:p>
-      <w:r>
-        <w:t xml:space="preserve">It does not make sense to redo the work I’ve created already for my e-commerce dashboard. I must bring over the explanations on how I arrived at each graph, chart, and KPI to present for this project. Get this file from </w:t>
-      </w:r>
-      <w:r>
-        <w:t xml:space="preserve">my Tier II project working with Mika. </w:t>
-      </w:r>
-    </w:p>
-    <w:p>
-      <w:r>
         <w:t>This makes me realize that I should do this type of descriptive logic on all my other projects too: Healthcare and Operations-Dash.</w:t>
       </w:r>
     </w:p>
@@ -1343,216 +1457,216 @@
         </w:numPr>
       </w:pPr>
       <w:r>
+        <w:t>Top selling products within top 3 states</w:t>
+      </w:r>
+    </w:p>
+    <w:p>
+      <w:r>
+        <w:t xml:space="preserve">Next move to recreating Dashboard </w:t>
+      </w:r>
+    </w:p>
+    <w:p>
+      <w:pPr>
+        <w:rPr>
+          <w:u w:val="single"/>
+        </w:rPr>
+      </w:pPr>
+    </w:p>
+    <w:p>
+      <w:pPr>
+        <w:rPr>
+          <w:u w:val="single"/>
+        </w:rPr>
+      </w:pPr>
+      <w:r>
+        <w:rPr>
+          <w:u w:val="single"/>
+        </w:rPr>
+        <w:t>7/</w:t>
+      </w:r>
+      <w:r>
+        <w:rPr>
+          <w:u w:val="single"/>
+        </w:rPr>
+        <w:t>2</w:t>
+      </w:r>
+      <w:r>
+        <w:rPr>
+          <w:u w:val="single"/>
+        </w:rPr>
+        <w:t>6</w:t>
+      </w:r>
+      <w:r>
+        <w:rPr>
+          <w:u w:val="single"/>
+        </w:rPr>
+        <w:t>/2026</w:t>
+      </w:r>
+    </w:p>
+    <w:p>
+      <w:pPr>
+        <w:pStyle w:val="ListParagraph"/>
+        <w:numPr>
+          <w:ilvl w:val="0"/>
+          <w:numId w:val="3"/>
+        </w:numPr>
+      </w:pPr>
+      <w:r>
+        <w:t>Updated</w:t>
+      </w:r>
+      <w:r>
+        <w:t>/completed</w:t>
+      </w:r>
+      <w:r>
+        <w:t xml:space="preserve"> question</w:t>
+      </w:r>
+      <w:r>
+        <w:t>s</w:t>
+      </w:r>
+      <w:r>
+        <w:t xml:space="preserve"> in SQL Script</w:t>
+      </w:r>
+    </w:p>
+    <w:p>
+      <w:pPr>
+        <w:pStyle w:val="ListParagraph"/>
+        <w:numPr>
+          <w:ilvl w:val="0"/>
+          <w:numId w:val="3"/>
+        </w:numPr>
+      </w:pPr>
+      <w:r>
+        <w:t xml:space="preserve">Next thing to validate SQL findings in Excel </w:t>
+      </w:r>
+    </w:p>
+    <w:p>
+      <w:pPr>
+        <w:rPr>
+          <w:u w:val="single"/>
+        </w:rPr>
+      </w:pPr>
+    </w:p>
+    <w:p>
+      <w:pPr>
+        <w:rPr>
+          <w:u w:val="single"/>
+        </w:rPr>
+      </w:pPr>
+      <w:r>
+        <w:rPr>
+          <w:u w:val="single"/>
+        </w:rPr>
+        <w:t>7/2</w:t>
+      </w:r>
+      <w:r>
+        <w:rPr>
+          <w:u w:val="single"/>
+        </w:rPr>
+        <w:t>5</w:t>
+      </w:r>
+      <w:r>
+        <w:rPr>
+          <w:u w:val="single"/>
+        </w:rPr>
+        <w:t>/2026</w:t>
+      </w:r>
+    </w:p>
+    <w:p>
+      <w:pPr>
+        <w:pStyle w:val="ListParagraph"/>
+        <w:numPr>
+          <w:ilvl w:val="0"/>
+          <w:numId w:val="2"/>
+        </w:numPr>
+      </w:pPr>
+      <w:r>
+        <w:t>Updated and verified SQL scripts function properly within PGadmin</w:t>
+      </w:r>
+    </w:p>
+    <w:p>
+      <w:pPr>
+        <w:pStyle w:val="ListParagraph"/>
+        <w:numPr>
+          <w:ilvl w:val="0"/>
+          <w:numId w:val="2"/>
+        </w:numPr>
+      </w:pPr>
+      <w:r>
+        <w:t>Added questions/documentation within SQL scripts</w:t>
+      </w:r>
+      <w:r>
+        <w:t xml:space="preserve"> (pending- keep defining all business questions).</w:t>
+      </w:r>
+    </w:p>
+    <w:p>
+      <w:pPr>
+        <w:rPr>
+          <w:u w:val="single"/>
+        </w:rPr>
+      </w:pPr>
+    </w:p>
+    <w:p>
+      <w:pPr>
+        <w:rPr>
+          <w:u w:val="single"/>
+        </w:rPr>
+      </w:pPr>
+      <w:r>
+        <w:rPr>
+          <w:u w:val="single"/>
+        </w:rPr>
+        <w:t>7/24/2026</w:t>
+      </w:r>
+    </w:p>
+    <w:p>
+      <w:r>
+        <w:t>After r</w:t>
+      </w:r>
+      <w:r>
+        <w:t>eviewing</w:t>
+      </w:r>
+      <w:r>
+        <w:t xml:space="preserve"> the</w:t>
+      </w:r>
+      <w:r>
+        <w:t xml:space="preserve"> files</w:t>
+      </w:r>
+      <w:r>
+        <w:t xml:space="preserve"> on my local and remote repos, I have found the SQL code for this project missing. </w:t>
+      </w:r>
+    </w:p>
+    <w:p>
+      <w:r>
+        <w:t>I’ll need the SQL code stored on my home computer, and then transfer to local/remote repos</w:t>
+      </w:r>
+      <w:r>
+        <w:t xml:space="preserve">. </w:t>
+      </w:r>
+    </w:p>
+    <w:p/>
+    <w:p>
+      <w:pPr>
+        <w:rPr>
+          <w:u w:val="single"/>
+        </w:rPr>
+      </w:pPr>
+      <w:r>
+        <w:rPr>
+          <w:u w:val="single"/>
+        </w:rPr>
+        <w:t>July 21, 2026</w:t>
+      </w:r>
+    </w:p>
+    <w:p>
+      <w:pPr>
+        <w:pStyle w:val="ListParagraph"/>
+        <w:numPr>
+          <w:ilvl w:val="0"/>
+          <w:numId w:val="1"/>
+        </w:numPr>
+      </w:pPr>
+      <w:r>
         <w:lastRenderedPageBreak/>
-        <w:t>Top selling products within top 3 states</w:t>
-      </w:r>
-    </w:p>
-    <w:p>
-      <w:r>
-        <w:t xml:space="preserve">Next move to recreating Dashboard </w:t>
-      </w:r>
-    </w:p>
-    <w:p>
-      <w:pPr>
-        <w:rPr>
-          <w:u w:val="single"/>
-        </w:rPr>
-      </w:pPr>
-    </w:p>
-    <w:p>
-      <w:pPr>
-        <w:rPr>
-          <w:u w:val="single"/>
-        </w:rPr>
-      </w:pPr>
-      <w:r>
-        <w:rPr>
-          <w:u w:val="single"/>
-        </w:rPr>
-        <w:t>7/</w:t>
-      </w:r>
-      <w:r>
-        <w:rPr>
-          <w:u w:val="single"/>
-        </w:rPr>
-        <w:t>2</w:t>
-      </w:r>
-      <w:r>
-        <w:rPr>
-          <w:u w:val="single"/>
-        </w:rPr>
-        <w:t>6</w:t>
-      </w:r>
-      <w:r>
-        <w:rPr>
-          <w:u w:val="single"/>
-        </w:rPr>
-        <w:t>/2026</w:t>
-      </w:r>
-    </w:p>
-    <w:p>
-      <w:pPr>
-        <w:pStyle w:val="ListParagraph"/>
-        <w:numPr>
-          <w:ilvl w:val="0"/>
-          <w:numId w:val="3"/>
-        </w:numPr>
-      </w:pPr>
-      <w:r>
-        <w:t>Updated</w:t>
-      </w:r>
-      <w:r>
-        <w:t>/completed</w:t>
-      </w:r>
-      <w:r>
-        <w:t xml:space="preserve"> question</w:t>
-      </w:r>
-      <w:r>
-        <w:t>s</w:t>
-      </w:r>
-      <w:r>
-        <w:t xml:space="preserve"> in SQL Script</w:t>
-      </w:r>
-    </w:p>
-    <w:p>
-      <w:pPr>
-        <w:pStyle w:val="ListParagraph"/>
-        <w:numPr>
-          <w:ilvl w:val="0"/>
-          <w:numId w:val="3"/>
-        </w:numPr>
-      </w:pPr>
-      <w:r>
-        <w:t xml:space="preserve">Next thing to validate SQL findings in Excel </w:t>
-      </w:r>
-    </w:p>
-    <w:p>
-      <w:pPr>
-        <w:rPr>
-          <w:u w:val="single"/>
-        </w:rPr>
-      </w:pPr>
-    </w:p>
-    <w:p>
-      <w:pPr>
-        <w:rPr>
-          <w:u w:val="single"/>
-        </w:rPr>
-      </w:pPr>
-      <w:r>
-        <w:rPr>
-          <w:u w:val="single"/>
-        </w:rPr>
-        <w:t>7/2</w:t>
-      </w:r>
-      <w:r>
-        <w:rPr>
-          <w:u w:val="single"/>
-        </w:rPr>
-        <w:t>5</w:t>
-      </w:r>
-      <w:r>
-        <w:rPr>
-          <w:u w:val="single"/>
-        </w:rPr>
-        <w:t>/2026</w:t>
-      </w:r>
-    </w:p>
-    <w:p>
-      <w:pPr>
-        <w:pStyle w:val="ListParagraph"/>
-        <w:numPr>
-          <w:ilvl w:val="0"/>
-          <w:numId w:val="2"/>
-        </w:numPr>
-      </w:pPr>
-      <w:r>
-        <w:t>Updated and verified SQL scripts function properly within PGadmin</w:t>
-      </w:r>
-    </w:p>
-    <w:p>
-      <w:pPr>
-        <w:pStyle w:val="ListParagraph"/>
-        <w:numPr>
-          <w:ilvl w:val="0"/>
-          <w:numId w:val="2"/>
-        </w:numPr>
-      </w:pPr>
-      <w:r>
-        <w:t>Added questions/documentation within SQL scripts</w:t>
-      </w:r>
-      <w:r>
-        <w:t xml:space="preserve"> (pending- keep defining all business questions).</w:t>
-      </w:r>
-    </w:p>
-    <w:p>
-      <w:pPr>
-        <w:rPr>
-          <w:u w:val="single"/>
-        </w:rPr>
-      </w:pPr>
-    </w:p>
-    <w:p>
-      <w:pPr>
-        <w:rPr>
-          <w:u w:val="single"/>
-        </w:rPr>
-      </w:pPr>
-      <w:r>
-        <w:rPr>
-          <w:u w:val="single"/>
-        </w:rPr>
-        <w:t>7/24/2026</w:t>
-      </w:r>
-    </w:p>
-    <w:p>
-      <w:r>
-        <w:t>After r</w:t>
-      </w:r>
-      <w:r>
-        <w:t>eviewing</w:t>
-      </w:r>
-      <w:r>
-        <w:t xml:space="preserve"> the</w:t>
-      </w:r>
-      <w:r>
-        <w:t xml:space="preserve"> files</w:t>
-      </w:r>
-      <w:r>
-        <w:t xml:space="preserve"> on my local and remote repos, I have found the SQL code for this project missing. </w:t>
-      </w:r>
-    </w:p>
-    <w:p>
-      <w:r>
-        <w:t>I’ll need the SQL code stored on my home computer, and then transfer to local/remote repos</w:t>
-      </w:r>
-      <w:r>
-        <w:t xml:space="preserve">. </w:t>
-      </w:r>
-    </w:p>
-    <w:p/>
-    <w:p>
-      <w:pPr>
-        <w:rPr>
-          <w:u w:val="single"/>
-        </w:rPr>
-      </w:pPr>
-      <w:r>
-        <w:rPr>
-          <w:u w:val="single"/>
-        </w:rPr>
-        <w:t>July 21, 2026</w:t>
-      </w:r>
-    </w:p>
-    <w:p>
-      <w:pPr>
-        <w:pStyle w:val="ListParagraph"/>
-        <w:numPr>
-          <w:ilvl w:val="0"/>
-          <w:numId w:val="1"/>
-        </w:numPr>
-      </w:pPr>
-      <w:r>
         <w:t>Git Hub repo was created</w:t>
       </w:r>
     </w:p>
@@ -3375,6 +3489,119 @@
     </w:lvl>
   </w:abstractNum>
   <w:abstractNum w:abstractNumId="13" w15:restartNumberingAfterBreak="0">
+    <w:nsid w:val="7450018F"/>
+    <w:multiLevelType w:val="hybridMultilevel"/>
+    <w:tmpl w:val="06F66B0C"/>
+    <w:lvl w:ilvl="0" w:tplc="04090001">
+      <w:start w:val="1"/>
+      <w:numFmt w:val="bullet"/>
+      <w:lvlText w:val=""/>
+      <w:lvlJc w:val="left"/>
+      <w:pPr>
+        <w:ind w:left="720" w:hanging="360"/>
+      </w:pPr>
+      <w:rPr>
+        <w:rFonts w:ascii="Symbol" w:hAnsi="Symbol" w:hint="default"/>
+      </w:rPr>
+    </w:lvl>
+    <w:lvl w:ilvl="1" w:tplc="04090003" w:tentative="1">
+      <w:start w:val="1"/>
+      <w:numFmt w:val="bullet"/>
+      <w:lvlText w:val="o"/>
+      <w:lvlJc w:val="left"/>
+      <w:pPr>
+        <w:ind w:left="1440" w:hanging="360"/>
+      </w:pPr>
+      <w:rPr>
+        <w:rFonts w:ascii="Courier New" w:hAnsi="Courier New" w:cs="Courier New" w:hint="default"/>
+      </w:rPr>
+    </w:lvl>
+    <w:lvl w:ilvl="2" w:tplc="04090005" w:tentative="1">
+      <w:start w:val="1"/>
+      <w:numFmt w:val="bullet"/>
+      <w:lvlText w:val=""/>
+      <w:lvlJc w:val="left"/>
+      <w:pPr>
+        <w:ind w:left="2160" w:hanging="360"/>
+      </w:pPr>
+      <w:rPr>
+        <w:rFonts w:ascii="Wingdings" w:hAnsi="Wingdings" w:hint="default"/>
+      </w:rPr>
+    </w:lvl>
+    <w:lvl w:ilvl="3" w:tplc="04090001" w:tentative="1">
+      <w:start w:val="1"/>
+      <w:numFmt w:val="bullet"/>
+      <w:lvlText w:val=""/>
+      <w:lvlJc w:val="left"/>
+      <w:pPr>
+        <w:ind w:left="2880" w:hanging="360"/>
+      </w:pPr>
+      <w:rPr>
+        <w:rFonts w:ascii="Symbol" w:hAnsi="Symbol" w:hint="default"/>
+      </w:rPr>
+    </w:lvl>
+    <w:lvl w:ilvl="4" w:tplc="04090003" w:tentative="1">
+      <w:start w:val="1"/>
+      <w:numFmt w:val="bullet"/>
+      <w:lvlText w:val="o"/>
+      <w:lvlJc w:val="left"/>
+      <w:pPr>
+        <w:ind w:left="3600" w:hanging="360"/>
+      </w:pPr>
+      <w:rPr>
+        <w:rFonts w:ascii="Courier New" w:hAnsi="Courier New" w:cs="Courier New" w:hint="default"/>
+      </w:rPr>
+    </w:lvl>
+    <w:lvl w:ilvl="5" w:tplc="04090005" w:tentative="1">
+      <w:start w:val="1"/>
+      <w:numFmt w:val="bullet"/>
+      <w:lvlText w:val=""/>
+      <w:lvlJc w:val="left"/>
+      <w:pPr>
+        <w:ind w:left="4320" w:hanging="360"/>
+      </w:pPr>
+      <w:rPr>
+        <w:rFonts w:ascii="Wingdings" w:hAnsi="Wingdings" w:hint="default"/>
+      </w:rPr>
+    </w:lvl>
+    <w:lvl w:ilvl="6" w:tplc="04090001" w:tentative="1">
+      <w:start w:val="1"/>
+      <w:numFmt w:val="bullet"/>
+      <w:lvlText w:val=""/>
+      <w:lvlJc w:val="left"/>
+      <w:pPr>
+        <w:ind w:left="5040" w:hanging="360"/>
+      </w:pPr>
+      <w:rPr>
+        <w:rFonts w:ascii="Symbol" w:hAnsi="Symbol" w:hint="default"/>
+      </w:rPr>
+    </w:lvl>
+    <w:lvl w:ilvl="7" w:tplc="04090003" w:tentative="1">
+      <w:start w:val="1"/>
+      <w:numFmt w:val="bullet"/>
+      <w:lvlText w:val="o"/>
+      <w:lvlJc w:val="left"/>
+      <w:pPr>
+        <w:ind w:left="5760" w:hanging="360"/>
+      </w:pPr>
+      <w:rPr>
+        <w:rFonts w:ascii="Courier New" w:hAnsi="Courier New" w:cs="Courier New" w:hint="default"/>
+      </w:rPr>
+    </w:lvl>
+    <w:lvl w:ilvl="8" w:tplc="04090005" w:tentative="1">
+      <w:start w:val="1"/>
+      <w:numFmt w:val="bullet"/>
+      <w:lvlText w:val=""/>
+      <w:lvlJc w:val="left"/>
+      <w:pPr>
+        <w:ind w:left="6480" w:hanging="360"/>
+      </w:pPr>
+      <w:rPr>
+        <w:rFonts w:ascii="Wingdings" w:hAnsi="Wingdings" w:hint="default"/>
+      </w:rPr>
+    </w:lvl>
+  </w:abstractNum>
+  <w:abstractNum w:abstractNumId="14" w15:restartNumberingAfterBreak="0">
     <w:nsid w:val="7BD9063B"/>
     <w:multiLevelType w:val="hybridMultilevel"/>
     <w:tmpl w:val="8AC4E370"/>
@@ -3491,7 +3718,7 @@
     <w:abstractNumId w:val="8"/>
   </w:num>
   <w:num w:numId="2" w16cid:durableId="1065299797">
-    <w:abstractNumId w:val="13"/>
+    <w:abstractNumId w:val="14"/>
   </w:num>
   <w:num w:numId="3" w16cid:durableId="938029151">
     <w:abstractNumId w:val="12"/>
@@ -3528,6 +3755,9 @@
   </w:num>
   <w:num w:numId="14" w16cid:durableId="1643535026">
     <w:abstractNumId w:val="1"/>
+  </w:num>
+  <w:num w:numId="15" w16cid:durableId="1777827450">
+    <w:abstractNumId w:val="13"/>
   </w:num>
 </w:numbering>
 </file>
@@ -4135,6 +4365,7 @@
   <w:style w:type="character" w:default="1" w:styleId="DefaultParagraphFont">
     <w:name w:val="Default Paragraph Font"/>
     <w:uiPriority w:val="1"/>
+    <w:semiHidden/>
     <w:unhideWhenUsed/>
   </w:style>
   <w:style w:type="table" w:default="1" w:styleId="TableNormal">

</xml_diff>

<commit_message>
Completed second SQL to Pandas Translation: Joining 2 datasets and validating SQL analysis. Also updated project documentation.
</commit_message>
<xml_diff>
--- a/documentation/nicosys-portfolio-ecom-project-documentation.docx
+++ b/documentation/nicosys-portfolio-ecom-project-documentation.docx
@@ -27,6 +27,142 @@
         <w:rPr>
           <w:u w:val="single"/>
         </w:rPr>
+        <w:t>9/1/2026</w:t>
+      </w:r>
+    </w:p>
+    <w:p>
+      <w:r>
+        <w:t xml:space="preserve">Starting e-com SQL to Pandas translation: joins, coalesce. This is from a dataset where I combined Squarespace and TikTok Shop daily sales together. One of the issues originally was that TikTok Show contained null values, and I could not calculate with that. Therefore, I had to transform those null values into 0 via coalesce. I am looking to do the same, but with Pandas and also validate the SQL findings. </w:t>
+      </w:r>
+    </w:p>
+    <w:p>
+      <w:r>
+        <w:rPr>
+          <w:strike/>
+        </w:rPr>
+        <w:t>I’ll be working sequentially</w:t>
+      </w:r>
+      <w:r>
+        <w:t xml:space="preserve"> Today I completed</w:t>
+      </w:r>
+      <w:r>
+        <w:t>:</w:t>
+      </w:r>
+    </w:p>
+    <w:p>
+      <w:pPr>
+        <w:pStyle w:val="ListParagraph"/>
+        <w:numPr>
+          <w:ilvl w:val="0"/>
+          <w:numId w:val="16"/>
+        </w:numPr>
+      </w:pPr>
+      <w:r>
+        <w:t>Load two datasets: Squarespace and TikTok Shop</w:t>
+      </w:r>
+    </w:p>
+    <w:p>
+      <w:pPr>
+        <w:pStyle w:val="ListParagraph"/>
+        <w:numPr>
+          <w:ilvl w:val="0"/>
+          <w:numId w:val="16"/>
+        </w:numPr>
+      </w:pPr>
+      <w:r>
+        <w:t>Left Join / merge</w:t>
+      </w:r>
+    </w:p>
+    <w:p>
+      <w:pPr>
+        <w:pStyle w:val="ListParagraph"/>
+        <w:numPr>
+          <w:ilvl w:val="0"/>
+          <w:numId w:val="16"/>
+        </w:numPr>
+      </w:pPr>
+      <w:r>
+        <w:t>Handle missing TikTok sales (NULL)</w:t>
+      </w:r>
+    </w:p>
+    <w:p>
+      <w:pPr>
+        <w:pStyle w:val="ListParagraph"/>
+        <w:numPr>
+          <w:ilvl w:val="0"/>
+          <w:numId w:val="16"/>
+        </w:numPr>
+      </w:pPr>
+      <w:r>
+        <w:t xml:space="preserve">Aggregate Squarespace sales </w:t>
+      </w:r>
+    </w:p>
+    <w:p>
+      <w:pPr>
+        <w:pStyle w:val="ListParagraph"/>
+        <w:numPr>
+          <w:ilvl w:val="0"/>
+          <w:numId w:val="16"/>
+        </w:numPr>
+      </w:pPr>
+      <w:r>
+        <w:t>Calculate combined sales</w:t>
+      </w:r>
+    </w:p>
+    <w:p>
+      <w:pPr>
+        <w:pStyle w:val="ListParagraph"/>
+        <w:numPr>
+          <w:ilvl w:val="0"/>
+          <w:numId w:val="16"/>
+        </w:numPr>
+      </w:pPr>
+      <w:r>
+        <w:t>Select/organize final columns</w:t>
+      </w:r>
+    </w:p>
+    <w:p>
+      <w:pPr>
+        <w:pStyle w:val="ListParagraph"/>
+        <w:numPr>
+          <w:ilvl w:val="0"/>
+          <w:numId w:val="16"/>
+        </w:numPr>
+      </w:pPr>
+      <w:r>
+        <w:t xml:space="preserve">Sort chronologically </w:t>
+      </w:r>
+      <w:r>
+        <w:t xml:space="preserve"> </w:t>
+      </w:r>
+    </w:p>
+    <w:p>
+      <w:r>
+        <w:t>Last thing was to clean up code and do Markdown</w:t>
+      </w:r>
+    </w:p>
+    <w:p>
+      <w:r>
+        <w:t xml:space="preserve"> </w:t>
+      </w:r>
+    </w:p>
+    <w:p>
+      <w:pPr>
+        <w:rPr>
+          <w:u w:val="single"/>
+        </w:rPr>
+      </w:pPr>
+    </w:p>
+    <w:p>
+      <w:pPr>
+        <w:rPr>
+          <w:u w:val="single"/>
+        </w:rPr>
+      </w:pPr>
+      <w:r>
+        <w:rPr>
+          <w:u w:val="single"/>
+        </w:rPr>
         <w:t>8/31/2026</w:t>
       </w:r>
     </w:p>
@@ -143,6 +279,7 @@
     </w:p>
     <w:p>
       <w:r>
+        <w:lastRenderedPageBreak/>
         <w:t>Started Jupyter Notebook for SQL to Pandas translations</w:t>
       </w:r>
       <w:r>
@@ -219,9 +356,6 @@
       </w:r>
       <w:r>
         <w:br/>
-      </w:r>
-      <w:r>
-        <w:lastRenderedPageBreak/>
         <w:t>, product_name</w:t>
       </w:r>
       <w:r>
@@ -269,6 +403,9 @@
       </w:r>
       <w:r>
         <w:br/>
+      </w:r>
+      <w:r>
+        <w:lastRenderedPageBreak/>
         <w:t> , sum(ss.net_sales) as total_ss_sales</w:t>
       </w:r>
       <w:r>
@@ -351,115 +488,115 @@
     </w:p>
     <w:p>
       <w:r>
+        <w:t xml:space="preserve">Completed my portfolio in Canva. Created PDF and PowerPoint versions of the Canva presentation. </w:t>
+      </w:r>
+    </w:p>
+    <w:p>
+      <w:pPr>
+        <w:rPr>
+          <w:u w:val="single"/>
+        </w:rPr>
+      </w:pPr>
+      <w:r>
+        <w:rPr>
+          <w:u w:val="single"/>
+        </w:rPr>
+        <w:t>8/6/2026</w:t>
+      </w:r>
+    </w:p>
+    <w:p>
+      <w:r>
+        <w:t>Continued working on portfolio presentation in Canva. Defined the slides needed for my portfolio because my previous ideas were too complicated. I will use this format for this project and all other portfolio projects:</w:t>
+      </w:r>
+    </w:p>
+    <w:p>
+      <w:pPr>
+        <w:pStyle w:val="ListParagraph"/>
+        <w:numPr>
+          <w:ilvl w:val="0"/>
+          <w:numId w:val="14"/>
+        </w:numPr>
+      </w:pPr>
+      <w:r>
+        <w:t>Problem &amp; Goal</w:t>
+      </w:r>
+    </w:p>
+    <w:p>
+      <w:pPr>
+        <w:pStyle w:val="ListParagraph"/>
+        <w:numPr>
+          <w:ilvl w:val="0"/>
+          <w:numId w:val="14"/>
+        </w:numPr>
+      </w:pPr>
+      <w:r>
+        <w:t>Tools Used</w:t>
+      </w:r>
+    </w:p>
+    <w:p>
+      <w:pPr>
+        <w:pStyle w:val="ListParagraph"/>
+        <w:numPr>
+          <w:ilvl w:val="0"/>
+          <w:numId w:val="14"/>
+        </w:numPr>
+      </w:pPr>
+      <w:r>
+        <w:t>SQL and Modeling Workflow</w:t>
+      </w:r>
+    </w:p>
+    <w:p>
+      <w:pPr>
+        <w:pStyle w:val="ListParagraph"/>
+        <w:numPr>
+          <w:ilvl w:val="0"/>
+          <w:numId w:val="14"/>
+        </w:numPr>
+      </w:pPr>
+      <w:r>
+        <w:t>Insights</w:t>
+      </w:r>
+    </w:p>
+    <w:p>
+      <w:pPr>
+        <w:pStyle w:val="ListParagraph"/>
+        <w:numPr>
+          <w:ilvl w:val="0"/>
+          <w:numId w:val="14"/>
+        </w:numPr>
+      </w:pPr>
+      <w:r>
+        <w:t>Business Recommendations</w:t>
+      </w:r>
+    </w:p>
+    <w:p>
+      <w:pPr>
+        <w:pStyle w:val="ListParagraph"/>
+        <w:numPr>
+          <w:ilvl w:val="0"/>
+          <w:numId w:val="14"/>
+        </w:numPr>
+      </w:pPr>
+      <w:r>
+        <w:t>Impact</w:t>
+      </w:r>
+    </w:p>
+    <w:p>
+      <w:pPr>
+        <w:rPr>
+          <w:u w:val="single"/>
+        </w:rPr>
+      </w:pPr>
+      <w:r>
+        <w:rPr>
+          <w:u w:val="single"/>
+        </w:rPr>
+        <w:t>8/5/2026</w:t>
+      </w:r>
+    </w:p>
+    <w:p>
+      <w:r>
         <w:lastRenderedPageBreak/>
-        <w:t xml:space="preserve">Completed my portfolio in Canva. Created PDF and PowerPoint versions of the Canva presentation. </w:t>
-      </w:r>
-    </w:p>
-    <w:p>
-      <w:pPr>
-        <w:rPr>
-          <w:u w:val="single"/>
-        </w:rPr>
-      </w:pPr>
-      <w:r>
-        <w:rPr>
-          <w:u w:val="single"/>
-        </w:rPr>
-        <w:t>8/6/2026</w:t>
-      </w:r>
-    </w:p>
-    <w:p>
-      <w:r>
-        <w:t>Continued working on portfolio presentation in Canva. Defined the slides needed for my portfolio because my previous ideas were too complicated. I will use this format for this project and all other portfolio projects:</w:t>
-      </w:r>
-    </w:p>
-    <w:p>
-      <w:pPr>
-        <w:pStyle w:val="ListParagraph"/>
-        <w:numPr>
-          <w:ilvl w:val="0"/>
-          <w:numId w:val="14"/>
-        </w:numPr>
-      </w:pPr>
-      <w:r>
-        <w:t>Problem &amp; Goal</w:t>
-      </w:r>
-    </w:p>
-    <w:p>
-      <w:pPr>
-        <w:pStyle w:val="ListParagraph"/>
-        <w:numPr>
-          <w:ilvl w:val="0"/>
-          <w:numId w:val="14"/>
-        </w:numPr>
-      </w:pPr>
-      <w:r>
-        <w:t>Tools Used</w:t>
-      </w:r>
-    </w:p>
-    <w:p>
-      <w:pPr>
-        <w:pStyle w:val="ListParagraph"/>
-        <w:numPr>
-          <w:ilvl w:val="0"/>
-          <w:numId w:val="14"/>
-        </w:numPr>
-      </w:pPr>
-      <w:r>
-        <w:t>SQL and Modeling Workflow</w:t>
-      </w:r>
-    </w:p>
-    <w:p>
-      <w:pPr>
-        <w:pStyle w:val="ListParagraph"/>
-        <w:numPr>
-          <w:ilvl w:val="0"/>
-          <w:numId w:val="14"/>
-        </w:numPr>
-      </w:pPr>
-      <w:r>
-        <w:t>Insights</w:t>
-      </w:r>
-    </w:p>
-    <w:p>
-      <w:pPr>
-        <w:pStyle w:val="ListParagraph"/>
-        <w:numPr>
-          <w:ilvl w:val="0"/>
-          <w:numId w:val="14"/>
-        </w:numPr>
-      </w:pPr>
-      <w:r>
-        <w:t>Business Recommendations</w:t>
-      </w:r>
-    </w:p>
-    <w:p>
-      <w:pPr>
-        <w:pStyle w:val="ListParagraph"/>
-        <w:numPr>
-          <w:ilvl w:val="0"/>
-          <w:numId w:val="14"/>
-        </w:numPr>
-      </w:pPr>
-      <w:r>
-        <w:t>Impact</w:t>
-      </w:r>
-    </w:p>
-    <w:p>
-      <w:pPr>
-        <w:rPr>
-          <w:u w:val="single"/>
-        </w:rPr>
-      </w:pPr>
-      <w:r>
-        <w:rPr>
-          <w:u w:val="single"/>
-        </w:rPr>
-        <w:t>8/5/2026</w:t>
-      </w:r>
-    </w:p>
-    <w:p>
-      <w:r>
         <w:t>For this project, and all my other projects for my portfolio, I’ll use the following format to present:</w:t>
       </w:r>
     </w:p>
@@ -622,7 +759,6 @@
         </w:numPr>
       </w:pPr>
       <w:r>
-        <w:lastRenderedPageBreak/>
         <w:t>Who is affected?</w:t>
       </w:r>
     </w:p>
@@ -734,6 +870,7 @@
         </w:numPr>
       </w:pPr>
       <w:r>
+        <w:lastRenderedPageBreak/>
         <w:t>Joining datasets</w:t>
       </w:r>
     </w:p>
@@ -887,7 +1024,6 @@
         </w:numPr>
       </w:pPr>
       <w:r>
-        <w:lastRenderedPageBreak/>
         <w:t>What could change</w:t>
       </w:r>
     </w:p>
@@ -1005,6 +1141,7 @@
         </w:numPr>
       </w:pPr>
       <w:r>
+        <w:lastRenderedPageBreak/>
         <w:t>“Let’s talk data.”</w:t>
       </w:r>
     </w:p>
@@ -1121,171 +1258,171 @@
         </w:numPr>
       </w:pPr>
       <w:r>
+        <w:t>Power BI</w:t>
+      </w:r>
+    </w:p>
+    <w:p>
+      <w:pPr>
+        <w:pStyle w:val="ListParagraph"/>
+        <w:numPr>
+          <w:ilvl w:val="0"/>
+          <w:numId w:val="4"/>
+        </w:numPr>
+      </w:pPr>
+    </w:p>
+    <w:p/>
+    <w:p>
+      <w:r>
+        <w:t>Slide 2 — Problem / Goal</w:t>
+      </w:r>
+    </w:p>
+    <w:p>
+      <w:r>
+        <w:t>What you set out to solve</w:t>
+      </w:r>
+    </w:p>
+    <w:p>
+      <w:r>
+        <w:t>I was tasked to provide insight on the top selling products and look for opportunities to increase sales. I also decided to look further into areas in the county where that made the most purchases.</w:t>
+      </w:r>
+    </w:p>
+    <w:p>
+      <w:r>
+        <w:t>Why it matters</w:t>
+      </w:r>
+    </w:p>
+    <w:p>
+      <w:r>
+        <w:t xml:space="preserve">Over the past two years, the owner had noticed sales were going down, and it was growing more challenging to get views on social media. The owner believed that decreased sales were due to a lack of content creation and low visibility. </w:t>
+      </w:r>
+    </w:p>
+    <w:p>
+      <w:r>
+        <w:t xml:space="preserve">  </w:t>
+      </w:r>
+    </w:p>
+    <w:p>
+      <w:r>
         <w:lastRenderedPageBreak/>
-        <w:t>Power BI</w:t>
-      </w:r>
-    </w:p>
-    <w:p>
-      <w:pPr>
-        <w:pStyle w:val="ListParagraph"/>
-        <w:numPr>
-          <w:ilvl w:val="0"/>
-          <w:numId w:val="4"/>
-        </w:numPr>
-      </w:pPr>
+        <w:t>Slide 3 — Data &amp; Process</w:t>
+      </w:r>
+    </w:p>
+    <w:p>
+      <w:r>
+        <w:t>Data sources</w:t>
+      </w:r>
+    </w:p>
+    <w:p>
+      <w:r>
+        <w:t xml:space="preserve">From the business’s accounts, I exported .csv files from TikTok Shop and Squarespace. </w:t>
+      </w:r>
+      <w:r>
+        <w:t xml:space="preserve">TikTok only had gross and net sales data. However, Squarespace provided more information on product sales and customers. </w:t>
+      </w:r>
     </w:p>
     <w:p/>
     <w:p>
       <w:r>
-        <w:t>Slide 2 — Problem / Goal</w:t>
-      </w:r>
-    </w:p>
-    <w:p>
-      <w:r>
-        <w:t>What you set out to solve</w:t>
-      </w:r>
-    </w:p>
-    <w:p>
-      <w:r>
-        <w:t>I was tasked to provide insight on the top selling products and look for opportunities to increase sales. I also decided to look further into areas in the county where that made the most purchases.</w:t>
-      </w:r>
-    </w:p>
-    <w:p>
-      <w:r>
-        <w:t>Why it matters</w:t>
-      </w:r>
-    </w:p>
-    <w:p>
-      <w:r>
-        <w:t xml:space="preserve">Over the past two years, the owner had noticed sales were going down, and it was growing more challenging to get views on social media. The owner believed that decreased sales were due to a lack of content creation and low visibility. </w:t>
-      </w:r>
-    </w:p>
-    <w:p>
-      <w:r>
-        <w:t xml:space="preserve">  </w:t>
-      </w:r>
-    </w:p>
-    <w:p>
-      <w:r>
-        <w:t>Slide 3 — Data &amp; Process</w:t>
-      </w:r>
-    </w:p>
-    <w:p>
-      <w:r>
-        <w:t>Data sources</w:t>
-      </w:r>
-    </w:p>
-    <w:p>
-      <w:r>
-        <w:t xml:space="preserve">From the business’s accounts, I exported .csv files from TikTok Shop and Squarespace. </w:t>
-      </w:r>
-      <w:r>
-        <w:t xml:space="preserve">TikTok only had gross and net sales data. However, Squarespace provided more information on product sales and customers. </w:t>
+        <w:t>Cleaning steps</w:t>
+      </w:r>
+    </w:p>
+    <w:p>
+      <w:r>
+        <w:t xml:space="preserve">I joined the datasets from TikTok and Squarespace to get segmented representation of sales trends and total earnings overall. </w:t>
+      </w:r>
+    </w:p>
+    <w:p>
+      <w:r>
+        <w:t>I also h</w:t>
+      </w:r>
+      <w:r>
+        <w:t>andled missing values to ensure accurate and consistent calculations.</w:t>
       </w:r>
     </w:p>
     <w:p/>
     <w:p>
       <w:r>
-        <w:t>Cleaning steps</w:t>
-      </w:r>
-    </w:p>
-    <w:p>
-      <w:r>
-        <w:t xml:space="preserve">I joined the datasets from TikTok and Squarespace to get segmented representation of sales trends and total earnings overall. </w:t>
-      </w:r>
-    </w:p>
-    <w:p>
-      <w:r>
-        <w:t>I also h</w:t>
-      </w:r>
-      <w:r>
-        <w:t>andled missing values to ensure accurate and consistent calculations.</w:t>
+        <w:t>SQL or modeling workflow</w:t>
+      </w:r>
+    </w:p>
+    <w:p>
+      <w:r>
+        <w:t>Tools involved</w:t>
+      </w:r>
+    </w:p>
+    <w:p>
+      <w:r>
+        <w:t>Logos of PostgreSQL, Excel, Power BI, git bash, and GitHub</w:t>
       </w:r>
     </w:p>
     <w:p/>
     <w:p>
       <w:r>
-        <w:t>SQL or modeling workflow</w:t>
-      </w:r>
-    </w:p>
-    <w:p>
-      <w:r>
-        <w:t>Tools involved</w:t>
-      </w:r>
-    </w:p>
-    <w:p>
-      <w:r>
-        <w:t>Logos of PostgreSQL, Excel, Power BI, git bash, and GitHub</w:t>
+        <w:t>Slide 4 — Key Insights</w:t>
+      </w:r>
+    </w:p>
+    <w:p>
+      <w:r>
+        <w:t>2–4 visuals</w:t>
+      </w:r>
+    </w:p>
+    <w:p>
+      <w:r>
+        <w:t>Most important findings</w:t>
       </w:r>
     </w:p>
     <w:p/>
     <w:p>
       <w:r>
+        <w:t>Slide 5 — Final Dashboard / Product</w:t>
+      </w:r>
+    </w:p>
+    <w:p>
+      <w:r>
+        <w:t>Full screenshot</w:t>
+      </w:r>
+    </w:p>
+    <w:p>
+      <w:r>
+        <w:t>Highlight core features</w:t>
+      </w:r>
+    </w:p>
+    <w:p/>
+    <w:p>
+      <w:r>
+        <w:t>Slide 6 — Results / Impact</w:t>
+      </w:r>
+    </w:p>
+    <w:p>
+      <w:r>
+        <w:t>Business value</w:t>
+      </w:r>
+    </w:p>
+    <w:p>
+      <w:r>
+        <w:t>Quantified improvements (real or hypothetical)</w:t>
+      </w:r>
+    </w:p>
+    <w:p/>
+    <w:p>
+      <w:r>
         <w:lastRenderedPageBreak/>
-        <w:t>Slide 4 — Key Insights</w:t>
-      </w:r>
-    </w:p>
-    <w:p>
-      <w:r>
-        <w:t>2–4 visuals</w:t>
-      </w:r>
-    </w:p>
-    <w:p>
-      <w:r>
-        <w:t>Most important findings</w:t>
+        <w:t>Slide 7 — Technical Skills Demonstrated</w:t>
+      </w:r>
+    </w:p>
+    <w:p>
+      <w:r>
+        <w:t>SQL, Power BI, Git, HTML/CSS/JS, etc.</w:t>
+      </w:r>
+    </w:p>
+    <w:p>
+      <w:r>
+        <w:t>What you specifically did?</w:t>
       </w:r>
     </w:p>
     <w:p/>
     <w:p>
       <w:r>
-        <w:t>Slide 5 — Final Dashboard / Product</w:t>
-      </w:r>
-    </w:p>
-    <w:p>
-      <w:r>
-        <w:t>Full screenshot</w:t>
-      </w:r>
-    </w:p>
-    <w:p>
-      <w:r>
-        <w:t>Highlight core features</w:t>
-      </w:r>
-    </w:p>
-    <w:p/>
-    <w:p>
-      <w:r>
-        <w:t>Slide 6 — Results / Impact</w:t>
-      </w:r>
-    </w:p>
-    <w:p>
-      <w:r>
-        <w:t>Business value</w:t>
-      </w:r>
-    </w:p>
-    <w:p>
-      <w:r>
-        <w:t>Quantified improvements (real or hypothetical)</w:t>
-      </w:r>
-    </w:p>
-    <w:p/>
-    <w:p>
-      <w:r>
-        <w:t>Slide 7 — Technical Skills Demonstrated</w:t>
-      </w:r>
-    </w:p>
-    <w:p>
-      <w:r>
-        <w:t>SQL, Power BI, Git, HTML/CSS/JS, etc.</w:t>
-      </w:r>
-    </w:p>
-    <w:p>
-      <w:r>
-        <w:t>What you specifically did?</w:t>
-      </w:r>
-    </w:p>
-    <w:p/>
-    <w:p>
-      <w:r>
         <w:t>Slide 8 — Reflection &amp; Links</w:t>
       </w:r>
     </w:p>
@@ -1341,7 +1478,6 @@
     </w:p>
     <w:p>
       <w:r>
-        <w:lastRenderedPageBreak/>
         <w:t>This makes me realize that I should do this type of descriptive logic on all my other projects too: Healthcare and Operations-Dash.</w:t>
       </w:r>
     </w:p>
@@ -1512,6 +1648,7 @@
         </w:numPr>
       </w:pPr>
       <w:r>
+        <w:lastRenderedPageBreak/>
         <w:t>Updated</w:t>
       </w:r>
       <w:r>
@@ -1666,7 +1803,6 @@
         </w:numPr>
       </w:pPr>
       <w:r>
-        <w:lastRenderedPageBreak/>
         <w:t>Git Hub repo was created</w:t>
       </w:r>
     </w:p>
@@ -2929,6 +3065,119 @@
     </w:lvl>
   </w:abstractNum>
   <w:abstractNum w:abstractNumId="9" w15:restartNumberingAfterBreak="0">
+    <w:nsid w:val="554B5B5B"/>
+    <w:multiLevelType w:val="hybridMultilevel"/>
+    <w:tmpl w:val="146E28BA"/>
+    <w:lvl w:ilvl="0" w:tplc="04090001">
+      <w:start w:val="1"/>
+      <w:numFmt w:val="bullet"/>
+      <w:lvlText w:val=""/>
+      <w:lvlJc w:val="left"/>
+      <w:pPr>
+        <w:ind w:left="720" w:hanging="360"/>
+      </w:pPr>
+      <w:rPr>
+        <w:rFonts w:ascii="Symbol" w:hAnsi="Symbol" w:hint="default"/>
+      </w:rPr>
+    </w:lvl>
+    <w:lvl w:ilvl="1" w:tplc="04090003" w:tentative="1">
+      <w:start w:val="1"/>
+      <w:numFmt w:val="bullet"/>
+      <w:lvlText w:val="o"/>
+      <w:lvlJc w:val="left"/>
+      <w:pPr>
+        <w:ind w:left="1440" w:hanging="360"/>
+      </w:pPr>
+      <w:rPr>
+        <w:rFonts w:ascii="Courier New" w:hAnsi="Courier New" w:cs="Courier New" w:hint="default"/>
+      </w:rPr>
+    </w:lvl>
+    <w:lvl w:ilvl="2" w:tplc="04090005" w:tentative="1">
+      <w:start w:val="1"/>
+      <w:numFmt w:val="bullet"/>
+      <w:lvlText w:val=""/>
+      <w:lvlJc w:val="left"/>
+      <w:pPr>
+        <w:ind w:left="2160" w:hanging="360"/>
+      </w:pPr>
+      <w:rPr>
+        <w:rFonts w:ascii="Wingdings" w:hAnsi="Wingdings" w:hint="default"/>
+      </w:rPr>
+    </w:lvl>
+    <w:lvl w:ilvl="3" w:tplc="04090001" w:tentative="1">
+      <w:start w:val="1"/>
+      <w:numFmt w:val="bullet"/>
+      <w:lvlText w:val=""/>
+      <w:lvlJc w:val="left"/>
+      <w:pPr>
+        <w:ind w:left="2880" w:hanging="360"/>
+      </w:pPr>
+      <w:rPr>
+        <w:rFonts w:ascii="Symbol" w:hAnsi="Symbol" w:hint="default"/>
+      </w:rPr>
+    </w:lvl>
+    <w:lvl w:ilvl="4" w:tplc="04090003" w:tentative="1">
+      <w:start w:val="1"/>
+      <w:numFmt w:val="bullet"/>
+      <w:lvlText w:val="o"/>
+      <w:lvlJc w:val="left"/>
+      <w:pPr>
+        <w:ind w:left="3600" w:hanging="360"/>
+      </w:pPr>
+      <w:rPr>
+        <w:rFonts w:ascii="Courier New" w:hAnsi="Courier New" w:cs="Courier New" w:hint="default"/>
+      </w:rPr>
+    </w:lvl>
+    <w:lvl w:ilvl="5" w:tplc="04090005" w:tentative="1">
+      <w:start w:val="1"/>
+      <w:numFmt w:val="bullet"/>
+      <w:lvlText w:val=""/>
+      <w:lvlJc w:val="left"/>
+      <w:pPr>
+        <w:ind w:left="4320" w:hanging="360"/>
+      </w:pPr>
+      <w:rPr>
+        <w:rFonts w:ascii="Wingdings" w:hAnsi="Wingdings" w:hint="default"/>
+      </w:rPr>
+    </w:lvl>
+    <w:lvl w:ilvl="6" w:tplc="04090001" w:tentative="1">
+      <w:start w:val="1"/>
+      <w:numFmt w:val="bullet"/>
+      <w:lvlText w:val=""/>
+      <w:lvlJc w:val="left"/>
+      <w:pPr>
+        <w:ind w:left="5040" w:hanging="360"/>
+      </w:pPr>
+      <w:rPr>
+        <w:rFonts w:ascii="Symbol" w:hAnsi="Symbol" w:hint="default"/>
+      </w:rPr>
+    </w:lvl>
+    <w:lvl w:ilvl="7" w:tplc="04090003" w:tentative="1">
+      <w:start w:val="1"/>
+      <w:numFmt w:val="bullet"/>
+      <w:lvlText w:val="o"/>
+      <w:lvlJc w:val="left"/>
+      <w:pPr>
+        <w:ind w:left="5760" w:hanging="360"/>
+      </w:pPr>
+      <w:rPr>
+        <w:rFonts w:ascii="Courier New" w:hAnsi="Courier New" w:cs="Courier New" w:hint="default"/>
+      </w:rPr>
+    </w:lvl>
+    <w:lvl w:ilvl="8" w:tplc="04090005" w:tentative="1">
+      <w:start w:val="1"/>
+      <w:numFmt w:val="bullet"/>
+      <w:lvlText w:val=""/>
+      <w:lvlJc w:val="left"/>
+      <w:pPr>
+        <w:ind w:left="6480" w:hanging="360"/>
+      </w:pPr>
+      <w:rPr>
+        <w:rFonts w:ascii="Wingdings" w:hAnsi="Wingdings" w:hint="default"/>
+      </w:rPr>
+    </w:lvl>
+  </w:abstractNum>
+  <w:abstractNum w:abstractNumId="10" w15:restartNumberingAfterBreak="0">
     <w:nsid w:val="5D500BE8"/>
     <w:multiLevelType w:val="multilevel"/>
     <w:tmpl w:val="D3281B2A"/>
@@ -3077,7 +3326,7 @@
       </w:rPr>
     </w:lvl>
   </w:abstractNum>
-  <w:abstractNum w:abstractNumId="10" w15:restartNumberingAfterBreak="0">
+  <w:abstractNum w:abstractNumId="11" w15:restartNumberingAfterBreak="0">
     <w:nsid w:val="5F824454"/>
     <w:multiLevelType w:val="multilevel"/>
     <w:tmpl w:val="40A0BEE2"/>
@@ -3226,7 +3475,7 @@
       </w:rPr>
     </w:lvl>
   </w:abstractNum>
-  <w:abstractNum w:abstractNumId="11" w15:restartNumberingAfterBreak="0">
+  <w:abstractNum w:abstractNumId="12" w15:restartNumberingAfterBreak="0">
     <w:nsid w:val="5FD36612"/>
     <w:multiLevelType w:val="multilevel"/>
     <w:tmpl w:val="F7704030"/>
@@ -3375,7 +3624,7 @@
       </w:rPr>
     </w:lvl>
   </w:abstractNum>
-  <w:abstractNum w:abstractNumId="12" w15:restartNumberingAfterBreak="0">
+  <w:abstractNum w:abstractNumId="13" w15:restartNumberingAfterBreak="0">
     <w:nsid w:val="645D107A"/>
     <w:multiLevelType w:val="hybridMultilevel"/>
     <w:tmpl w:val="97D0B1B0"/>
@@ -3488,7 +3737,7 @@
       </w:rPr>
     </w:lvl>
   </w:abstractNum>
-  <w:abstractNum w:abstractNumId="13" w15:restartNumberingAfterBreak="0">
+  <w:abstractNum w:abstractNumId="14" w15:restartNumberingAfterBreak="0">
     <w:nsid w:val="7450018F"/>
     <w:multiLevelType w:val="hybridMultilevel"/>
     <w:tmpl w:val="06F66B0C"/>
@@ -3601,7 +3850,7 @@
       </w:rPr>
     </w:lvl>
   </w:abstractNum>
-  <w:abstractNum w:abstractNumId="14" w15:restartNumberingAfterBreak="0">
+  <w:abstractNum w:abstractNumId="15" w15:restartNumberingAfterBreak="0">
     <w:nsid w:val="7BD9063B"/>
     <w:multiLevelType w:val="hybridMultilevel"/>
     <w:tmpl w:val="8AC4E370"/>
@@ -3718,10 +3967,10 @@
     <w:abstractNumId w:val="8"/>
   </w:num>
   <w:num w:numId="2" w16cid:durableId="1065299797">
-    <w:abstractNumId w:val="14"/>
+    <w:abstractNumId w:val="15"/>
   </w:num>
   <w:num w:numId="3" w16cid:durableId="938029151">
-    <w:abstractNumId w:val="12"/>
+    <w:abstractNumId w:val="13"/>
   </w:num>
   <w:num w:numId="4" w16cid:durableId="1331298900">
     <w:abstractNumId w:val="0"/>
@@ -3736,16 +3985,16 @@
     <w:abstractNumId w:val="5"/>
   </w:num>
   <w:num w:numId="8" w16cid:durableId="1584297232">
-    <w:abstractNumId w:val="11"/>
+    <w:abstractNumId w:val="12"/>
   </w:num>
   <w:num w:numId="9" w16cid:durableId="1492331197">
     <w:abstractNumId w:val="6"/>
   </w:num>
   <w:num w:numId="10" w16cid:durableId="1104039219">
-    <w:abstractNumId w:val="9"/>
+    <w:abstractNumId w:val="10"/>
   </w:num>
   <w:num w:numId="11" w16cid:durableId="1168903982">
-    <w:abstractNumId w:val="10"/>
+    <w:abstractNumId w:val="11"/>
   </w:num>
   <w:num w:numId="12" w16cid:durableId="1952007713">
     <w:abstractNumId w:val="2"/>
@@ -3757,7 +4006,10 @@
     <w:abstractNumId w:val="1"/>
   </w:num>
   <w:num w:numId="15" w16cid:durableId="1777827450">
-    <w:abstractNumId w:val="13"/>
+    <w:abstractNumId w:val="14"/>
+  </w:num>
+  <w:num w:numId="16" w16cid:durableId="1311449151">
+    <w:abstractNumId w:val="9"/>
   </w:num>
 </w:numbering>
 </file>

</xml_diff>